<commit_message>
feat: formatted numbers and structured DOCX passport template
</commit_message>
<xml_diff>
--- a/templates/passport_template.docx
+++ b/templates/passport_template.docx
@@ -4,46 +4,244 @@
   <w:body>
     <w:p>
       <w:pPr>
-        <w:jc w:val="center"/>
+        <w:pStyle w:val="Title"/>
       </w:pPr>
       <w:r>
-        <w:rPr>
-          <w:rFonts w:ascii="Arial" w:hAnsi="Arial"/>
-          <w:b/>
-          <w:color w:val="1B365D"/>
-          <w:sz w:val="36"/>
-        </w:rPr>
         <w:t>ПАСПОРТ МЕСТОРОЖДЕНИЯ</w:t>
       </w:r>
     </w:p>
     <w:p>
       <w:pPr>
+        <w:spacing w:after="80"/>
         <w:jc w:val="center"/>
       </w:pPr>
       <w:r>
         <w:rPr>
-          <w:rFonts w:ascii="Arial" w:hAnsi="Arial"/>
+          <w:rFonts w:ascii="Times New Roman" w:hAnsi="Times New Roman"/>
           <w:b/>
-          <w:sz w:val="26"/>
+          <w:color w:val="1B365D"/>
+          <w:sz w:val="28"/>
         </w:rPr>
-        <w:t>{{ deposit_name }} ({{ mineral_type }})</w:t>
+        <w:t>{{ deposit_name }}</w:t>
       </w:r>
     </w:p>
     <w:p>
       <w:pPr>
+        <w:spacing w:after="560"/>
         <w:jc w:val="center"/>
       </w:pPr>
       <w:r>
         <w:rPr>
-          <w:rFonts w:ascii="Arial" w:hAnsi="Arial"/>
+          <w:rFonts w:ascii="Times New Roman" w:hAnsi="Times New Roman"/>
+          <w:i/>
           <w:color w:val="555555"/>
-          <w:sz w:val="20"/>
+          <w:sz w:val="24"/>
         </w:rPr>
-        <w:t>Недропользователь: {{ company_name }}</w:t>
-        <w:br/>
-        <w:t>Регион работ: {{ region }}</w:t>
-        <w:br/>
-        <w:t>Дата формирования: {{ generated_date }}</w:t>
+        <w:t>Вид минерального сырья: {{ mineral_type }}</w:t>
+      </w:r>
+    </w:p>
+    <w:tbl>
+      <w:tblPr>
+        <w:tblW w:type="auto" w:w="0"/>
+        <w:jc w:val="center"/>
+        <w:tblLook w:firstColumn="1" w:firstRow="1" w:lastColumn="0" w:lastRow="0" w:noHBand="0" w:noVBand="1" w:val="04A0"/>
+        <w:tblBorders>
+          <w:top w:val="single" w:sz="6" w:space="0" w:color="B0C4DE"/>
+          <w:bottom w:val="single" w:sz="6" w:space="0" w:color="B0C4DE"/>
+          <w:insideH w:val="single" w:sz="4" w:space="0" w:color="E0E6ED"/>
+          <w:left w:val="none"/>
+          <w:right w:val="none"/>
+          <w:insideV w:val="none"/>
+        </w:tblBorders>
+      </w:tblPr>
+      <w:tblGrid>
+        <w:gridCol w:w="4535"/>
+        <w:gridCol w:w="4535"/>
+      </w:tblGrid>
+      <w:tr>
+        <w:tc>
+          <w:tcPr>
+            <w:tcW w:type="dxa" w:w="3402"/>
+            <w:tcMar>
+              <w:top w:w="120" w:type="dxa"/>
+              <w:bottom w:w="120" w:type="dxa"/>
+              <w:left w:w="140" w:type="dxa"/>
+              <w:right w:w="140" w:type="dxa"/>
+            </w:tcMar>
+            <w:tcW w:w="3401" w:type="dxa"/>
+          </w:tcPr>
+          <w:p>
+            <w:pPr>
+              <w:jc w:val="left"/>
+            </w:pPr>
+            <w:r>
+              <w:rPr>
+                <w:b/>
+              </w:rPr>
+              <w:t>Недропользователь</w:t>
+            </w:r>
+          </w:p>
+        </w:tc>
+        <w:tc>
+          <w:tcPr>
+            <w:tcW w:type="dxa" w:w="5669"/>
+            <w:tcMar>
+              <w:top w:w="120" w:type="dxa"/>
+              <w:bottom w:w="120" w:type="dxa"/>
+              <w:left w:w="140" w:type="dxa"/>
+              <w:right w:w="140" w:type="dxa"/>
+            </w:tcMar>
+            <w:tcW w:w="5669" w:type="dxa"/>
+          </w:tcPr>
+          <w:p>
+            <w:pPr>
+              <w:jc w:val="left"/>
+            </w:pPr>
+            <w:r>
+              <w:t>{{ company_name }}</w:t>
+            </w:r>
+          </w:p>
+        </w:tc>
+      </w:tr>
+      <w:tr>
+        <w:tc>
+          <w:tcPr>
+            <w:tcW w:type="dxa" w:w="3402"/>
+            <w:tcMar>
+              <w:top w:w="120" w:type="dxa"/>
+              <w:bottom w:w="120" w:type="dxa"/>
+              <w:left w:w="140" w:type="dxa"/>
+              <w:right w:w="140" w:type="dxa"/>
+            </w:tcMar>
+            <w:tcW w:w="3401" w:type="dxa"/>
+          </w:tcPr>
+          <w:p>
+            <w:pPr>
+              <w:jc w:val="left"/>
+            </w:pPr>
+            <w:r>
+              <w:rPr>
+                <w:b/>
+              </w:rPr>
+              <w:t>Регион работ</w:t>
+            </w:r>
+          </w:p>
+        </w:tc>
+        <w:tc>
+          <w:tcPr>
+            <w:tcW w:type="dxa" w:w="5669"/>
+            <w:tcMar>
+              <w:top w:w="120" w:type="dxa"/>
+              <w:bottom w:w="120" w:type="dxa"/>
+              <w:left w:w="140" w:type="dxa"/>
+              <w:right w:w="140" w:type="dxa"/>
+            </w:tcMar>
+            <w:tcW w:w="5669" w:type="dxa"/>
+          </w:tcPr>
+          <w:p>
+            <w:pPr>
+              <w:jc w:val="left"/>
+            </w:pPr>
+            <w:r>
+              <w:t>{{ region }}</w:t>
+            </w:r>
+          </w:p>
+        </w:tc>
+      </w:tr>
+      <w:tr>
+        <w:tc>
+          <w:tcPr>
+            <w:tcW w:type="dxa" w:w="3402"/>
+            <w:tcMar>
+              <w:top w:w="120" w:type="dxa"/>
+              <w:bottom w:w="120" w:type="dxa"/>
+              <w:left w:w="140" w:type="dxa"/>
+              <w:right w:w="140" w:type="dxa"/>
+            </w:tcMar>
+            <w:tcW w:w="3401" w:type="dxa"/>
+          </w:tcPr>
+          <w:p>
+            <w:pPr>
+              <w:jc w:val="left"/>
+            </w:pPr>
+            <w:r>
+              <w:rPr>
+                <w:b/>
+              </w:rPr>
+              <w:t>Лицензия (горный отвод)</w:t>
+            </w:r>
+          </w:p>
+        </w:tc>
+        <w:tc>
+          <w:tcPr>
+            <w:tcW w:type="dxa" w:w="5669"/>
+            <w:tcMar>
+              <w:top w:w="120" w:type="dxa"/>
+              <w:bottom w:w="120" w:type="dxa"/>
+              <w:left w:w="140" w:type="dxa"/>
+              <w:right w:w="140" w:type="dxa"/>
+            </w:tcMar>
+            <w:tcW w:w="5669" w:type="dxa"/>
+          </w:tcPr>
+          <w:p>
+            <w:pPr>
+              <w:jc w:val="left"/>
+            </w:pPr>
+            <w:r>
+              <w:t>{{ license_number }}</w:t>
+            </w:r>
+          </w:p>
+        </w:tc>
+      </w:tr>
+      <w:tr>
+        <w:tc>
+          <w:tcPr>
+            <w:tcW w:type="dxa" w:w="3402"/>
+            <w:tcMar>
+              <w:top w:w="120" w:type="dxa"/>
+              <w:bottom w:w="120" w:type="dxa"/>
+              <w:left w:w="140" w:type="dxa"/>
+              <w:right w:w="140" w:type="dxa"/>
+            </w:tcMar>
+            <w:tcW w:w="3401" w:type="dxa"/>
+          </w:tcPr>
+          <w:p>
+            <w:pPr>
+              <w:jc w:val="left"/>
+            </w:pPr>
+            <w:r>
+              <w:rPr>
+                <w:b/>
+              </w:rPr>
+              <w:t>Дата формирования паспорта</w:t>
+            </w:r>
+          </w:p>
+        </w:tc>
+        <w:tc>
+          <w:tcPr>
+            <w:tcW w:type="dxa" w:w="5669"/>
+            <w:tcMar>
+              <w:top w:w="120" w:type="dxa"/>
+              <w:bottom w:w="120" w:type="dxa"/>
+              <w:left w:w="140" w:type="dxa"/>
+              <w:right w:w="140" w:type="dxa"/>
+            </w:tcMar>
+            <w:tcW w:w="5669" w:type="dxa"/>
+          </w:tcPr>
+          <w:p>
+            <w:pPr>
+              <w:jc w:val="left"/>
+            </w:pPr>
+            <w:r>
+              <w:t>{{ generated_date }}</w:t>
+            </w:r>
+          </w:p>
+        </w:tc>
+      </w:tr>
+    </w:tbl>
+    <w:p>
+      <w:r>
+        <w:br w:type="page"/>
       </w:r>
     </w:p>
     <w:p>
@@ -54,37 +252,247 @@
         <w:t>Раздел 1. Общие сведения</w:t>
       </w:r>
     </w:p>
-    <w:p>
-      <w:r>
-        <w:rPr>
-          <w:b/>
-        </w:rPr>
-        <w:t xml:space="preserve">Лицензионный номер (горный отвод): </w:t>
-      </w:r>
-      <w:r>
-        <w:t>{{ license_number }}</w:t>
-        <w:br/>
-      </w:r>
-      <w:r>
-        <w:rPr>
-          <w:b/>
-        </w:rPr>
-        <w:t xml:space="preserve">Геологическая площадь участка: </w:t>
-      </w:r>
-      <w:r>
-        <w:t>{{ area_ha }} га ({{ area_m2 }} м²)</w:t>
-        <w:br/>
-      </w:r>
-      <w:r>
-        <w:rPr>
-          <w:b/>
-        </w:rPr>
-        <w:t xml:space="preserve">Периметр лицензионного контура: </w:t>
-      </w:r>
-      <w:r>
-        <w:t>{{ perimeter_m }} м</w:t>
-      </w:r>
-    </w:p>
+    <w:tbl>
+      <w:tblPr>
+        <w:tblW w:type="auto" w:w="0"/>
+        <w:jc w:val="center"/>
+        <w:tblLook w:firstColumn="1" w:firstRow="1" w:lastColumn="0" w:lastRow="0" w:noHBand="0" w:noVBand="1" w:val="04A0"/>
+        <w:tblBorders>
+          <w:top w:val="single" w:sz="6" w:space="0" w:color="B0C4DE"/>
+          <w:bottom w:val="single" w:sz="6" w:space="0" w:color="B0C4DE"/>
+          <w:left w:val="single" w:sz="4" w:space="0" w:color="B0C4DE"/>
+          <w:right w:val="single" w:sz="4" w:space="0" w:color="B0C4DE"/>
+          <w:insideH w:val="single" w:sz="4" w:space="0" w:color="E0E6ED"/>
+          <w:insideV w:val="single" w:sz="4" w:space="0" w:color="E0E6ED"/>
+        </w:tblBorders>
+      </w:tblPr>
+      <w:tblGrid>
+        <w:gridCol w:w="4535"/>
+        <w:gridCol w:w="4535"/>
+      </w:tblGrid>
+      <w:tr>
+        <w:trPr>
+          <w:tblHeader/>
+          <w:cantSplit/>
+        </w:trPr>
+        <w:tc>
+          <w:tcPr>
+            <w:tcW w:type="dxa" w:w="4819"/>
+            <w:tcMar>
+              <w:top w:w="100" w:type="dxa"/>
+              <w:bottom w:w="100" w:type="dxa"/>
+              <w:left w:w="120" w:type="dxa"/>
+              <w:right w:w="120" w:type="dxa"/>
+            </w:tcMar>
+            <w:shd w:fill="F0F4F8"/>
+            <w:tcW w:w="4818" w:type="dxa"/>
+          </w:tcPr>
+          <w:p>
+            <w:pPr>
+              <w:jc w:val="left"/>
+            </w:pPr>
+            <w:r>
+              <w:rPr>
+                <w:b/>
+              </w:rPr>
+              <w:t>Показатель</w:t>
+            </w:r>
+          </w:p>
+        </w:tc>
+        <w:tc>
+          <w:tcPr>
+            <w:tcW w:type="dxa" w:w="4252"/>
+            <w:tcMar>
+              <w:top w:w="100" w:type="dxa"/>
+              <w:bottom w:w="100" w:type="dxa"/>
+              <w:left w:w="120" w:type="dxa"/>
+              <w:right w:w="120" w:type="dxa"/>
+            </w:tcMar>
+            <w:shd w:fill="F0F4F8"/>
+            <w:tcW w:w="4251" w:type="dxa"/>
+          </w:tcPr>
+          <w:p>
+            <w:pPr>
+              <w:jc w:val="right"/>
+            </w:pPr>
+            <w:r>
+              <w:rPr>
+                <w:b/>
+              </w:rPr>
+              <w:t>Значение</w:t>
+            </w:r>
+          </w:p>
+        </w:tc>
+      </w:tr>
+      <w:tr>
+        <w:tc>
+          <w:tcPr>
+            <w:tcW w:type="dxa" w:w="4819"/>
+            <w:tcMar>
+              <w:top w:w="100" w:type="dxa"/>
+              <w:bottom w:w="100" w:type="dxa"/>
+              <w:left w:w="120" w:type="dxa"/>
+              <w:right w:w="120" w:type="dxa"/>
+            </w:tcMar>
+            <w:tcW w:w="4818" w:type="dxa"/>
+          </w:tcPr>
+          <w:p>
+            <w:pPr>
+              <w:jc w:val="left"/>
+            </w:pPr>
+            <w:r>
+              <w:t>Лицензионный номер (горный отвод)</w:t>
+            </w:r>
+          </w:p>
+        </w:tc>
+        <w:tc>
+          <w:tcPr>
+            <w:tcW w:type="dxa" w:w="4252"/>
+            <w:tcMar>
+              <w:top w:w="100" w:type="dxa"/>
+              <w:bottom w:w="100" w:type="dxa"/>
+              <w:left w:w="120" w:type="dxa"/>
+              <w:right w:w="120" w:type="dxa"/>
+            </w:tcMar>
+            <w:tcW w:w="4251" w:type="dxa"/>
+          </w:tcPr>
+          <w:p>
+            <w:pPr>
+              <w:jc w:val="right"/>
+            </w:pPr>
+            <w:r>
+              <w:t>{{ license_number }}</w:t>
+            </w:r>
+          </w:p>
+        </w:tc>
+      </w:tr>
+      <w:tr>
+        <w:tc>
+          <w:tcPr>
+            <w:tcW w:type="dxa" w:w="4819"/>
+            <w:tcMar>
+              <w:top w:w="100" w:type="dxa"/>
+              <w:bottom w:w="100" w:type="dxa"/>
+              <w:left w:w="120" w:type="dxa"/>
+              <w:right w:w="120" w:type="dxa"/>
+            </w:tcMar>
+            <w:tcW w:w="4818" w:type="dxa"/>
+          </w:tcPr>
+          <w:p>
+            <w:pPr>
+              <w:jc w:val="left"/>
+            </w:pPr>
+            <w:r>
+              <w:t>Геологическая площадь участка (га)</w:t>
+            </w:r>
+          </w:p>
+        </w:tc>
+        <w:tc>
+          <w:tcPr>
+            <w:tcW w:type="dxa" w:w="4252"/>
+            <w:tcMar>
+              <w:top w:w="100" w:type="dxa"/>
+              <w:bottom w:w="100" w:type="dxa"/>
+              <w:left w:w="120" w:type="dxa"/>
+              <w:right w:w="120" w:type="dxa"/>
+            </w:tcMar>
+            <w:tcW w:w="4251" w:type="dxa"/>
+          </w:tcPr>
+          <w:p>
+            <w:pPr>
+              <w:jc w:val="right"/>
+            </w:pPr>
+            <w:r>
+              <w:t>{{ fmt.area_ha }}</w:t>
+            </w:r>
+          </w:p>
+        </w:tc>
+      </w:tr>
+      <w:tr>
+        <w:tc>
+          <w:tcPr>
+            <w:tcW w:type="dxa" w:w="4819"/>
+            <w:tcMar>
+              <w:top w:w="100" w:type="dxa"/>
+              <w:bottom w:w="100" w:type="dxa"/>
+              <w:left w:w="120" w:type="dxa"/>
+              <w:right w:w="120" w:type="dxa"/>
+            </w:tcMar>
+            <w:tcW w:w="4818" w:type="dxa"/>
+          </w:tcPr>
+          <w:p>
+            <w:pPr>
+              <w:jc w:val="left"/>
+            </w:pPr>
+            <w:r>
+              <w:t>Геологическая площадь участка (м²)</w:t>
+            </w:r>
+          </w:p>
+        </w:tc>
+        <w:tc>
+          <w:tcPr>
+            <w:tcW w:type="dxa" w:w="4252"/>
+            <w:tcMar>
+              <w:top w:w="100" w:type="dxa"/>
+              <w:bottom w:w="100" w:type="dxa"/>
+              <w:left w:w="120" w:type="dxa"/>
+              <w:right w:w="120" w:type="dxa"/>
+            </w:tcMar>
+            <w:tcW w:w="4251" w:type="dxa"/>
+          </w:tcPr>
+          <w:p>
+            <w:pPr>
+              <w:jc w:val="right"/>
+            </w:pPr>
+            <w:r>
+              <w:t>{{ fmt.area_m2 }}</w:t>
+            </w:r>
+          </w:p>
+        </w:tc>
+      </w:tr>
+      <w:tr>
+        <w:tc>
+          <w:tcPr>
+            <w:tcW w:type="dxa" w:w="4819"/>
+            <w:tcMar>
+              <w:top w:w="100" w:type="dxa"/>
+              <w:bottom w:w="100" w:type="dxa"/>
+              <w:left w:w="120" w:type="dxa"/>
+              <w:right w:w="120" w:type="dxa"/>
+            </w:tcMar>
+            <w:tcW w:w="4818" w:type="dxa"/>
+          </w:tcPr>
+          <w:p>
+            <w:pPr>
+              <w:jc w:val="left"/>
+            </w:pPr>
+            <w:r>
+              <w:t>Периметр лицензионного контура (м)</w:t>
+            </w:r>
+          </w:p>
+        </w:tc>
+        <w:tc>
+          <w:tcPr>
+            <w:tcW w:type="dxa" w:w="4252"/>
+            <w:tcMar>
+              <w:top w:w="100" w:type="dxa"/>
+              <w:bottom w:w="100" w:type="dxa"/>
+              <w:left w:w="120" w:type="dxa"/>
+              <w:right w:w="120" w:type="dxa"/>
+            </w:tcMar>
+            <w:tcW w:w="4251" w:type="dxa"/>
+          </w:tcPr>
+          <w:p>
+            <w:pPr>
+              <w:jc w:val="right"/>
+            </w:pPr>
+            <w:r>
+              <w:t>{{ fmt.perimeter_m }}</w:t>
+            </w:r>
+          </w:p>
+        </w:tc>
+      </w:tr>
+    </w:tbl>
     <w:p>
       <w:pPr>
         <w:pStyle w:val="Heading1"/>
@@ -96,19 +504,354 @@
     <w:p>
       <w:r>
         <w:t>{{ narrative_geology }}</w:t>
-        <w:br/>
-        <w:br/>
-      </w:r>
-      <w:r>
-        <w:rPr>
-          <w:b/>
-        </w:rPr>
-        <w:t xml:space="preserve">Средневзвешенная мощность продуктивной толщи: </w:t>
-      </w:r>
-      <w:r>
-        <w:t>{{ thickness_weighted_m }} м (мин: {{ thickness_min_m }} м, макс: {{ thickness_max_m }} м, вариация: {{ thickness_cv_pct }}%).</w:t>
       </w:r>
     </w:p>
+    <w:tbl>
+      <w:tblPr>
+        <w:tblW w:type="auto" w:w="0"/>
+        <w:jc w:val="center"/>
+        <w:tblLook w:firstColumn="1" w:firstRow="1" w:lastColumn="0" w:lastRow="0" w:noHBand="0" w:noVBand="1" w:val="04A0"/>
+        <w:tblBorders>
+          <w:top w:val="single" w:sz="6" w:space="0" w:color="B0C4DE"/>
+          <w:bottom w:val="single" w:sz="6" w:space="0" w:color="B0C4DE"/>
+          <w:left w:val="single" w:sz="4" w:space="0" w:color="B0C4DE"/>
+          <w:right w:val="single" w:sz="4" w:space="0" w:color="B0C4DE"/>
+          <w:insideH w:val="single" w:sz="4" w:space="0" w:color="E0E6ED"/>
+          <w:insideV w:val="single" w:sz="4" w:space="0" w:color="E0E6ED"/>
+        </w:tblBorders>
+      </w:tblPr>
+      <w:tblGrid>
+        <w:gridCol w:w="3024"/>
+        <w:gridCol w:w="3024"/>
+        <w:gridCol w:w="3024"/>
+      </w:tblGrid>
+      <w:tr>
+        <w:trPr>
+          <w:tblHeader/>
+          <w:cantSplit/>
+        </w:trPr>
+        <w:tc>
+          <w:tcPr>
+            <w:tcW w:type="dxa" w:w="5102"/>
+            <w:tcMar>
+              <w:top w:w="100" w:type="dxa"/>
+              <w:bottom w:w="100" w:type="dxa"/>
+              <w:left w:w="120" w:type="dxa"/>
+              <w:right w:w="120" w:type="dxa"/>
+            </w:tcMar>
+            <w:shd w:fill="F0F4F8"/>
+            <w:tcW w:w="5102" w:type="dxa"/>
+          </w:tcPr>
+          <w:p>
+            <w:pPr>
+              <w:jc w:val="left"/>
+            </w:pPr>
+            <w:r>
+              <w:rPr>
+                <w:b/>
+              </w:rPr>
+              <w:t>Показатель</w:t>
+            </w:r>
+          </w:p>
+        </w:tc>
+        <w:tc>
+          <w:tcPr>
+            <w:tcW w:type="dxa" w:w="2268"/>
+            <w:tcMar>
+              <w:top w:w="100" w:type="dxa"/>
+              <w:bottom w:w="100" w:type="dxa"/>
+              <w:left w:w="120" w:type="dxa"/>
+              <w:right w:w="120" w:type="dxa"/>
+            </w:tcMar>
+            <w:shd w:fill="F0F4F8"/>
+            <w:tcW w:w="2267" w:type="dxa"/>
+          </w:tcPr>
+          <w:p>
+            <w:pPr>
+              <w:jc w:val="right"/>
+            </w:pPr>
+            <w:r>
+              <w:rPr>
+                <w:b/>
+              </w:rPr>
+              <w:t>Значение</w:t>
+            </w:r>
+          </w:p>
+        </w:tc>
+        <w:tc>
+          <w:tcPr>
+            <w:tcW w:type="dxa" w:w="1701"/>
+            <w:tcMar>
+              <w:top w:w="100" w:type="dxa"/>
+              <w:bottom w:w="100" w:type="dxa"/>
+              <w:left w:w="120" w:type="dxa"/>
+              <w:right w:w="120" w:type="dxa"/>
+            </w:tcMar>
+            <w:shd w:fill="F0F4F8"/>
+            <w:tcW w:w="1700" w:type="dxa"/>
+          </w:tcPr>
+          <w:p>
+            <w:pPr>
+              <w:jc w:val="center"/>
+            </w:pPr>
+            <w:r>
+              <w:rPr>
+                <w:b/>
+              </w:rPr>
+              <w:t>Единица</w:t>
+            </w:r>
+          </w:p>
+        </w:tc>
+      </w:tr>
+      <w:tr>
+        <w:tc>
+          <w:tcPr>
+            <w:tcW w:type="dxa" w:w="5102"/>
+            <w:tcMar>
+              <w:top w:w="100" w:type="dxa"/>
+              <w:bottom w:w="100" w:type="dxa"/>
+              <w:left w:w="120" w:type="dxa"/>
+              <w:right w:w="120" w:type="dxa"/>
+            </w:tcMar>
+            <w:tcW w:w="5102" w:type="dxa"/>
+          </w:tcPr>
+          <w:p>
+            <w:pPr>
+              <w:jc w:val="left"/>
+            </w:pPr>
+            <w:r>
+              <w:t>Средневзвешенная мощность пласта</w:t>
+            </w:r>
+          </w:p>
+        </w:tc>
+        <w:tc>
+          <w:tcPr>
+            <w:tcW w:type="dxa" w:w="2268"/>
+            <w:tcMar>
+              <w:top w:w="100" w:type="dxa"/>
+              <w:bottom w:w="100" w:type="dxa"/>
+              <w:left w:w="120" w:type="dxa"/>
+              <w:right w:w="120" w:type="dxa"/>
+            </w:tcMar>
+            <w:tcW w:w="2267" w:type="dxa"/>
+          </w:tcPr>
+          <w:p>
+            <w:pPr>
+              <w:jc w:val="right"/>
+            </w:pPr>
+            <w:r>
+              <w:t>{{ fmt.thickness_weighted_m }}</w:t>
+            </w:r>
+          </w:p>
+        </w:tc>
+        <w:tc>
+          <w:tcPr>
+            <w:tcW w:type="dxa" w:w="1701"/>
+            <w:tcMar>
+              <w:top w:w="100" w:type="dxa"/>
+              <w:bottom w:w="100" w:type="dxa"/>
+              <w:left w:w="120" w:type="dxa"/>
+              <w:right w:w="120" w:type="dxa"/>
+            </w:tcMar>
+            <w:tcW w:w="1700" w:type="dxa"/>
+          </w:tcPr>
+          <w:p>
+            <w:pPr>
+              <w:jc w:val="center"/>
+            </w:pPr>
+            <w:r>
+              <w:t>м</w:t>
+            </w:r>
+          </w:p>
+        </w:tc>
+      </w:tr>
+      <w:tr>
+        <w:tc>
+          <w:tcPr>
+            <w:tcW w:type="dxa" w:w="5102"/>
+            <w:tcMar>
+              <w:top w:w="100" w:type="dxa"/>
+              <w:bottom w:w="100" w:type="dxa"/>
+              <w:left w:w="120" w:type="dxa"/>
+              <w:right w:w="120" w:type="dxa"/>
+            </w:tcMar>
+            <w:tcW w:w="5102" w:type="dxa"/>
+          </w:tcPr>
+          <w:p>
+            <w:pPr>
+              <w:jc w:val="left"/>
+            </w:pPr>
+            <w:r>
+              <w:t>Минимальная мощность полезной толщи</w:t>
+            </w:r>
+          </w:p>
+        </w:tc>
+        <w:tc>
+          <w:tcPr>
+            <w:tcW w:type="dxa" w:w="2268"/>
+            <w:tcMar>
+              <w:top w:w="100" w:type="dxa"/>
+              <w:bottom w:w="100" w:type="dxa"/>
+              <w:left w:w="120" w:type="dxa"/>
+              <w:right w:w="120" w:type="dxa"/>
+            </w:tcMar>
+            <w:tcW w:w="2267" w:type="dxa"/>
+          </w:tcPr>
+          <w:p>
+            <w:pPr>
+              <w:jc w:val="right"/>
+            </w:pPr>
+            <w:r>
+              <w:t>{{ fmt.thickness_min_m }}</w:t>
+            </w:r>
+          </w:p>
+        </w:tc>
+        <w:tc>
+          <w:tcPr>
+            <w:tcW w:type="dxa" w:w="1701"/>
+            <w:tcMar>
+              <w:top w:w="100" w:type="dxa"/>
+              <w:bottom w:w="100" w:type="dxa"/>
+              <w:left w:w="120" w:type="dxa"/>
+              <w:right w:w="120" w:type="dxa"/>
+            </w:tcMar>
+            <w:tcW w:w="1700" w:type="dxa"/>
+          </w:tcPr>
+          <w:p>
+            <w:pPr>
+              <w:jc w:val="center"/>
+            </w:pPr>
+            <w:r>
+              <w:t>м</w:t>
+            </w:r>
+          </w:p>
+        </w:tc>
+      </w:tr>
+      <w:tr>
+        <w:tc>
+          <w:tcPr>
+            <w:tcW w:type="dxa" w:w="5102"/>
+            <w:tcMar>
+              <w:top w:w="100" w:type="dxa"/>
+              <w:bottom w:w="100" w:type="dxa"/>
+              <w:left w:w="120" w:type="dxa"/>
+              <w:right w:w="120" w:type="dxa"/>
+            </w:tcMar>
+            <w:tcW w:w="5102" w:type="dxa"/>
+          </w:tcPr>
+          <w:p>
+            <w:pPr>
+              <w:jc w:val="left"/>
+            </w:pPr>
+            <w:r>
+              <w:t>Максимальная мощность полезной толщи</w:t>
+            </w:r>
+          </w:p>
+        </w:tc>
+        <w:tc>
+          <w:tcPr>
+            <w:tcW w:type="dxa" w:w="2268"/>
+            <w:tcMar>
+              <w:top w:w="100" w:type="dxa"/>
+              <w:bottom w:w="100" w:type="dxa"/>
+              <w:left w:w="120" w:type="dxa"/>
+              <w:right w:w="120" w:type="dxa"/>
+            </w:tcMar>
+            <w:tcW w:w="2267" w:type="dxa"/>
+          </w:tcPr>
+          <w:p>
+            <w:pPr>
+              <w:jc w:val="right"/>
+            </w:pPr>
+            <w:r>
+              <w:t>{{ fmt.thickness_max_m }}</w:t>
+            </w:r>
+          </w:p>
+        </w:tc>
+        <w:tc>
+          <w:tcPr>
+            <w:tcW w:type="dxa" w:w="1701"/>
+            <w:tcMar>
+              <w:top w:w="100" w:type="dxa"/>
+              <w:bottom w:w="100" w:type="dxa"/>
+              <w:left w:w="120" w:type="dxa"/>
+              <w:right w:w="120" w:type="dxa"/>
+            </w:tcMar>
+            <w:tcW w:w="1700" w:type="dxa"/>
+          </w:tcPr>
+          <w:p>
+            <w:pPr>
+              <w:jc w:val="center"/>
+            </w:pPr>
+            <w:r>
+              <w:t>м</w:t>
+            </w:r>
+          </w:p>
+        </w:tc>
+      </w:tr>
+      <w:tr>
+        <w:tc>
+          <w:tcPr>
+            <w:tcW w:type="dxa" w:w="5102"/>
+            <w:tcMar>
+              <w:top w:w="100" w:type="dxa"/>
+              <w:bottom w:w="100" w:type="dxa"/>
+              <w:left w:w="120" w:type="dxa"/>
+              <w:right w:w="120" w:type="dxa"/>
+            </w:tcMar>
+            <w:tcW w:w="5102" w:type="dxa"/>
+          </w:tcPr>
+          <w:p>
+            <w:pPr>
+              <w:jc w:val="left"/>
+            </w:pPr>
+            <w:r>
+              <w:t>Коэффициент вариации мощности</w:t>
+            </w:r>
+          </w:p>
+        </w:tc>
+        <w:tc>
+          <w:tcPr>
+            <w:tcW w:type="dxa" w:w="2268"/>
+            <w:tcMar>
+              <w:top w:w="100" w:type="dxa"/>
+              <w:bottom w:w="100" w:type="dxa"/>
+              <w:left w:w="120" w:type="dxa"/>
+              <w:right w:w="120" w:type="dxa"/>
+            </w:tcMar>
+            <w:tcW w:w="2267" w:type="dxa"/>
+          </w:tcPr>
+          <w:p>
+            <w:pPr>
+              <w:jc w:val="right"/>
+            </w:pPr>
+            <w:r>
+              <w:t>{{ fmt.thickness_cv_pct }}</w:t>
+            </w:r>
+          </w:p>
+        </w:tc>
+        <w:tc>
+          <w:tcPr>
+            <w:tcW w:type="dxa" w:w="1701"/>
+            <w:tcMar>
+              <w:top w:w="100" w:type="dxa"/>
+              <w:bottom w:w="100" w:type="dxa"/>
+              <w:left w:w="120" w:type="dxa"/>
+              <w:right w:w="120" w:type="dxa"/>
+            </w:tcMar>
+            <w:tcW w:w="1700" w:type="dxa"/>
+          </w:tcPr>
+          <w:p>
+            <w:pPr>
+              <w:jc w:val="center"/>
+            </w:pPr>
+            <w:r>
+              <w:t>%</w:t>
+            </w:r>
+          </w:p>
+        </w:tc>
+      </w:tr>
+    </w:tbl>
     <w:p>
       <w:pPr>
         <w:pStyle w:val="Heading1"/>
@@ -119,26 +862,46 @@
     </w:p>
     <w:p>
       <w:r>
-        <w:t>Всего пройдено скважин: {{ boreholes_count }}. Перечень выработок:</w:t>
+        <w:t>Всего пройдено выработок: {{ fmt.boreholes_count }}. Реестр скважин и мощности продуктивного горизонта приведены в таблице:</w:t>
       </w:r>
     </w:p>
     <w:tbl>
       <w:tblPr>
-        <w:tblStyle w:val="TableGrid"/>
         <w:tblW w:type="auto" w:w="0"/>
+        <w:jc w:val="center"/>
         <w:tblLook w:firstColumn="1" w:firstRow="1" w:lastColumn="0" w:lastRow="0" w:noHBand="0" w:noVBand="1" w:val="04A0"/>
+        <w:tblBorders>
+          <w:top w:val="single" w:sz="6" w:space="0" w:color="B0C4DE"/>
+          <w:bottom w:val="single" w:sz="6" w:space="0" w:color="B0C4DE"/>
+          <w:left w:val="single" w:sz="4" w:space="0" w:color="B0C4DE"/>
+          <w:right w:val="single" w:sz="4" w:space="0" w:color="B0C4DE"/>
+          <w:insideH w:val="single" w:sz="4" w:space="0" w:color="E0E6ED"/>
+          <w:insideV w:val="single" w:sz="4" w:space="0" w:color="E0E6ED"/>
+        </w:tblBorders>
       </w:tblPr>
       <w:tblGrid>
-        <w:gridCol w:w="1930"/>
-        <w:gridCol w:w="1930"/>
-        <w:gridCol w:w="1930"/>
-        <w:gridCol w:w="1930"/>
-        <w:gridCol w:w="1930"/>
+        <w:gridCol w:w="1814"/>
+        <w:gridCol w:w="1814"/>
+        <w:gridCol w:w="1814"/>
+        <w:gridCol w:w="1814"/>
+        <w:gridCol w:w="1814"/>
       </w:tblGrid>
       <w:tr>
+        <w:trPr>
+          <w:tblHeader/>
+          <w:cantSplit/>
+        </w:trPr>
         <w:tc>
           <w:tcPr>
-            <w:tcW w:type="dxa" w:w="1930"/>
+            <w:tcW w:type="dxa" w:w="1587"/>
+            <w:shd w:fill="F0F4F8"/>
+            <w:tcMar>
+              <w:top w:w="100" w:type="dxa"/>
+              <w:bottom w:w="100" w:type="dxa"/>
+              <w:left w:w="100" w:type="dxa"/>
+              <w:right w:w="100" w:type="dxa"/>
+            </w:tcMar>
+            <w:tcW w:w="1587" w:type="dxa"/>
           </w:tcPr>
           <w:p>
             <w:pPr>
@@ -154,43 +917,67 @@
         </w:tc>
         <w:tc>
           <w:tcPr>
-            <w:tcW w:type="dxa" w:w="1930"/>
+            <w:tcW w:type="dxa" w:w="1928"/>
+            <w:shd w:fill="F0F4F8"/>
+            <w:tcMar>
+              <w:top w:w="100" w:type="dxa"/>
+              <w:bottom w:w="100" w:type="dxa"/>
+              <w:left w:w="100" w:type="dxa"/>
+              <w:right w:w="100" w:type="dxa"/>
+            </w:tcMar>
+            <w:tcW w:w="1927" w:type="dxa"/>
           </w:tcPr>
           <w:p>
             <w:pPr>
-              <w:jc w:val="center"/>
+              <w:jc w:val="right"/>
             </w:pPr>
             <w:r>
               <w:rPr>
                 <w:b/>
               </w:rPr>
-              <w:t>Координата X (м / долг.)</w:t>
+              <w:t>Координата X</w:t>
             </w:r>
           </w:p>
         </w:tc>
         <w:tc>
           <w:tcPr>
-            <w:tcW w:type="dxa" w:w="1930"/>
+            <w:tcW w:type="dxa" w:w="1928"/>
+            <w:shd w:fill="F0F4F8"/>
+            <w:tcMar>
+              <w:top w:w="100" w:type="dxa"/>
+              <w:bottom w:w="100" w:type="dxa"/>
+              <w:left w:w="100" w:type="dxa"/>
+              <w:right w:w="100" w:type="dxa"/>
+            </w:tcMar>
+            <w:tcW w:w="1927" w:type="dxa"/>
           </w:tcPr>
           <w:p>
             <w:pPr>
-              <w:jc w:val="center"/>
+              <w:jc w:val="right"/>
             </w:pPr>
             <w:r>
               <w:rPr>
                 <w:b/>
               </w:rPr>
-              <w:t>Координата Y (м / шир.)</w:t>
+              <w:t>Координата Y</w:t>
             </w:r>
           </w:p>
         </w:tc>
         <w:tc>
           <w:tcPr>
-            <w:tcW w:type="dxa" w:w="1930"/>
+            <w:tcW w:type="dxa" w:w="1814"/>
+            <w:shd w:fill="F0F4F8"/>
+            <w:tcMar>
+              <w:top w:w="100" w:type="dxa"/>
+              <w:bottom w:w="100" w:type="dxa"/>
+              <w:left w:w="100" w:type="dxa"/>
+              <w:right w:w="100" w:type="dxa"/>
+            </w:tcMar>
+            <w:tcW w:w="1814" w:type="dxa"/>
           </w:tcPr>
           <w:p>
             <w:pPr>
-              <w:jc w:val="center"/>
+              <w:jc w:val="right"/>
             </w:pPr>
             <w:r>
               <w:rPr>
@@ -202,11 +989,19 @@
         </w:tc>
         <w:tc>
           <w:tcPr>
-            <w:tcW w:type="dxa" w:w="1930"/>
+            <w:tcW w:type="dxa" w:w="1814"/>
+            <w:shd w:fill="F0F4F8"/>
+            <w:tcMar>
+              <w:top w:w="100" w:type="dxa"/>
+              <w:bottom w:w="100" w:type="dxa"/>
+              <w:left w:w="100" w:type="dxa"/>
+              <w:right w:w="100" w:type="dxa"/>
+            </w:tcMar>
+            <w:tcW w:w="1814" w:type="dxa"/>
           </w:tcPr>
           <w:p>
             <w:pPr>
-              <w:jc w:val="center"/>
+              <w:jc w:val="right"/>
             </w:pPr>
             <w:r>
               <w:rPr>
@@ -220,7 +1015,8 @@
       <w:tr>
         <w:tc>
           <w:tcPr>
-            <w:tcW w:type="dxa" w:w="1930"/>
+            <w:tcW w:type="dxa" w:w="1587"/>
+            <w:tcW w:w="1587" w:type="dxa"/>
           </w:tcPr>
           <w:p>
             <w:r>
@@ -230,25 +1026,29 @@
         </w:tc>
         <w:tc>
           <w:tcPr>
-            <w:tcW w:type="dxa" w:w="1930"/>
+            <w:tcW w:type="dxa" w:w="1928"/>
+            <w:tcW w:w="1927" w:type="dxa"/>
           </w:tcPr>
           <w:p/>
         </w:tc>
         <w:tc>
           <w:tcPr>
-            <w:tcW w:type="dxa" w:w="1930"/>
+            <w:tcW w:type="dxa" w:w="1928"/>
+            <w:tcW w:w="1927" w:type="dxa"/>
           </w:tcPr>
           <w:p/>
         </w:tc>
         <w:tc>
           <w:tcPr>
-            <w:tcW w:type="dxa" w:w="1930"/>
+            <w:tcW w:type="dxa" w:w="1814"/>
+            <w:tcW w:w="1814" w:type="dxa"/>
           </w:tcPr>
           <w:p/>
         </w:tc>
         <w:tc>
           <w:tcPr>
-            <w:tcW w:type="dxa" w:w="1930"/>
+            <w:tcW w:type="dxa" w:w="1814"/>
+            <w:tcW w:w="1814" w:type="dxa"/>
           </w:tcPr>
           <w:p/>
         </w:tc>
@@ -256,9 +1056,19 @@
       <w:tr>
         <w:tc>
           <w:tcPr>
-            <w:tcW w:type="dxa" w:w="1930"/>
+            <w:tcW w:type="dxa" w:w="1587"/>
+            <w:tcMar>
+              <w:top w:w="90" w:type="dxa"/>
+              <w:bottom w:w="90" w:type="dxa"/>
+              <w:left w:w="100" w:type="dxa"/>
+              <w:right w:w="100" w:type="dxa"/>
+            </w:tcMar>
+            <w:tcW w:w="1587" w:type="dxa"/>
           </w:tcPr>
           <w:p>
+            <w:pPr>
+              <w:jc w:val="center"/>
+            </w:pPr>
             <w:r>
               <w:t>{{ row.borehole_id }}</w:t>
             </w:r>
@@ -266,9 +1076,19 @@
         </w:tc>
         <w:tc>
           <w:tcPr>
-            <w:tcW w:type="dxa" w:w="1930"/>
+            <w:tcW w:type="dxa" w:w="1928"/>
+            <w:tcMar>
+              <w:top w:w="90" w:type="dxa"/>
+              <w:bottom w:w="90" w:type="dxa"/>
+              <w:left w:w="100" w:type="dxa"/>
+              <w:right w:w="100" w:type="dxa"/>
+            </w:tcMar>
+            <w:tcW w:w="1927" w:type="dxa"/>
           </w:tcPr>
           <w:p>
+            <w:pPr>
+              <w:jc w:val="right"/>
+            </w:pPr>
             <w:r>
               <w:t>{{ row.x }}</w:t>
             </w:r>
@@ -276,9 +1096,19 @@
         </w:tc>
         <w:tc>
           <w:tcPr>
-            <w:tcW w:type="dxa" w:w="1930"/>
+            <w:tcW w:type="dxa" w:w="1928"/>
+            <w:tcMar>
+              <w:top w:w="90" w:type="dxa"/>
+              <w:bottom w:w="90" w:type="dxa"/>
+              <w:left w:w="100" w:type="dxa"/>
+              <w:right w:w="100" w:type="dxa"/>
+            </w:tcMar>
+            <w:tcW w:w="1927" w:type="dxa"/>
           </w:tcPr>
           <w:p>
+            <w:pPr>
+              <w:jc w:val="right"/>
+            </w:pPr>
             <w:r>
               <w:t>{{ row.y }}</w:t>
             </w:r>
@@ -286,9 +1116,19 @@
         </w:tc>
         <w:tc>
           <w:tcPr>
-            <w:tcW w:type="dxa" w:w="1930"/>
+            <w:tcW w:type="dxa" w:w="1814"/>
+            <w:tcMar>
+              <w:top w:w="90" w:type="dxa"/>
+              <w:bottom w:w="90" w:type="dxa"/>
+              <w:left w:w="100" w:type="dxa"/>
+              <w:right w:w="100" w:type="dxa"/>
+            </w:tcMar>
+            <w:tcW w:w="1814" w:type="dxa"/>
           </w:tcPr>
           <w:p>
+            <w:pPr>
+              <w:jc w:val="right"/>
+            </w:pPr>
             <w:r>
               <w:t>{{ row.thickness_m }}</w:t>
             </w:r>
@@ -296,9 +1136,19 @@
         </w:tc>
         <w:tc>
           <w:tcPr>
-            <w:tcW w:type="dxa" w:w="1930"/>
+            <w:tcW w:type="dxa" w:w="1814"/>
+            <w:tcMar>
+              <w:top w:w="90" w:type="dxa"/>
+              <w:bottom w:w="90" w:type="dxa"/>
+              <w:left w:w="100" w:type="dxa"/>
+              <w:right w:w="100" w:type="dxa"/>
+            </w:tcMar>
+            <w:tcW w:w="1814" w:type="dxa"/>
           </w:tcPr>
           <w:p>
+            <w:pPr>
+              <w:jc w:val="right"/>
+            </w:pPr>
             <w:r>
               <w:t>{{ row.weight }}</w:t>
             </w:r>
@@ -308,7 +1158,8 @@
       <w:tr>
         <w:tc>
           <w:tcPr>
-            <w:tcW w:type="dxa" w:w="1930"/>
+            <w:tcW w:type="dxa" w:w="1587"/>
+            <w:tcW w:w="1587" w:type="dxa"/>
           </w:tcPr>
           <w:p>
             <w:r>
@@ -318,25 +1169,29 @@
         </w:tc>
         <w:tc>
           <w:tcPr>
-            <w:tcW w:type="dxa" w:w="1930"/>
+            <w:tcW w:type="dxa" w:w="1928"/>
+            <w:tcW w:w="1927" w:type="dxa"/>
           </w:tcPr>
           <w:p/>
         </w:tc>
         <w:tc>
           <w:tcPr>
-            <w:tcW w:type="dxa" w:w="1930"/>
+            <w:tcW w:type="dxa" w:w="1928"/>
+            <w:tcW w:w="1927" w:type="dxa"/>
           </w:tcPr>
           <w:p/>
         </w:tc>
         <w:tc>
           <w:tcPr>
-            <w:tcW w:type="dxa" w:w="1930"/>
+            <w:tcW w:type="dxa" w:w="1814"/>
+            <w:tcW w:w="1814" w:type="dxa"/>
           </w:tcPr>
           <w:p/>
         </w:tc>
         <w:tc>
           <w:tcPr>
-            <w:tcW w:type="dxa" w:w="1930"/>
+            <w:tcW w:type="dxa" w:w="1814"/>
+            <w:tcW w:w="1814" w:type="dxa"/>
           </w:tcPr>
           <w:p/>
         </w:tc>
@@ -353,32 +1208,354 @@
     <w:p>
       <w:r>
         <w:t>{{ narrative_quality }}</w:t>
-        <w:br/>
-        <w:br/>
-      </w:r>
-      <w:r>
-        <w:rPr>
-          <w:b/>
-        </w:rPr>
-        <w:t>Лабораторные показатели:</w:t>
-        <w:br/>
-      </w:r>
-      <w:r>
-        <w:t>• Модуль крупности: {{ quality.modulus_fineness }}</w:t>
-        <w:br/>
-      </w:r>
-      <w:r>
-        <w:t>• Содержание глинистых и пылевидных частиц: {{ quality.clay_content_pct }}%</w:t>
-        <w:br/>
-      </w:r>
-      <w:r>
-        <w:t>• Влажность: {{ quality.moisture_pct }}%</w:t>
-        <w:br/>
-      </w:r>
-      <w:r>
-        <w:t>• Насыпная плотность: {{ quality.bulk_density_t_m3 }} т/м³</w:t>
       </w:r>
     </w:p>
+    <w:tbl>
+      <w:tblPr>
+        <w:tblW w:type="auto" w:w="0"/>
+        <w:jc w:val="center"/>
+        <w:tblLook w:firstColumn="1" w:firstRow="1" w:lastColumn="0" w:lastRow="0" w:noHBand="0" w:noVBand="1" w:val="04A0"/>
+        <w:tblBorders>
+          <w:top w:val="single" w:sz="6" w:space="0" w:color="B0C4DE"/>
+          <w:bottom w:val="single" w:sz="6" w:space="0" w:color="B0C4DE"/>
+          <w:left w:val="single" w:sz="4" w:space="0" w:color="B0C4DE"/>
+          <w:right w:val="single" w:sz="4" w:space="0" w:color="B0C4DE"/>
+          <w:insideH w:val="single" w:sz="4" w:space="0" w:color="E0E6ED"/>
+          <w:insideV w:val="single" w:sz="4" w:space="0" w:color="E0E6ED"/>
+        </w:tblBorders>
+      </w:tblPr>
+      <w:tblGrid>
+        <w:gridCol w:w="3024"/>
+        <w:gridCol w:w="3024"/>
+        <w:gridCol w:w="3024"/>
+      </w:tblGrid>
+      <w:tr>
+        <w:trPr>
+          <w:tblHeader/>
+          <w:cantSplit/>
+        </w:trPr>
+        <w:tc>
+          <w:tcPr>
+            <w:tcW w:type="dxa" w:w="5102"/>
+            <w:tcMar>
+              <w:top w:w="100" w:type="dxa"/>
+              <w:bottom w:w="100" w:type="dxa"/>
+              <w:left w:w="120" w:type="dxa"/>
+              <w:right w:w="120" w:type="dxa"/>
+            </w:tcMar>
+            <w:shd w:fill="F0F4F8"/>
+            <w:tcW w:w="5102" w:type="dxa"/>
+          </w:tcPr>
+          <w:p>
+            <w:pPr>
+              <w:jc w:val="left"/>
+            </w:pPr>
+            <w:r>
+              <w:rPr>
+                <w:b/>
+              </w:rPr>
+              <w:t>Показатель</w:t>
+            </w:r>
+          </w:p>
+        </w:tc>
+        <w:tc>
+          <w:tcPr>
+            <w:tcW w:type="dxa" w:w="2268"/>
+            <w:tcMar>
+              <w:top w:w="100" w:type="dxa"/>
+              <w:bottom w:w="100" w:type="dxa"/>
+              <w:left w:w="120" w:type="dxa"/>
+              <w:right w:w="120" w:type="dxa"/>
+            </w:tcMar>
+            <w:shd w:fill="F0F4F8"/>
+            <w:tcW w:w="2267" w:type="dxa"/>
+          </w:tcPr>
+          <w:p>
+            <w:pPr>
+              <w:jc w:val="right"/>
+            </w:pPr>
+            <w:r>
+              <w:rPr>
+                <w:b/>
+              </w:rPr>
+              <w:t>Значение</w:t>
+            </w:r>
+          </w:p>
+        </w:tc>
+        <w:tc>
+          <w:tcPr>
+            <w:tcW w:type="dxa" w:w="1701"/>
+            <w:tcMar>
+              <w:top w:w="100" w:type="dxa"/>
+              <w:bottom w:w="100" w:type="dxa"/>
+              <w:left w:w="120" w:type="dxa"/>
+              <w:right w:w="120" w:type="dxa"/>
+            </w:tcMar>
+            <w:shd w:fill="F0F4F8"/>
+            <w:tcW w:w="1700" w:type="dxa"/>
+          </w:tcPr>
+          <w:p>
+            <w:pPr>
+              <w:jc w:val="center"/>
+            </w:pPr>
+            <w:r>
+              <w:rPr>
+                <w:b/>
+              </w:rPr>
+              <w:t>Единица</w:t>
+            </w:r>
+          </w:p>
+        </w:tc>
+      </w:tr>
+      <w:tr>
+        <w:tc>
+          <w:tcPr>
+            <w:tcW w:type="dxa" w:w="5102"/>
+            <w:tcMar>
+              <w:top w:w="100" w:type="dxa"/>
+              <w:bottom w:w="100" w:type="dxa"/>
+              <w:left w:w="120" w:type="dxa"/>
+              <w:right w:w="120" w:type="dxa"/>
+            </w:tcMar>
+            <w:tcW w:w="5102" w:type="dxa"/>
+          </w:tcPr>
+          <w:p>
+            <w:pPr>
+              <w:jc w:val="left"/>
+            </w:pPr>
+            <w:r>
+              <w:t>Модуль крупности</w:t>
+            </w:r>
+          </w:p>
+        </w:tc>
+        <w:tc>
+          <w:tcPr>
+            <w:tcW w:type="dxa" w:w="2268"/>
+            <w:tcMar>
+              <w:top w:w="100" w:type="dxa"/>
+              <w:bottom w:w="100" w:type="dxa"/>
+              <w:left w:w="120" w:type="dxa"/>
+              <w:right w:w="120" w:type="dxa"/>
+            </w:tcMar>
+            <w:tcW w:w="2267" w:type="dxa"/>
+          </w:tcPr>
+          <w:p>
+            <w:pPr>
+              <w:jc w:val="right"/>
+            </w:pPr>
+            <w:r>
+              <w:t>{{ fmt.quality.modulus_fineness }}</w:t>
+            </w:r>
+          </w:p>
+        </w:tc>
+        <w:tc>
+          <w:tcPr>
+            <w:tcW w:type="dxa" w:w="1701"/>
+            <w:tcMar>
+              <w:top w:w="100" w:type="dxa"/>
+              <w:bottom w:w="100" w:type="dxa"/>
+              <w:left w:w="120" w:type="dxa"/>
+              <w:right w:w="120" w:type="dxa"/>
+            </w:tcMar>
+            <w:tcW w:w="1700" w:type="dxa"/>
+          </w:tcPr>
+          <w:p>
+            <w:pPr>
+              <w:jc w:val="center"/>
+            </w:pPr>
+            <w:r>
+              <w:t>—</w:t>
+            </w:r>
+          </w:p>
+        </w:tc>
+      </w:tr>
+      <w:tr>
+        <w:tc>
+          <w:tcPr>
+            <w:tcW w:type="dxa" w:w="5102"/>
+            <w:tcMar>
+              <w:top w:w="100" w:type="dxa"/>
+              <w:bottom w:w="100" w:type="dxa"/>
+              <w:left w:w="120" w:type="dxa"/>
+              <w:right w:w="120" w:type="dxa"/>
+            </w:tcMar>
+            <w:tcW w:w="5102" w:type="dxa"/>
+          </w:tcPr>
+          <w:p>
+            <w:pPr>
+              <w:jc w:val="left"/>
+            </w:pPr>
+            <w:r>
+              <w:t>Содержание глинистых и пылевидных частиц</w:t>
+            </w:r>
+          </w:p>
+        </w:tc>
+        <w:tc>
+          <w:tcPr>
+            <w:tcW w:type="dxa" w:w="2268"/>
+            <w:tcMar>
+              <w:top w:w="100" w:type="dxa"/>
+              <w:bottom w:w="100" w:type="dxa"/>
+              <w:left w:w="120" w:type="dxa"/>
+              <w:right w:w="120" w:type="dxa"/>
+            </w:tcMar>
+            <w:tcW w:w="2267" w:type="dxa"/>
+          </w:tcPr>
+          <w:p>
+            <w:pPr>
+              <w:jc w:val="right"/>
+            </w:pPr>
+            <w:r>
+              <w:t>{{ fmt.quality.clay_content_pct }}</w:t>
+            </w:r>
+          </w:p>
+        </w:tc>
+        <w:tc>
+          <w:tcPr>
+            <w:tcW w:type="dxa" w:w="1701"/>
+            <w:tcMar>
+              <w:top w:w="100" w:type="dxa"/>
+              <w:bottom w:w="100" w:type="dxa"/>
+              <w:left w:w="120" w:type="dxa"/>
+              <w:right w:w="120" w:type="dxa"/>
+            </w:tcMar>
+            <w:tcW w:w="1700" w:type="dxa"/>
+          </w:tcPr>
+          <w:p>
+            <w:pPr>
+              <w:jc w:val="center"/>
+            </w:pPr>
+            <w:r>
+              <w:t>%</w:t>
+            </w:r>
+          </w:p>
+        </w:tc>
+      </w:tr>
+      <w:tr>
+        <w:tc>
+          <w:tcPr>
+            <w:tcW w:type="dxa" w:w="5102"/>
+            <w:tcMar>
+              <w:top w:w="100" w:type="dxa"/>
+              <w:bottom w:w="100" w:type="dxa"/>
+              <w:left w:w="120" w:type="dxa"/>
+              <w:right w:w="120" w:type="dxa"/>
+            </w:tcMar>
+            <w:tcW w:w="5102" w:type="dxa"/>
+          </w:tcPr>
+          <w:p>
+            <w:pPr>
+              <w:jc w:val="left"/>
+            </w:pPr>
+            <w:r>
+              <w:t>Естественная влажность сырья</w:t>
+            </w:r>
+          </w:p>
+        </w:tc>
+        <w:tc>
+          <w:tcPr>
+            <w:tcW w:type="dxa" w:w="2268"/>
+            <w:tcMar>
+              <w:top w:w="100" w:type="dxa"/>
+              <w:bottom w:w="100" w:type="dxa"/>
+              <w:left w:w="120" w:type="dxa"/>
+              <w:right w:w="120" w:type="dxa"/>
+            </w:tcMar>
+            <w:tcW w:w="2267" w:type="dxa"/>
+          </w:tcPr>
+          <w:p>
+            <w:pPr>
+              <w:jc w:val="right"/>
+            </w:pPr>
+            <w:r>
+              <w:t>{{ fmt.quality.moisture_pct }}</w:t>
+            </w:r>
+          </w:p>
+        </w:tc>
+        <w:tc>
+          <w:tcPr>
+            <w:tcW w:type="dxa" w:w="1701"/>
+            <w:tcMar>
+              <w:top w:w="100" w:type="dxa"/>
+              <w:bottom w:w="100" w:type="dxa"/>
+              <w:left w:w="120" w:type="dxa"/>
+              <w:right w:w="120" w:type="dxa"/>
+            </w:tcMar>
+            <w:tcW w:w="1700" w:type="dxa"/>
+          </w:tcPr>
+          <w:p>
+            <w:pPr>
+              <w:jc w:val="center"/>
+            </w:pPr>
+            <w:r>
+              <w:t>%</w:t>
+            </w:r>
+          </w:p>
+        </w:tc>
+      </w:tr>
+      <w:tr>
+        <w:tc>
+          <w:tcPr>
+            <w:tcW w:type="dxa" w:w="5102"/>
+            <w:tcMar>
+              <w:top w:w="100" w:type="dxa"/>
+              <w:bottom w:w="100" w:type="dxa"/>
+              <w:left w:w="120" w:type="dxa"/>
+              <w:right w:w="120" w:type="dxa"/>
+            </w:tcMar>
+            <w:tcW w:w="5102" w:type="dxa"/>
+          </w:tcPr>
+          <w:p>
+            <w:pPr>
+              <w:jc w:val="left"/>
+            </w:pPr>
+            <w:r>
+              <w:t>Насыпная плотность сырья</w:t>
+            </w:r>
+          </w:p>
+        </w:tc>
+        <w:tc>
+          <w:tcPr>
+            <w:tcW w:type="dxa" w:w="2268"/>
+            <w:tcMar>
+              <w:top w:w="100" w:type="dxa"/>
+              <w:bottom w:w="100" w:type="dxa"/>
+              <w:left w:w="120" w:type="dxa"/>
+              <w:right w:w="120" w:type="dxa"/>
+            </w:tcMar>
+            <w:tcW w:w="2267" w:type="dxa"/>
+          </w:tcPr>
+          <w:p>
+            <w:pPr>
+              <w:jc w:val="right"/>
+            </w:pPr>
+            <w:r>
+              <w:t>{{ fmt.quality.bulk_density_t_m3 }}</w:t>
+            </w:r>
+          </w:p>
+        </w:tc>
+        <w:tc>
+          <w:tcPr>
+            <w:tcW w:type="dxa" w:w="1701"/>
+            <w:tcMar>
+              <w:top w:w="100" w:type="dxa"/>
+              <w:bottom w:w="100" w:type="dxa"/>
+              <w:left w:w="120" w:type="dxa"/>
+              <w:right w:w="120" w:type="dxa"/>
+            </w:tcMar>
+            <w:tcW w:w="1700" w:type="dxa"/>
+          </w:tcPr>
+          <w:p>
+            <w:pPr>
+              <w:jc w:val="center"/>
+            </w:pPr>
+            <w:r>
+              <w:t>т/м³</w:t>
+            </w:r>
+          </w:p>
+        </w:tc>
+      </w:tr>
+    </w:tbl>
     <w:p>
       <w:pPr>
         <w:pStyle w:val="Heading1"/>
@@ -390,54 +1567,501 @@
     <w:p>
       <w:r>
         <w:t>{{ narrative_reserves }}</w:t>
-        <w:br/>
+      </w:r>
+    </w:p>
+    <w:tbl>
+      <w:tblPr>
+        <w:tblW w:type="auto" w:w="0"/>
+        <w:jc w:val="center"/>
+        <w:tblLook w:firstColumn="1" w:firstRow="1" w:lastColumn="0" w:lastRow="0" w:noHBand="0" w:noVBand="1" w:val="04A0"/>
+        <w:tblBorders>
+          <w:top w:val="single" w:sz="6" w:space="0" w:color="B0C4DE"/>
+          <w:bottom w:val="single" w:sz="6" w:space="0" w:color="B0C4DE"/>
+          <w:left w:val="single" w:sz="4" w:space="0" w:color="B0C4DE"/>
+          <w:right w:val="single" w:sz="4" w:space="0" w:color="B0C4DE"/>
+          <w:insideH w:val="single" w:sz="4" w:space="0" w:color="E0E6ED"/>
+          <w:insideV w:val="single" w:sz="4" w:space="0" w:color="E0E6ED"/>
+        </w:tblBorders>
+      </w:tblPr>
+      <w:tblGrid>
+        <w:gridCol w:w="3024"/>
+        <w:gridCol w:w="3024"/>
+        <w:gridCol w:w="3024"/>
+      </w:tblGrid>
+      <w:tr>
+        <w:trPr>
+          <w:tblHeader/>
+          <w:cantSplit/>
+        </w:trPr>
+        <w:tc>
+          <w:tcPr>
+            <w:tcW w:type="dxa" w:w="5102"/>
+            <w:tcMar>
+              <w:top w:w="100" w:type="dxa"/>
+              <w:bottom w:w="100" w:type="dxa"/>
+              <w:left w:w="120" w:type="dxa"/>
+              <w:right w:w="120" w:type="dxa"/>
+            </w:tcMar>
+            <w:shd w:fill="F0F4F8"/>
+            <w:tcW w:w="5102" w:type="dxa"/>
+          </w:tcPr>
+          <w:p>
+            <w:pPr>
+              <w:jc w:val="left"/>
+            </w:pPr>
+            <w:r>
+              <w:rPr>
+                <w:b/>
+              </w:rPr>
+              <w:t>Показатель</w:t>
+            </w:r>
+          </w:p>
+        </w:tc>
+        <w:tc>
+          <w:tcPr>
+            <w:tcW w:type="dxa" w:w="2268"/>
+            <w:tcMar>
+              <w:top w:w="100" w:type="dxa"/>
+              <w:bottom w:w="100" w:type="dxa"/>
+              <w:left w:w="120" w:type="dxa"/>
+              <w:right w:w="120" w:type="dxa"/>
+            </w:tcMar>
+            <w:shd w:fill="F0F4F8"/>
+            <w:tcW w:w="2267" w:type="dxa"/>
+          </w:tcPr>
+          <w:p>
+            <w:pPr>
+              <w:jc w:val="right"/>
+            </w:pPr>
+            <w:r>
+              <w:rPr>
+                <w:b/>
+              </w:rPr>
+              <w:t>Значение</w:t>
+            </w:r>
+          </w:p>
+        </w:tc>
+        <w:tc>
+          <w:tcPr>
+            <w:tcW w:type="dxa" w:w="1701"/>
+            <w:tcMar>
+              <w:top w:w="100" w:type="dxa"/>
+              <w:bottom w:w="100" w:type="dxa"/>
+              <w:left w:w="120" w:type="dxa"/>
+              <w:right w:w="120" w:type="dxa"/>
+            </w:tcMar>
+            <w:shd w:fill="F0F4F8"/>
+            <w:tcW w:w="1700" w:type="dxa"/>
+          </w:tcPr>
+          <w:p>
+            <w:pPr>
+              <w:jc w:val="center"/>
+            </w:pPr>
+            <w:r>
+              <w:rPr>
+                <w:b/>
+              </w:rPr>
+              <w:t>Единица</w:t>
+            </w:r>
+          </w:p>
+        </w:tc>
+      </w:tr>
+      <w:tr>
+        <w:tc>
+          <w:tcPr>
+            <w:tcW w:type="dxa" w:w="5102"/>
+            <w:tcMar>
+              <w:top w:w="100" w:type="dxa"/>
+              <w:bottom w:w="100" w:type="dxa"/>
+              <w:left w:w="120" w:type="dxa"/>
+              <w:right w:w="120" w:type="dxa"/>
+            </w:tcMar>
+            <w:tcW w:w="5102" w:type="dxa"/>
+          </w:tcPr>
+          <w:p>
+            <w:pPr>
+              <w:jc w:val="left"/>
+            </w:pPr>
+            <w:r>
+              <w:t>Геологический объём полезной толщи</w:t>
+            </w:r>
+          </w:p>
+        </w:tc>
+        <w:tc>
+          <w:tcPr>
+            <w:tcW w:type="dxa" w:w="2268"/>
+            <w:tcMar>
+              <w:top w:w="100" w:type="dxa"/>
+              <w:bottom w:w="100" w:type="dxa"/>
+              <w:left w:w="120" w:type="dxa"/>
+              <w:right w:w="120" w:type="dxa"/>
+            </w:tcMar>
+            <w:tcW w:w="2267" w:type="dxa"/>
+          </w:tcPr>
+          <w:p>
+            <w:pPr>
+              <w:jc w:val="right"/>
+            </w:pPr>
+            <w:r>
+              <w:t>{{ fmt.volume_m3 }}</w:t>
+            </w:r>
+          </w:p>
+        </w:tc>
+        <w:tc>
+          <w:tcPr>
+            <w:tcW w:type="dxa" w:w="1701"/>
+            <w:tcMar>
+              <w:top w:w="100" w:type="dxa"/>
+              <w:bottom w:w="100" w:type="dxa"/>
+              <w:left w:w="120" w:type="dxa"/>
+              <w:right w:w="120" w:type="dxa"/>
+            </w:tcMar>
+            <w:tcW w:w="1700" w:type="dxa"/>
+          </w:tcPr>
+          <w:p>
+            <w:pPr>
+              <w:jc w:val="center"/>
+            </w:pPr>
+            <w:r>
+              <w:t>м³</w:t>
+            </w:r>
+          </w:p>
+        </w:tc>
+      </w:tr>
+      <w:tr>
+        <w:tc>
+          <w:tcPr>
+            <w:tcW w:type="dxa" w:w="5102"/>
+            <w:tcMar>
+              <w:top w:w="100" w:type="dxa"/>
+              <w:bottom w:w="100" w:type="dxa"/>
+              <w:left w:w="120" w:type="dxa"/>
+              <w:right w:w="120" w:type="dxa"/>
+            </w:tcMar>
+            <w:tcW w:w="5102" w:type="dxa"/>
+          </w:tcPr>
+          <w:p>
+            <w:pPr>
+              <w:jc w:val="left"/>
+            </w:pPr>
+            <w:r>
+              <w:t>Средняя плотность минерального сырья</w:t>
+            </w:r>
+          </w:p>
+        </w:tc>
+        <w:tc>
+          <w:tcPr>
+            <w:tcW w:type="dxa" w:w="2268"/>
+            <w:tcMar>
+              <w:top w:w="100" w:type="dxa"/>
+              <w:bottom w:w="100" w:type="dxa"/>
+              <w:left w:w="120" w:type="dxa"/>
+              <w:right w:w="120" w:type="dxa"/>
+            </w:tcMar>
+            <w:tcW w:w="2267" w:type="dxa"/>
+          </w:tcPr>
+          <w:p>
+            <w:pPr>
+              <w:jc w:val="right"/>
+            </w:pPr>
+            <w:r>
+              <w:t>{{ fmt.density_t_m3 }}</w:t>
+            </w:r>
+          </w:p>
+        </w:tc>
+        <w:tc>
+          <w:tcPr>
+            <w:tcW w:type="dxa" w:w="1701"/>
+            <w:tcMar>
+              <w:top w:w="100" w:type="dxa"/>
+              <w:bottom w:w="100" w:type="dxa"/>
+              <w:left w:w="120" w:type="dxa"/>
+              <w:right w:w="120" w:type="dxa"/>
+            </w:tcMar>
+            <w:tcW w:w="1700" w:type="dxa"/>
+          </w:tcPr>
+          <w:p>
+            <w:pPr>
+              <w:jc w:val="center"/>
+            </w:pPr>
+            <w:r>
+              <w:t>т/м³</w:t>
+            </w:r>
+          </w:p>
+        </w:tc>
+      </w:tr>
+      <w:tr>
+        <w:tc>
+          <w:tcPr>
+            <w:tcW w:type="dxa" w:w="5102"/>
+            <w:tcMar>
+              <w:top w:w="100" w:type="dxa"/>
+              <w:bottom w:w="100" w:type="dxa"/>
+              <w:left w:w="120" w:type="dxa"/>
+              <w:right w:w="120" w:type="dxa"/>
+            </w:tcMar>
+            <w:tcW w:w="5102" w:type="dxa"/>
+          </w:tcPr>
+          <w:p>
+            <w:pPr>
+              <w:jc w:val="left"/>
+            </w:pPr>
+            <w:r>
+              <w:t>Балансовые запасы полезного ископаемого</w:t>
+            </w:r>
+          </w:p>
+        </w:tc>
+        <w:tc>
+          <w:tcPr>
+            <w:tcW w:type="dxa" w:w="2268"/>
+            <w:tcMar>
+              <w:top w:w="100" w:type="dxa"/>
+              <w:bottom w:w="100" w:type="dxa"/>
+              <w:left w:w="120" w:type="dxa"/>
+              <w:right w:w="120" w:type="dxa"/>
+            </w:tcMar>
+            <w:tcW w:w="2267" w:type="dxa"/>
+          </w:tcPr>
+          <w:p>
+            <w:pPr>
+              <w:jc w:val="right"/>
+            </w:pPr>
+            <w:r>
+              <w:t>{{ fmt.reserves_t }}</w:t>
+            </w:r>
+          </w:p>
+        </w:tc>
+        <w:tc>
+          <w:tcPr>
+            <w:tcW w:type="dxa" w:w="1701"/>
+            <w:tcMar>
+              <w:top w:w="100" w:type="dxa"/>
+              <w:bottom w:w="100" w:type="dxa"/>
+              <w:left w:w="120" w:type="dxa"/>
+              <w:right w:w="120" w:type="dxa"/>
+            </w:tcMar>
+            <w:tcW w:w="1700" w:type="dxa"/>
+          </w:tcPr>
+          <w:p>
+            <w:pPr>
+              <w:jc w:val="center"/>
+            </w:pPr>
+            <w:r>
+              <w:t>т</w:t>
+            </w:r>
+          </w:p>
+        </w:tc>
+      </w:tr>
+      <w:tr>
+        <w:tc>
+          <w:tcPr>
+            <w:tcW w:type="dxa" w:w="5102"/>
+            <w:tcMar>
+              <w:top w:w="100" w:type="dxa"/>
+              <w:bottom w:w="100" w:type="dxa"/>
+              <w:left w:w="120" w:type="dxa"/>
+              <w:right w:w="120" w:type="dxa"/>
+            </w:tcMar>
+            <w:tcW w:w="5102" w:type="dxa"/>
+          </w:tcPr>
+          <w:p>
+            <w:pPr>
+              <w:jc w:val="left"/>
+            </w:pPr>
+            <w:r>
+              <w:t>Балансовые запасы в тыс. тонн</w:t>
+            </w:r>
+          </w:p>
+        </w:tc>
+        <w:tc>
+          <w:tcPr>
+            <w:tcW w:type="dxa" w:w="2268"/>
+            <w:tcMar>
+              <w:top w:w="100" w:type="dxa"/>
+              <w:bottom w:w="100" w:type="dxa"/>
+              <w:left w:w="120" w:type="dxa"/>
+              <w:right w:w="120" w:type="dxa"/>
+            </w:tcMar>
+            <w:tcW w:w="2267" w:type="dxa"/>
+          </w:tcPr>
+          <w:p>
+            <w:pPr>
+              <w:jc w:val="right"/>
+            </w:pPr>
+            <w:r>
+              <w:t>{{ fmt.reserves_kt }}</w:t>
+            </w:r>
+          </w:p>
+        </w:tc>
+        <w:tc>
+          <w:tcPr>
+            <w:tcW w:type="dxa" w:w="1701"/>
+            <w:tcMar>
+              <w:top w:w="100" w:type="dxa"/>
+              <w:bottom w:w="100" w:type="dxa"/>
+              <w:left w:w="120" w:type="dxa"/>
+              <w:right w:w="120" w:type="dxa"/>
+            </w:tcMar>
+            <w:tcW w:w="1700" w:type="dxa"/>
+          </w:tcPr>
+          <w:p>
+            <w:pPr>
+              <w:jc w:val="center"/>
+            </w:pPr>
+            <w:r>
+              <w:t>тыс. т</w:t>
+            </w:r>
+          </w:p>
+        </w:tc>
+      </w:tr>
+      <w:tr>
+        <w:tc>
+          <w:tcPr>
+            <w:tcW w:type="dxa" w:w="5102"/>
+            <w:tcMar>
+              <w:top w:w="100" w:type="dxa"/>
+              <w:bottom w:w="100" w:type="dxa"/>
+              <w:left w:w="120" w:type="dxa"/>
+              <w:right w:w="120" w:type="dxa"/>
+            </w:tcMar>
+            <w:tcW w:w="5102" w:type="dxa"/>
+          </w:tcPr>
+          <w:p>
+            <w:pPr>
+              <w:jc w:val="left"/>
+            </w:pPr>
+            <w:r>
+              <w:t>Условная категория разведанности запасов</w:t>
+            </w:r>
+          </w:p>
+        </w:tc>
+        <w:tc>
+          <w:tcPr>
+            <w:tcW w:type="dxa" w:w="2268"/>
+            <w:tcMar>
+              <w:top w:w="100" w:type="dxa"/>
+              <w:bottom w:w="100" w:type="dxa"/>
+              <w:left w:w="120" w:type="dxa"/>
+              <w:right w:w="120" w:type="dxa"/>
+            </w:tcMar>
+            <w:tcW w:w="2267" w:type="dxa"/>
+          </w:tcPr>
+          <w:p>
+            <w:pPr>
+              <w:jc w:val="right"/>
+            </w:pPr>
+            <w:r>
+              <w:t>{{ fmt.reserves_category }}</w:t>
+            </w:r>
+          </w:p>
+        </w:tc>
+        <w:tc>
+          <w:tcPr>
+            <w:tcW w:type="dxa" w:w="1701"/>
+            <w:tcMar>
+              <w:top w:w="100" w:type="dxa"/>
+              <w:bottom w:w="100" w:type="dxa"/>
+              <w:left w:w="120" w:type="dxa"/>
+              <w:right w:w="120" w:type="dxa"/>
+            </w:tcMar>
+            <w:tcW w:w="1700" w:type="dxa"/>
+          </w:tcPr>
+          <w:p>
+            <w:pPr>
+              <w:jc w:val="center"/>
+            </w:pPr>
+            <w:r>
+              <w:t>—</w:t>
+            </w:r>
+          </w:p>
+        </w:tc>
+      </w:tr>
+    </w:tbl>
+    <w:p>
+      <w:pPr>
+        <w:spacing w:before="480" w:after="40"/>
+        <w:jc w:val="right"/>
+      </w:pPr>
+      <w:r>
+        <w:rPr>
+          <w:rFonts w:ascii="Times New Roman" w:hAnsi="Times New Roman"/>
+          <w:i/>
+          <w:color w:val="666666"/>
+          <w:sz w:val="20"/>
+        </w:rPr>
+        <w:t>Документ сформирован автоматически сервисом GeoSaaS API</w:t>
         <w:br/>
       </w:r>
       <w:r>
         <w:rPr>
-          <w:b/>
+          <w:rFonts w:ascii="Times New Roman" w:hAnsi="Times New Roman"/>
+          <w:i/>
+          <w:color w:val="666666"/>
+          <w:sz w:val="20"/>
         </w:rPr>
-        <w:t>Итоговые показатели подсчёта:</w:t>
-        <w:br/>
-      </w:r>
-      <w:r>
-        <w:t>• Объём полезной толщи: {{ volume_m3 }} м³</w:t>
-        <w:br/>
-      </w:r>
-      <w:r>
-        <w:t>• Средняя плотность минерального сырья: {{ density_t_m3 }} т/м³</w:t>
-        <w:br/>
-      </w:r>
-      <w:r>
-        <w:t>• Геологические запасы: {{ reserves_t }} т ({{ reserves_kt }} тыс. т)</w:t>
-        <w:br/>
-      </w:r>
-      <w:r>
-        <w:t>• Условная категория запасов: {{ reserves_category }}</w:t>
-      </w:r>
-    </w:p>
-    <w:p/>
-    <w:p>
-      <w:pPr>
-        <w:jc w:val="right"/>
-      </w:pPr>
-      <w:r>
-        <w:rPr>
-          <w:i/>
-          <w:color w:val="777777"/>
-          <w:sz w:val="18"/>
-        </w:rPr>
-        <w:t>Документ сформирован автоматически сервисом GeoSaaS API</w:t>
+        <w:t>Дата формирования: {{ generated_date }}</w:t>
       </w:r>
     </w:p>
     <w:sectPr>
-      <w:pgSz w:w="12240" w:h="15840"/>
-      <w:pgMar w:top="1152" w:right="1152" w:bottom="1152" w:left="1440" w:header="720" w:footer="720" w:gutter="0"/>
+      <w:headerReference w:type="default" r:id="rId9"/>
+      <w:footerReference w:type="default" r:id="rId10"/>
+      <w:pgSz w:w="11906" w:h="16838"/>
+      <w:pgMar w:top="1134" w:right="1134" w:bottom="1134" w:left="1701" w:header="720" w:footer="720" w:gutter="0"/>
       <w:cols w:space="720"/>
+      <w:titlePg/>
       <w:docGrid w:linePitch="360"/>
     </w:sectPr>
   </w:body>
 </w:document>
+</file>
+
+<file path=word/footer1.xml><?xml version="1.0" encoding="utf-8"?>
+<w:ftr xmlns:m="http://schemas.openxmlformats.org/officeDocument/2006/math" xmlns:mc="http://schemas.openxmlformats.org/markup-compatibility/2006" xmlns:mo="http://schemas.microsoft.com/office/mac/office/2008/main" xmlns:mv="urn:schemas-microsoft-com:mac:vml" xmlns:o="urn:schemas-microsoft-com:office:office" xmlns:r="http://schemas.openxmlformats.org/officeDocument/2006/relationships" xmlns:v="urn:schemas-microsoft-com:vml" xmlns:w10="urn:schemas-microsoft-com:office:word" xmlns:w14="http://schemas.microsoft.com/office/word/2010/wordml" xmlns:w="http://schemas.openxmlformats.org/wordprocessingml/2006/main" xmlns:wne="http://schemas.microsoft.com/office/word/2006/wordml" xmlns:wp14="http://schemas.microsoft.com/office/word/2010/wordprocessingDrawing" xmlns:wp="http://schemas.openxmlformats.org/drawingml/2006/wordprocessingDrawing" xmlns:wpc="http://schemas.microsoft.com/office/word/2010/wordprocessingCanvas" xmlns:wpg="http://schemas.microsoft.com/office/word/2010/wordprocessingGroup" xmlns:wpi="http://schemas.microsoft.com/office/word/2010/wordprocessingInk" xmlns:wps="http://schemas.microsoft.com/office/word/2010/wordprocessingShape" mc:Ignorable="w14 wp14">
+  <w:p>
+    <w:pPr>
+      <w:pStyle w:val="Footer"/>
+      <w:jc w:val="right"/>
+    </w:pPr>
+    <w:r>
+      <w:rPr>
+        <w:rFonts w:ascii="Times New Roman" w:hAnsi="Times New Roman"/>
+        <w:color w:val="777777"/>
+        <w:sz w:val="18"/>
+      </w:rPr>
+      <w:t xml:space="preserve">Страница </w:t>
+    </w:r>
+    <w:fldSimple w:instr="PAGE"/>
+    <w:r>
+      <w:rPr>
+        <w:rFonts w:ascii="Times New Roman" w:hAnsi="Times New Roman"/>
+        <w:color w:val="777777"/>
+        <w:sz w:val="18"/>
+      </w:rPr>
+      <w:t xml:space="preserve"> из </w:t>
+    </w:r>
+    <w:fldSimple w:instr="NUMPAGES"/>
+  </w:p>
+</w:ftr>
+</file>
+
+<file path=word/header1.xml><?xml version="1.0" encoding="utf-8"?>
+<w:hdr xmlns:m="http://schemas.openxmlformats.org/officeDocument/2006/math" xmlns:mc="http://schemas.openxmlformats.org/markup-compatibility/2006" xmlns:mo="http://schemas.microsoft.com/office/mac/office/2008/main" xmlns:mv="urn:schemas-microsoft-com:mac:vml" xmlns:o="urn:schemas-microsoft-com:office:office" xmlns:r="http://schemas.openxmlformats.org/officeDocument/2006/relationships" xmlns:v="urn:schemas-microsoft-com:vml" xmlns:w10="urn:schemas-microsoft-com:office:word" xmlns:w14="http://schemas.microsoft.com/office/word/2010/wordml" xmlns:w="http://schemas.openxmlformats.org/wordprocessingml/2006/main" xmlns:wne="http://schemas.microsoft.com/office/word/2006/wordml" xmlns:wp14="http://schemas.microsoft.com/office/word/2010/wordprocessingDrawing" xmlns:wp="http://schemas.openxmlformats.org/drawingml/2006/wordprocessingDrawing" xmlns:wpc="http://schemas.microsoft.com/office/word/2010/wordprocessingCanvas" xmlns:wpg="http://schemas.microsoft.com/office/word/2010/wordprocessingGroup" xmlns:wpi="http://schemas.microsoft.com/office/word/2010/wordprocessingInk" xmlns:wps="http://schemas.microsoft.com/office/word/2010/wordprocessingShape" mc:Ignorable="w14 wp14">
+  <w:p>
+    <w:pPr>
+      <w:pStyle w:val="Header"/>
+      <w:jc w:val="right"/>
+    </w:pPr>
+    <w:r>
+      <w:rPr>
+        <w:rFonts w:ascii="Times New Roman" w:hAnsi="Times New Roman"/>
+        <w:i/>
+        <w:color w:val="777777"/>
+        <w:sz w:val="18"/>
+      </w:rPr>
+      <w:t>GeoSaaS API • Паспорт месторождения: {{ deposit_name }}</w:t>
+    </w:r>
+  </w:p>
+</w:hdr>
 </file>
 
 <file path=word/numbering.xml><?xml version="1.0" encoding="utf-8"?>
@@ -803,6 +2427,15 @@
     <w:name w:val="Normal"/>
     <w:qFormat/>
     <w:rsid w:val="00FC693F"/>
+    <w:pPr>
+      <w:spacing w:line="276" w:lineRule="auto" w:after="80"/>
+      <w:jc w:val="both"/>
+    </w:pPr>
+    <w:rPr>
+      <w:rFonts w:ascii="Times New Roman" w:hAnsi="Times New Roman"/>
+      <w:color w:val="222222"/>
+      <w:sz w:val="24"/>
+    </w:rPr>
   </w:style>
   <w:style w:type="paragraph" w:styleId="Header">
     <w:name w:val="header"/>
@@ -859,14 +2492,15 @@
     <w:pPr>
       <w:keepNext/>
       <w:keepLines/>
-      <w:spacing w:before="480" w:after="0"/>
+      <w:spacing w:before="240" w:after="120" w:line="276" w:lineRule="auto"/>
+      <w:jc w:val="left"/>
       <w:outlineLvl w:val="0"/>
     </w:pPr>
     <w:rPr>
-      <w:rFonts w:asciiTheme="majorHAnsi" w:eastAsiaTheme="majorEastAsia" w:hAnsiTheme="majorHAnsi" w:cstheme="majorBidi"/>
+      <w:rFonts w:asciiTheme="majorHAnsi" w:eastAsiaTheme="majorEastAsia" w:hAnsiTheme="majorHAnsi" w:cstheme="majorBidi" w:ascii="Times New Roman" w:hAnsi="Times New Roman"/>
       <w:b/>
       <w:bCs/>
-      <w:color w:val="365F91" w:themeColor="accent1" w:themeShade="BF"/>
+      <w:color w:val="1B365D"/>
       <w:sz w:val="28"/>
       <w:szCs w:val="28"/>
     </w:rPr>
@@ -1148,15 +2782,17 @@
       <w:pBdr>
         <w:bottom w:val="single" w:sz="8" w:space="4" w:color="4F81BD" w:themeColor="accent1"/>
       </w:pBdr>
-      <w:spacing w:after="300" w:line="240" w:lineRule="auto"/>
+      <w:spacing w:after="160" w:line="240" w:lineRule="auto" w:before="560"/>
       <w:contextualSpacing/>
+      <w:jc w:val="center"/>
     </w:pPr>
     <w:rPr>
-      <w:rFonts w:asciiTheme="majorHAnsi" w:eastAsiaTheme="majorEastAsia" w:hAnsiTheme="majorHAnsi" w:cstheme="majorBidi"/>
-      <w:color w:val="17365D" w:themeColor="text2" w:themeShade="BF"/>
+      <w:rFonts w:asciiTheme="majorHAnsi" w:eastAsiaTheme="majorEastAsia" w:hAnsiTheme="majorHAnsi" w:cstheme="majorBidi" w:ascii="Times New Roman" w:hAnsi="Times New Roman"/>
+      <w:b/>
+      <w:color w:val="1B365D"/>
       <w:spacing w:val="5"/>
       <w:kern w:val="28"/>
-      <w:sz w:val="52"/>
+      <w:sz w:val="36"/>
       <w:szCs w:val="52"/>
     </w:rPr>
   </w:style>

</xml_diff>

<commit_message>
feat: align DOCX passport with Passport N form (appendix 11-1)
</commit_message>
<xml_diff>
--- a/templates/passport_template.docx
+++ b/templates/passport_template.docx
@@ -4,40 +4,38 @@
   <w:body>
     <w:p>
       <w:pPr>
-        <w:pStyle w:val="Title"/>
+        <w:spacing w:after="240"/>
+        <w:jc w:val="right"/>
       </w:pPr>
       <w:r>
-        <w:t>ПАСПОРТ МЕСТОРОЖДЕНИЯ</w:t>
+        <w:rPr>
+          <w:i/>
+          <w:color w:val="555555"/>
+          <w:sz w:val="20"/>
+        </w:rPr>
+        <w:t>Гриф: {{ fmt.confidentiality_stamp }} | Экз. № {{ fmt.copy_number }}</w:t>
       </w:r>
     </w:p>
     <w:p>
       <w:pPr>
-        <w:spacing w:after="80"/>
+        <w:pStyle w:val="Title"/>
+      </w:pPr>
+      <w:r>
+        <w:t>Паспорт «Н»</w:t>
+      </w:r>
+    </w:p>
+    <w:p>
+      <w:pPr>
+        <w:spacing w:after="320"/>
         <w:jc w:val="center"/>
       </w:pPr>
       <w:r>
         <w:rPr>
-          <w:rFonts w:ascii="Times New Roman" w:hAnsi="Times New Roman"/>
-          <w:b/>
-          <w:color w:val="1B365D"/>
-          <w:sz w:val="28"/>
-        </w:rPr>
-        <w:t>{{ deposit_name }}</w:t>
-      </w:r>
-    </w:p>
-    <w:p>
-      <w:pPr>
-        <w:spacing w:after="560"/>
-        <w:jc w:val="center"/>
-      </w:pPr>
-      <w:r>
-        <w:rPr>
-          <w:rFonts w:ascii="Times New Roman" w:hAnsi="Times New Roman"/>
           <w:i/>
           <w:color w:val="555555"/>
-          <w:sz w:val="24"/>
+          <w:sz w:val="22"/>
         </w:rPr>
-        <w:t>Вид минерального сырья: {{ mineral_type }}</w:t>
+        <w:t>общераспространённые полезные ископаемые, техногенные минеральные образования из вскрышных и/или вмещающих пород</w:t>
       </w:r>
     </w:p>
     <w:tbl>
@@ -61,44 +59,41 @@
       <w:tr>
         <w:tc>
           <w:tcPr>
-            <w:tcW w:type="dxa" w:w="3402"/>
+            <w:tcW w:type="dxa" w:w="5386"/>
             <w:tcMar>
-              <w:top w:w="120" w:type="dxa"/>
-              <w:bottom w:w="120" w:type="dxa"/>
-              <w:left w:w="140" w:type="dxa"/>
-              <w:right w:w="140" w:type="dxa"/>
+              <w:top w:w="80" w:type="dxa"/>
+              <w:bottom w:w="80" w:type="dxa"/>
+              <w:left w:w="100" w:type="dxa"/>
+              <w:right w:w="100" w:type="dxa"/>
             </w:tcMar>
-            <w:tcW w:w="3401" w:type="dxa"/>
+            <w:tcW w:w="5385" w:type="dxa"/>
           </w:tcPr>
           <w:p>
-            <w:pPr>
-              <w:jc w:val="left"/>
-            </w:pPr>
             <w:r>
               <w:rPr>
                 <w:b/>
               </w:rPr>
-              <w:t>Недропользователь</w:t>
+              <w:t>Номер паспорта территориального подразделения</w:t>
             </w:r>
           </w:p>
         </w:tc>
         <w:tc>
           <w:tcPr>
-            <w:tcW w:type="dxa" w:w="5669"/>
+            <w:tcW w:type="dxa" w:w="3685"/>
             <w:tcMar>
-              <w:top w:w="120" w:type="dxa"/>
-              <w:bottom w:w="120" w:type="dxa"/>
-              <w:left w:w="140" w:type="dxa"/>
-              <w:right w:w="140" w:type="dxa"/>
+              <w:top w:w="80" w:type="dxa"/>
+              <w:bottom w:w="80" w:type="dxa"/>
+              <w:left w:w="100" w:type="dxa"/>
+              <w:right w:w="100" w:type="dxa"/>
             </w:tcMar>
-            <w:tcW w:w="5669" w:type="dxa"/>
+            <w:tcW w:w="3685" w:type="dxa"/>
           </w:tcPr>
           <w:p>
             <w:pPr>
-              <w:jc w:val="left"/>
+              <w:jc w:val="right"/>
             </w:pPr>
             <w:r>
-              <w:t>{{ company_name }}</w:t>
+              <w:t>{{ fmt.territorial_passport_number }}</w:t>
             </w:r>
           </w:p>
         </w:tc>
@@ -106,44 +101,41 @@
       <w:tr>
         <w:tc>
           <w:tcPr>
-            <w:tcW w:type="dxa" w:w="3402"/>
+            <w:tcW w:type="dxa" w:w="5386"/>
             <w:tcMar>
-              <w:top w:w="120" w:type="dxa"/>
-              <w:bottom w:w="120" w:type="dxa"/>
-              <w:left w:w="140" w:type="dxa"/>
-              <w:right w:w="140" w:type="dxa"/>
+              <w:top w:w="80" w:type="dxa"/>
+              <w:bottom w:w="80" w:type="dxa"/>
+              <w:left w:w="100" w:type="dxa"/>
+              <w:right w:w="100" w:type="dxa"/>
             </w:tcMar>
-            <w:tcW w:w="3401" w:type="dxa"/>
+            <w:tcW w:w="5385" w:type="dxa"/>
           </w:tcPr>
           <w:p>
-            <w:pPr>
-              <w:jc w:val="left"/>
-            </w:pPr>
             <w:r>
               <w:rPr>
                 <w:b/>
               </w:rPr>
-              <w:t>Регион работ</w:t>
+              <w:t>Номер паспорта уполномоченного органа</w:t>
             </w:r>
           </w:p>
         </w:tc>
         <w:tc>
           <w:tcPr>
-            <w:tcW w:type="dxa" w:w="5669"/>
+            <w:tcW w:type="dxa" w:w="3685"/>
             <w:tcMar>
-              <w:top w:w="120" w:type="dxa"/>
-              <w:bottom w:w="120" w:type="dxa"/>
-              <w:left w:w="140" w:type="dxa"/>
-              <w:right w:w="140" w:type="dxa"/>
+              <w:top w:w="80" w:type="dxa"/>
+              <w:bottom w:w="80" w:type="dxa"/>
+              <w:left w:w="100" w:type="dxa"/>
+              <w:right w:w="100" w:type="dxa"/>
             </w:tcMar>
-            <w:tcW w:w="5669" w:type="dxa"/>
+            <w:tcW w:w="3685" w:type="dxa"/>
           </w:tcPr>
           <w:p>
             <w:pPr>
-              <w:jc w:val="left"/>
+              <w:jc w:val="right"/>
             </w:pPr>
             <w:r>
-              <w:t>{{ region }}</w:t>
+              <w:t>{{ fmt.authority_passport_number }}</w:t>
             </w:r>
           </w:p>
         </w:tc>
@@ -151,44 +143,41 @@
       <w:tr>
         <w:tc>
           <w:tcPr>
-            <w:tcW w:type="dxa" w:w="3402"/>
+            <w:tcW w:type="dxa" w:w="5386"/>
             <w:tcMar>
-              <w:top w:w="120" w:type="dxa"/>
-              <w:bottom w:w="120" w:type="dxa"/>
-              <w:left w:w="140" w:type="dxa"/>
-              <w:right w:w="140" w:type="dxa"/>
+              <w:top w:w="80" w:type="dxa"/>
+              <w:bottom w:w="80" w:type="dxa"/>
+              <w:left w:w="100" w:type="dxa"/>
+              <w:right w:w="100" w:type="dxa"/>
             </w:tcMar>
-            <w:tcW w:w="3401" w:type="dxa"/>
+            <w:tcW w:w="5385" w:type="dxa"/>
           </w:tcPr>
           <w:p>
-            <w:pPr>
-              <w:jc w:val="left"/>
-            </w:pPr>
             <w:r>
               <w:rPr>
                 <w:b/>
               </w:rPr>
-              <w:t>Лицензия (горный отвод)</w:t>
+              <w:t>Наименование объекта (месторождения)</w:t>
             </w:r>
           </w:p>
         </w:tc>
         <w:tc>
           <w:tcPr>
-            <w:tcW w:type="dxa" w:w="5669"/>
+            <w:tcW w:type="dxa" w:w="3685"/>
             <w:tcMar>
-              <w:top w:w="120" w:type="dxa"/>
-              <w:bottom w:w="120" w:type="dxa"/>
-              <w:left w:w="140" w:type="dxa"/>
-              <w:right w:w="140" w:type="dxa"/>
+              <w:top w:w="80" w:type="dxa"/>
+              <w:bottom w:w="80" w:type="dxa"/>
+              <w:left w:w="100" w:type="dxa"/>
+              <w:right w:w="100" w:type="dxa"/>
             </w:tcMar>
-            <w:tcW w:w="5669" w:type="dxa"/>
+            <w:tcW w:w="3685" w:type="dxa"/>
           </w:tcPr>
           <w:p>
             <w:pPr>
-              <w:jc w:val="left"/>
+              <w:jc w:val="right"/>
             </w:pPr>
             <w:r>
-              <w:t>{{ license_number }}</w:t>
+              <w:t>{{ deposit_name }}</w:t>
             </w:r>
           </w:p>
         </w:tc>
@@ -196,298 +185,41 @@
       <w:tr>
         <w:tc>
           <w:tcPr>
-            <w:tcW w:type="dxa" w:w="3402"/>
+            <w:tcW w:type="dxa" w:w="5386"/>
             <w:tcMar>
-              <w:top w:w="120" w:type="dxa"/>
-              <w:bottom w:w="120" w:type="dxa"/>
-              <w:left w:w="140" w:type="dxa"/>
-              <w:right w:w="140" w:type="dxa"/>
+              <w:top w:w="80" w:type="dxa"/>
+              <w:bottom w:w="80" w:type="dxa"/>
+              <w:left w:w="100" w:type="dxa"/>
+              <w:right w:w="100" w:type="dxa"/>
             </w:tcMar>
-            <w:tcW w:w="3401" w:type="dxa"/>
+            <w:tcW w:w="5385" w:type="dxa"/>
           </w:tcPr>
           <w:p>
-            <w:pPr>
-              <w:jc w:val="left"/>
-            </w:pPr>
             <w:r>
               <w:rPr>
                 <w:b/>
               </w:rPr>
-              <w:t>Дата формирования паспорта</w:t>
+              <w:t>Полезное ископаемое</w:t>
             </w:r>
           </w:p>
         </w:tc>
         <w:tc>
           <w:tcPr>
-            <w:tcW w:type="dxa" w:w="5669"/>
+            <w:tcW w:type="dxa" w:w="3685"/>
             <w:tcMar>
-              <w:top w:w="120" w:type="dxa"/>
-              <w:bottom w:w="120" w:type="dxa"/>
-              <w:left w:w="140" w:type="dxa"/>
-              <w:right w:w="140" w:type="dxa"/>
+              <w:top w:w="80" w:type="dxa"/>
+              <w:bottom w:w="80" w:type="dxa"/>
+              <w:left w:w="100" w:type="dxa"/>
+              <w:right w:w="100" w:type="dxa"/>
             </w:tcMar>
-            <w:tcW w:w="5669" w:type="dxa"/>
-          </w:tcPr>
-          <w:p>
-            <w:pPr>
-              <w:jc w:val="left"/>
-            </w:pPr>
-            <w:r>
-              <w:t>{{ generated_date }}</w:t>
-            </w:r>
-          </w:p>
-        </w:tc>
-      </w:tr>
-    </w:tbl>
-    <w:p>
-      <w:r>
-        <w:br w:type="page"/>
-      </w:r>
-    </w:p>
-    <w:p>
-      <w:pPr>
-        <w:pStyle w:val="Heading1"/>
-      </w:pPr>
-      <w:r>
-        <w:t>Раздел 1. Общие сведения</w:t>
-      </w:r>
-    </w:p>
-    <w:tbl>
-      <w:tblPr>
-        <w:tblW w:type="auto" w:w="0"/>
-        <w:jc w:val="center"/>
-        <w:tblLook w:firstColumn="1" w:firstRow="1" w:lastColumn="0" w:lastRow="0" w:noHBand="0" w:noVBand="1" w:val="04A0"/>
-        <w:tblBorders>
-          <w:top w:val="single" w:sz="6" w:space="0" w:color="B0C4DE"/>
-          <w:bottom w:val="single" w:sz="6" w:space="0" w:color="B0C4DE"/>
-          <w:left w:val="single" w:sz="4" w:space="0" w:color="B0C4DE"/>
-          <w:right w:val="single" w:sz="4" w:space="0" w:color="B0C4DE"/>
-          <w:insideH w:val="single" w:sz="4" w:space="0" w:color="E0E6ED"/>
-          <w:insideV w:val="single" w:sz="4" w:space="0" w:color="E0E6ED"/>
-        </w:tblBorders>
-      </w:tblPr>
-      <w:tblGrid>
-        <w:gridCol w:w="4535"/>
-        <w:gridCol w:w="4535"/>
-      </w:tblGrid>
-      <w:tr>
-        <w:trPr>
-          <w:tblHeader/>
-          <w:cantSplit/>
-        </w:trPr>
-        <w:tc>
-          <w:tcPr>
-            <w:tcW w:type="dxa" w:w="4819"/>
-            <w:tcMar>
-              <w:top w:w="100" w:type="dxa"/>
-              <w:bottom w:w="100" w:type="dxa"/>
-              <w:left w:w="120" w:type="dxa"/>
-              <w:right w:w="120" w:type="dxa"/>
-            </w:tcMar>
-            <w:shd w:fill="F0F4F8"/>
-            <w:tcW w:w="4818" w:type="dxa"/>
-          </w:tcPr>
-          <w:p>
-            <w:pPr>
-              <w:jc w:val="left"/>
-            </w:pPr>
-            <w:r>
-              <w:rPr>
-                <w:b/>
-              </w:rPr>
-              <w:t>Показатель</w:t>
-            </w:r>
-          </w:p>
-        </w:tc>
-        <w:tc>
-          <w:tcPr>
-            <w:tcW w:type="dxa" w:w="4252"/>
-            <w:tcMar>
-              <w:top w:w="100" w:type="dxa"/>
-              <w:bottom w:w="100" w:type="dxa"/>
-              <w:left w:w="120" w:type="dxa"/>
-              <w:right w:w="120" w:type="dxa"/>
-            </w:tcMar>
-            <w:shd w:fill="F0F4F8"/>
-            <w:tcW w:w="4251" w:type="dxa"/>
+            <w:tcW w:w="3685" w:type="dxa"/>
           </w:tcPr>
           <w:p>
             <w:pPr>
               <w:jc w:val="right"/>
             </w:pPr>
             <w:r>
-              <w:rPr>
-                <w:b/>
-              </w:rPr>
-              <w:t>Значение</w:t>
-            </w:r>
-          </w:p>
-        </w:tc>
-      </w:tr>
-      <w:tr>
-        <w:tc>
-          <w:tcPr>
-            <w:tcW w:type="dxa" w:w="4819"/>
-            <w:tcMar>
-              <w:top w:w="100" w:type="dxa"/>
-              <w:bottom w:w="100" w:type="dxa"/>
-              <w:left w:w="120" w:type="dxa"/>
-              <w:right w:w="120" w:type="dxa"/>
-            </w:tcMar>
-            <w:tcW w:w="4818" w:type="dxa"/>
-          </w:tcPr>
-          <w:p>
-            <w:pPr>
-              <w:jc w:val="left"/>
-            </w:pPr>
-            <w:r>
-              <w:t>Лицензионный номер (горный отвод)</w:t>
-            </w:r>
-          </w:p>
-        </w:tc>
-        <w:tc>
-          <w:tcPr>
-            <w:tcW w:type="dxa" w:w="4252"/>
-            <w:tcMar>
-              <w:top w:w="100" w:type="dxa"/>
-              <w:bottom w:w="100" w:type="dxa"/>
-              <w:left w:w="120" w:type="dxa"/>
-              <w:right w:w="120" w:type="dxa"/>
-            </w:tcMar>
-            <w:tcW w:w="4251" w:type="dxa"/>
-          </w:tcPr>
-          <w:p>
-            <w:pPr>
-              <w:jc w:val="right"/>
-            </w:pPr>
-            <w:r>
-              <w:t>{{ license_number }}</w:t>
-            </w:r>
-          </w:p>
-        </w:tc>
-      </w:tr>
-      <w:tr>
-        <w:tc>
-          <w:tcPr>
-            <w:tcW w:type="dxa" w:w="4819"/>
-            <w:tcMar>
-              <w:top w:w="100" w:type="dxa"/>
-              <w:bottom w:w="100" w:type="dxa"/>
-              <w:left w:w="120" w:type="dxa"/>
-              <w:right w:w="120" w:type="dxa"/>
-            </w:tcMar>
-            <w:tcW w:w="4818" w:type="dxa"/>
-          </w:tcPr>
-          <w:p>
-            <w:pPr>
-              <w:jc w:val="left"/>
-            </w:pPr>
-            <w:r>
-              <w:t>Геологическая площадь участка (га)</w:t>
-            </w:r>
-          </w:p>
-        </w:tc>
-        <w:tc>
-          <w:tcPr>
-            <w:tcW w:type="dxa" w:w="4252"/>
-            <w:tcMar>
-              <w:top w:w="100" w:type="dxa"/>
-              <w:bottom w:w="100" w:type="dxa"/>
-              <w:left w:w="120" w:type="dxa"/>
-              <w:right w:w="120" w:type="dxa"/>
-            </w:tcMar>
-            <w:tcW w:w="4251" w:type="dxa"/>
-          </w:tcPr>
-          <w:p>
-            <w:pPr>
-              <w:jc w:val="right"/>
-            </w:pPr>
-            <w:r>
-              <w:t>{{ fmt.area_ha }}</w:t>
-            </w:r>
-          </w:p>
-        </w:tc>
-      </w:tr>
-      <w:tr>
-        <w:tc>
-          <w:tcPr>
-            <w:tcW w:type="dxa" w:w="4819"/>
-            <w:tcMar>
-              <w:top w:w="100" w:type="dxa"/>
-              <w:bottom w:w="100" w:type="dxa"/>
-              <w:left w:w="120" w:type="dxa"/>
-              <w:right w:w="120" w:type="dxa"/>
-            </w:tcMar>
-            <w:tcW w:w="4818" w:type="dxa"/>
-          </w:tcPr>
-          <w:p>
-            <w:pPr>
-              <w:jc w:val="left"/>
-            </w:pPr>
-            <w:r>
-              <w:t>Геологическая площадь участка (м²)</w:t>
-            </w:r>
-          </w:p>
-        </w:tc>
-        <w:tc>
-          <w:tcPr>
-            <w:tcW w:type="dxa" w:w="4252"/>
-            <w:tcMar>
-              <w:top w:w="100" w:type="dxa"/>
-              <w:bottom w:w="100" w:type="dxa"/>
-              <w:left w:w="120" w:type="dxa"/>
-              <w:right w:w="120" w:type="dxa"/>
-            </w:tcMar>
-            <w:tcW w:w="4251" w:type="dxa"/>
-          </w:tcPr>
-          <w:p>
-            <w:pPr>
-              <w:jc w:val="right"/>
-            </w:pPr>
-            <w:r>
-              <w:t>{{ fmt.area_m2 }}</w:t>
-            </w:r>
-          </w:p>
-        </w:tc>
-      </w:tr>
-      <w:tr>
-        <w:tc>
-          <w:tcPr>
-            <w:tcW w:type="dxa" w:w="4819"/>
-            <w:tcMar>
-              <w:top w:w="100" w:type="dxa"/>
-              <w:bottom w:w="100" w:type="dxa"/>
-              <w:left w:w="120" w:type="dxa"/>
-              <w:right w:w="120" w:type="dxa"/>
-            </w:tcMar>
-            <w:tcW w:w="4818" w:type="dxa"/>
-          </w:tcPr>
-          <w:p>
-            <w:pPr>
-              <w:jc w:val="left"/>
-            </w:pPr>
-            <w:r>
-              <w:t>Периметр лицензионного контура (м)</w:t>
-            </w:r>
-          </w:p>
-        </w:tc>
-        <w:tc>
-          <w:tcPr>
-            <w:tcW w:type="dxa" w:w="4252"/>
-            <w:tcMar>
-              <w:top w:w="100" w:type="dxa"/>
-              <w:bottom w:w="100" w:type="dxa"/>
-              <w:left w:w="120" w:type="dxa"/>
-              <w:right w:w="120" w:type="dxa"/>
-            </w:tcMar>
-            <w:tcW w:w="4251" w:type="dxa"/>
-          </w:tcPr>
-          <w:p>
-            <w:pPr>
-              <w:jc w:val="right"/>
-            </w:pPr>
-            <w:r>
-              <w:t>{{ fmt.perimeter_m }}</w:t>
+              <w:t>{{ mineral_type }}</w:t>
             </w:r>
           </w:p>
         </w:tc>
@@ -495,374 +227,14 @@
     </w:tbl>
     <w:p>
       <w:pPr>
-        <w:pStyle w:val="Heading1"/>
+        <w:spacing w:before="160" w:after="80"/>
       </w:pPr>
       <w:r>
-        <w:t>Раздел 2. Геологическое строение</w:t>
-      </w:r>
-    </w:p>
-    <w:p>
-      <w:r>
-        <w:t>{{ narrative_geology }}</w:t>
-      </w:r>
-    </w:p>
-    <w:tbl>
-      <w:tblPr>
-        <w:tblW w:type="auto" w:w="0"/>
-        <w:jc w:val="center"/>
-        <w:tblLook w:firstColumn="1" w:firstRow="1" w:lastColumn="0" w:lastRow="0" w:noHBand="0" w:noVBand="1" w:val="04A0"/>
-        <w:tblBorders>
-          <w:top w:val="single" w:sz="6" w:space="0" w:color="B0C4DE"/>
-          <w:bottom w:val="single" w:sz="6" w:space="0" w:color="B0C4DE"/>
-          <w:left w:val="single" w:sz="4" w:space="0" w:color="B0C4DE"/>
-          <w:right w:val="single" w:sz="4" w:space="0" w:color="B0C4DE"/>
-          <w:insideH w:val="single" w:sz="4" w:space="0" w:color="E0E6ED"/>
-          <w:insideV w:val="single" w:sz="4" w:space="0" w:color="E0E6ED"/>
-        </w:tblBorders>
-      </w:tblPr>
-      <w:tblGrid>
-        <w:gridCol w:w="3024"/>
-        <w:gridCol w:w="3024"/>
-        <w:gridCol w:w="3024"/>
-      </w:tblGrid>
-      <w:tr>
-        <w:trPr>
-          <w:tblHeader/>
-          <w:cantSplit/>
-        </w:trPr>
-        <w:tc>
-          <w:tcPr>
-            <w:tcW w:type="dxa" w:w="5102"/>
-            <w:tcMar>
-              <w:top w:w="100" w:type="dxa"/>
-              <w:bottom w:w="100" w:type="dxa"/>
-              <w:left w:w="120" w:type="dxa"/>
-              <w:right w:w="120" w:type="dxa"/>
-            </w:tcMar>
-            <w:shd w:fill="F0F4F8"/>
-            <w:tcW w:w="5102" w:type="dxa"/>
-          </w:tcPr>
-          <w:p>
-            <w:pPr>
-              <w:jc w:val="left"/>
-            </w:pPr>
-            <w:r>
-              <w:rPr>
-                <w:b/>
-              </w:rPr>
-              <w:t>Показатель</w:t>
-            </w:r>
-          </w:p>
-        </w:tc>
-        <w:tc>
-          <w:tcPr>
-            <w:tcW w:type="dxa" w:w="2268"/>
-            <w:tcMar>
-              <w:top w:w="100" w:type="dxa"/>
-              <w:bottom w:w="100" w:type="dxa"/>
-              <w:left w:w="120" w:type="dxa"/>
-              <w:right w:w="120" w:type="dxa"/>
-            </w:tcMar>
-            <w:shd w:fill="F0F4F8"/>
-            <w:tcW w:w="2267" w:type="dxa"/>
-          </w:tcPr>
-          <w:p>
-            <w:pPr>
-              <w:jc w:val="right"/>
-            </w:pPr>
-            <w:r>
-              <w:rPr>
-                <w:b/>
-              </w:rPr>
-              <w:t>Значение</w:t>
-            </w:r>
-          </w:p>
-        </w:tc>
-        <w:tc>
-          <w:tcPr>
-            <w:tcW w:type="dxa" w:w="1701"/>
-            <w:tcMar>
-              <w:top w:w="100" w:type="dxa"/>
-              <w:bottom w:w="100" w:type="dxa"/>
-              <w:left w:w="120" w:type="dxa"/>
-              <w:right w:w="120" w:type="dxa"/>
-            </w:tcMar>
-            <w:shd w:fill="F0F4F8"/>
-            <w:tcW w:w="1700" w:type="dxa"/>
-          </w:tcPr>
-          <w:p>
-            <w:pPr>
-              <w:jc w:val="center"/>
-            </w:pPr>
-            <w:r>
-              <w:rPr>
-                <w:b/>
-              </w:rPr>
-              <w:t>Единица</w:t>
-            </w:r>
-          </w:p>
-        </w:tc>
-      </w:tr>
-      <w:tr>
-        <w:tc>
-          <w:tcPr>
-            <w:tcW w:type="dxa" w:w="5102"/>
-            <w:tcMar>
-              <w:top w:w="100" w:type="dxa"/>
-              <w:bottom w:w="100" w:type="dxa"/>
-              <w:left w:w="120" w:type="dxa"/>
-              <w:right w:w="120" w:type="dxa"/>
-            </w:tcMar>
-            <w:tcW w:w="5102" w:type="dxa"/>
-          </w:tcPr>
-          <w:p>
-            <w:pPr>
-              <w:jc w:val="left"/>
-            </w:pPr>
-            <w:r>
-              <w:t>Средневзвешенная мощность пласта</w:t>
-            </w:r>
-          </w:p>
-        </w:tc>
-        <w:tc>
-          <w:tcPr>
-            <w:tcW w:type="dxa" w:w="2268"/>
-            <w:tcMar>
-              <w:top w:w="100" w:type="dxa"/>
-              <w:bottom w:w="100" w:type="dxa"/>
-              <w:left w:w="120" w:type="dxa"/>
-              <w:right w:w="120" w:type="dxa"/>
-            </w:tcMar>
-            <w:tcW w:w="2267" w:type="dxa"/>
-          </w:tcPr>
-          <w:p>
-            <w:pPr>
-              <w:jc w:val="right"/>
-            </w:pPr>
-            <w:r>
-              <w:t>{{ fmt.thickness_weighted_m }}</w:t>
-            </w:r>
-          </w:p>
-        </w:tc>
-        <w:tc>
-          <w:tcPr>
-            <w:tcW w:type="dxa" w:w="1701"/>
-            <w:tcMar>
-              <w:top w:w="100" w:type="dxa"/>
-              <w:bottom w:w="100" w:type="dxa"/>
-              <w:left w:w="120" w:type="dxa"/>
-              <w:right w:w="120" w:type="dxa"/>
-            </w:tcMar>
-            <w:tcW w:w="1700" w:type="dxa"/>
-          </w:tcPr>
-          <w:p>
-            <w:pPr>
-              <w:jc w:val="center"/>
-            </w:pPr>
-            <w:r>
-              <w:t>м</w:t>
-            </w:r>
-          </w:p>
-        </w:tc>
-      </w:tr>
-      <w:tr>
-        <w:tc>
-          <w:tcPr>
-            <w:tcW w:type="dxa" w:w="5102"/>
-            <w:tcMar>
-              <w:top w:w="100" w:type="dxa"/>
-              <w:bottom w:w="100" w:type="dxa"/>
-              <w:left w:w="120" w:type="dxa"/>
-              <w:right w:w="120" w:type="dxa"/>
-            </w:tcMar>
-            <w:tcW w:w="5102" w:type="dxa"/>
-          </w:tcPr>
-          <w:p>
-            <w:pPr>
-              <w:jc w:val="left"/>
-            </w:pPr>
-            <w:r>
-              <w:t>Минимальная мощность полезной толщи</w:t>
-            </w:r>
-          </w:p>
-        </w:tc>
-        <w:tc>
-          <w:tcPr>
-            <w:tcW w:type="dxa" w:w="2268"/>
-            <w:tcMar>
-              <w:top w:w="100" w:type="dxa"/>
-              <w:bottom w:w="100" w:type="dxa"/>
-              <w:left w:w="120" w:type="dxa"/>
-              <w:right w:w="120" w:type="dxa"/>
-            </w:tcMar>
-            <w:tcW w:w="2267" w:type="dxa"/>
-          </w:tcPr>
-          <w:p>
-            <w:pPr>
-              <w:jc w:val="right"/>
-            </w:pPr>
-            <w:r>
-              <w:t>{{ fmt.thickness_min_m }}</w:t>
-            </w:r>
-          </w:p>
-        </w:tc>
-        <w:tc>
-          <w:tcPr>
-            <w:tcW w:type="dxa" w:w="1701"/>
-            <w:tcMar>
-              <w:top w:w="100" w:type="dxa"/>
-              <w:bottom w:w="100" w:type="dxa"/>
-              <w:left w:w="120" w:type="dxa"/>
-              <w:right w:w="120" w:type="dxa"/>
-            </w:tcMar>
-            <w:tcW w:w="1700" w:type="dxa"/>
-          </w:tcPr>
-          <w:p>
-            <w:pPr>
-              <w:jc w:val="center"/>
-            </w:pPr>
-            <w:r>
-              <w:t>м</w:t>
-            </w:r>
-          </w:p>
-        </w:tc>
-      </w:tr>
-      <w:tr>
-        <w:tc>
-          <w:tcPr>
-            <w:tcW w:type="dxa" w:w="5102"/>
-            <w:tcMar>
-              <w:top w:w="100" w:type="dxa"/>
-              <w:bottom w:w="100" w:type="dxa"/>
-              <w:left w:w="120" w:type="dxa"/>
-              <w:right w:w="120" w:type="dxa"/>
-            </w:tcMar>
-            <w:tcW w:w="5102" w:type="dxa"/>
-          </w:tcPr>
-          <w:p>
-            <w:pPr>
-              <w:jc w:val="left"/>
-            </w:pPr>
-            <w:r>
-              <w:t>Максимальная мощность полезной толщи</w:t>
-            </w:r>
-          </w:p>
-        </w:tc>
-        <w:tc>
-          <w:tcPr>
-            <w:tcW w:type="dxa" w:w="2268"/>
-            <w:tcMar>
-              <w:top w:w="100" w:type="dxa"/>
-              <w:bottom w:w="100" w:type="dxa"/>
-              <w:left w:w="120" w:type="dxa"/>
-              <w:right w:w="120" w:type="dxa"/>
-            </w:tcMar>
-            <w:tcW w:w="2267" w:type="dxa"/>
-          </w:tcPr>
-          <w:p>
-            <w:pPr>
-              <w:jc w:val="right"/>
-            </w:pPr>
-            <w:r>
-              <w:t>{{ fmt.thickness_max_m }}</w:t>
-            </w:r>
-          </w:p>
-        </w:tc>
-        <w:tc>
-          <w:tcPr>
-            <w:tcW w:type="dxa" w:w="1701"/>
-            <w:tcMar>
-              <w:top w:w="100" w:type="dxa"/>
-              <w:bottom w:w="100" w:type="dxa"/>
-              <w:left w:w="120" w:type="dxa"/>
-              <w:right w:w="120" w:type="dxa"/>
-            </w:tcMar>
-            <w:tcW w:w="1700" w:type="dxa"/>
-          </w:tcPr>
-          <w:p>
-            <w:pPr>
-              <w:jc w:val="center"/>
-            </w:pPr>
-            <w:r>
-              <w:t>м</w:t>
-            </w:r>
-          </w:p>
-        </w:tc>
-      </w:tr>
-      <w:tr>
-        <w:tc>
-          <w:tcPr>
-            <w:tcW w:type="dxa" w:w="5102"/>
-            <w:tcMar>
-              <w:top w:w="100" w:type="dxa"/>
-              <w:bottom w:w="100" w:type="dxa"/>
-              <w:left w:w="120" w:type="dxa"/>
-              <w:right w:w="120" w:type="dxa"/>
-            </w:tcMar>
-            <w:tcW w:w="5102" w:type="dxa"/>
-          </w:tcPr>
-          <w:p>
-            <w:pPr>
-              <w:jc w:val="left"/>
-            </w:pPr>
-            <w:r>
-              <w:t>Коэффициент вариации мощности</w:t>
-            </w:r>
-          </w:p>
-        </w:tc>
-        <w:tc>
-          <w:tcPr>
-            <w:tcW w:type="dxa" w:w="2268"/>
-            <w:tcMar>
-              <w:top w:w="100" w:type="dxa"/>
-              <w:bottom w:w="100" w:type="dxa"/>
-              <w:left w:w="120" w:type="dxa"/>
-              <w:right w:w="120" w:type="dxa"/>
-            </w:tcMar>
-            <w:tcW w:w="2267" w:type="dxa"/>
-          </w:tcPr>
-          <w:p>
-            <w:pPr>
-              <w:jc w:val="right"/>
-            </w:pPr>
-            <w:r>
-              <w:t>{{ fmt.thickness_cv_pct }}</w:t>
-            </w:r>
-          </w:p>
-        </w:tc>
-        <w:tc>
-          <w:tcPr>
-            <w:tcW w:type="dxa" w:w="1701"/>
-            <w:tcMar>
-              <w:top w:w="100" w:type="dxa"/>
-              <w:bottom w:w="100" w:type="dxa"/>
-              <w:left w:w="120" w:type="dxa"/>
-              <w:right w:w="120" w:type="dxa"/>
-            </w:tcMar>
-            <w:tcW w:w="1700" w:type="dxa"/>
-          </w:tcPr>
-          <w:p>
-            <w:pPr>
-              <w:jc w:val="center"/>
-            </w:pPr>
-            <w:r>
-              <w:t>%</w:t>
-            </w:r>
-          </w:p>
-        </w:tc>
-      </w:tr>
-    </w:tbl>
-    <w:p>
-      <w:pPr>
-        <w:pStyle w:val="Heading1"/>
-      </w:pPr>
-      <w:r>
-        <w:t>Раздел 3. Данные скважин</w:t>
-      </w:r>
-    </w:p>
-    <w:p>
-      <w:r>
-        <w:t>Всего пройдено выработок: {{ fmt.boreholes_count }}. Реестр скважин и мощности продуктивного горизонта приведены в таблице:</w:t>
+        <w:rPr>
+          <w:b/>
+          <w:sz w:val="22"/>
+        </w:rPr>
+        <w:t>Приёмка паспорта:</w:t>
       </w:r>
     </w:p>
     <w:tbl>
@@ -893,15 +265,15 @@
         </w:trPr>
         <w:tc>
           <w:tcPr>
-            <w:tcW w:type="dxa" w:w="1587"/>
+            <w:tcW w:type="dxa" w:w="2551"/>
             <w:shd w:fill="F0F4F8"/>
             <w:tcMar>
-              <w:top w:w="100" w:type="dxa"/>
-              <w:bottom w:w="100" w:type="dxa"/>
-              <w:left w:w="100" w:type="dxa"/>
-              <w:right w:w="100" w:type="dxa"/>
+              <w:top w:w="80" w:type="dxa"/>
+              <w:bottom w:w="80" w:type="dxa"/>
+              <w:left w:w="80" w:type="dxa"/>
+              <w:right w:w="80" w:type="dxa"/>
             </w:tcMar>
-            <w:tcW w:w="1587" w:type="dxa"/>
+            <w:tcW w:w="2551" w:type="dxa"/>
           </w:tcPr>
           <w:p>
             <w:pPr>
@@ -911,103 +283,103 @@
               <w:rPr>
                 <w:b/>
               </w:rPr>
-              <w:t>№ скважины</w:t>
+              <w:t>Организация</w:t>
             </w:r>
           </w:p>
         </w:tc>
         <w:tc>
           <w:tcPr>
-            <w:tcW w:type="dxa" w:w="1928"/>
+            <w:tcW w:type="dxa" w:w="1984"/>
             <w:shd w:fill="F0F4F8"/>
             <w:tcMar>
-              <w:top w:w="100" w:type="dxa"/>
-              <w:bottom w:w="100" w:type="dxa"/>
-              <w:left w:w="100" w:type="dxa"/>
-              <w:right w:w="100" w:type="dxa"/>
+              <w:top w:w="80" w:type="dxa"/>
+              <w:bottom w:w="80" w:type="dxa"/>
+              <w:left w:w="80" w:type="dxa"/>
+              <w:right w:w="80" w:type="dxa"/>
             </w:tcMar>
-            <w:tcW w:w="1927" w:type="dxa"/>
+            <w:tcW w:w="1984" w:type="dxa"/>
           </w:tcPr>
           <w:p>
             <w:pPr>
-              <w:jc w:val="right"/>
+              <w:jc w:val="center"/>
             </w:pPr>
             <w:r>
               <w:rPr>
                 <w:b/>
               </w:rPr>
-              <w:t>Координата X</w:t>
+              <w:t>ФИО</w:t>
             </w:r>
           </w:p>
         </w:tc>
         <w:tc>
           <w:tcPr>
-            <w:tcW w:type="dxa" w:w="1928"/>
+            <w:tcW w:type="dxa" w:w="1984"/>
             <w:shd w:fill="F0F4F8"/>
             <w:tcMar>
-              <w:top w:w="100" w:type="dxa"/>
-              <w:bottom w:w="100" w:type="dxa"/>
-              <w:left w:w="100" w:type="dxa"/>
-              <w:right w:w="100" w:type="dxa"/>
+              <w:top w:w="80" w:type="dxa"/>
+              <w:bottom w:w="80" w:type="dxa"/>
+              <w:left w:w="80" w:type="dxa"/>
+              <w:right w:w="80" w:type="dxa"/>
             </w:tcMar>
-            <w:tcW w:w="1927" w:type="dxa"/>
+            <w:tcW w:w="1984" w:type="dxa"/>
           </w:tcPr>
           <w:p>
             <w:pPr>
-              <w:jc w:val="right"/>
+              <w:jc w:val="center"/>
             </w:pPr>
             <w:r>
               <w:rPr>
                 <w:b/>
               </w:rPr>
-              <w:t>Координата Y</w:t>
+              <w:t>Должность</w:t>
             </w:r>
           </w:p>
         </w:tc>
         <w:tc>
           <w:tcPr>
-            <w:tcW w:type="dxa" w:w="1814"/>
+            <w:tcW w:type="dxa" w:w="1417"/>
             <w:shd w:fill="F0F4F8"/>
             <w:tcMar>
-              <w:top w:w="100" w:type="dxa"/>
-              <w:bottom w:w="100" w:type="dxa"/>
-              <w:left w:w="100" w:type="dxa"/>
-              <w:right w:w="100" w:type="dxa"/>
+              <w:top w:w="80" w:type="dxa"/>
+              <w:bottom w:w="80" w:type="dxa"/>
+              <w:left w:w="80" w:type="dxa"/>
+              <w:right w:w="80" w:type="dxa"/>
             </w:tcMar>
-            <w:tcW w:w="1814" w:type="dxa"/>
+            <w:tcW w:w="1417" w:type="dxa"/>
           </w:tcPr>
           <w:p>
             <w:pPr>
-              <w:jc w:val="right"/>
+              <w:jc w:val="center"/>
             </w:pPr>
             <w:r>
               <w:rPr>
                 <w:b/>
               </w:rPr>
-              <w:t>Мощность, м</w:t>
+              <w:t>Подпись</w:t>
             </w:r>
           </w:p>
         </w:tc>
         <w:tc>
           <w:tcPr>
-            <w:tcW w:type="dxa" w:w="1814"/>
+            <w:tcW w:type="dxa" w:w="1134"/>
             <w:shd w:fill="F0F4F8"/>
             <w:tcMar>
-              <w:top w:w="100" w:type="dxa"/>
-              <w:bottom w:w="100" w:type="dxa"/>
-              <w:left w:w="100" w:type="dxa"/>
-              <w:right w:w="100" w:type="dxa"/>
+              <w:top w:w="80" w:type="dxa"/>
+              <w:bottom w:w="80" w:type="dxa"/>
+              <w:left w:w="80" w:type="dxa"/>
+              <w:right w:w="80" w:type="dxa"/>
             </w:tcMar>
-            <w:tcW w:w="1814" w:type="dxa"/>
+            <w:tcW w:w="1133" w:type="dxa"/>
           </w:tcPr>
           <w:p>
             <w:pPr>
-              <w:jc w:val="right"/>
+              <w:jc w:val="center"/>
             </w:pPr>
             <w:r>
               <w:rPr>
                 <w:b/>
               </w:rPr>
-              <w:t>Вес (влияние)</w:t>
+              <w:t>Дата</w:t>
             </w:r>
           </w:p>
         </w:tc>
@@ -1015,40 +387,70 @@
       <w:tr>
         <w:tc>
           <w:tcPr>
-            <w:tcW w:type="dxa" w:w="1587"/>
-            <w:tcW w:w="1587" w:type="dxa"/>
+            <w:tcW w:type="dxa" w:w="2551"/>
+            <w:tcMar>
+              <w:top w:w="80" w:type="dxa"/>
+              <w:bottom w:w="80" w:type="dxa"/>
+              <w:left w:w="80" w:type="dxa"/>
+              <w:right w:w="80" w:type="dxa"/>
+            </w:tcMar>
+            <w:tcW w:w="2551" w:type="dxa"/>
           </w:tcPr>
           <w:p>
             <w:r>
-              <w:t>{%tr for row in borehole_rows %}</w:t>
+              <w:t>Территориальное подразделение</w:t>
             </w:r>
           </w:p>
         </w:tc>
         <w:tc>
           <w:tcPr>
-            <w:tcW w:type="dxa" w:w="1928"/>
-            <w:tcW w:w="1927" w:type="dxa"/>
+            <w:tcW w:type="dxa" w:w="1984"/>
+            <w:tcMar>
+              <w:top w:w="80" w:type="dxa"/>
+              <w:bottom w:w="80" w:type="dxa"/>
+              <w:left w:w="80" w:type="dxa"/>
+              <w:right w:w="80" w:type="dxa"/>
+            </w:tcMar>
+            <w:tcW w:w="1984" w:type="dxa"/>
           </w:tcPr>
           <w:p/>
         </w:tc>
         <w:tc>
           <w:tcPr>
-            <w:tcW w:type="dxa" w:w="1928"/>
-            <w:tcW w:w="1927" w:type="dxa"/>
+            <w:tcW w:type="dxa" w:w="1984"/>
+            <w:tcMar>
+              <w:top w:w="80" w:type="dxa"/>
+              <w:bottom w:w="80" w:type="dxa"/>
+              <w:left w:w="80" w:type="dxa"/>
+              <w:right w:w="80" w:type="dxa"/>
+            </w:tcMar>
+            <w:tcW w:w="1984" w:type="dxa"/>
           </w:tcPr>
           <w:p/>
         </w:tc>
         <w:tc>
           <w:tcPr>
-            <w:tcW w:type="dxa" w:w="1814"/>
-            <w:tcW w:w="1814" w:type="dxa"/>
+            <w:tcW w:type="dxa" w:w="1417"/>
+            <w:tcMar>
+              <w:top w:w="80" w:type="dxa"/>
+              <w:bottom w:w="80" w:type="dxa"/>
+              <w:left w:w="80" w:type="dxa"/>
+              <w:right w:w="80" w:type="dxa"/>
+            </w:tcMar>
+            <w:tcW w:w="1417" w:type="dxa"/>
           </w:tcPr>
           <w:p/>
         </w:tc>
         <w:tc>
           <w:tcPr>
-            <w:tcW w:type="dxa" w:w="1814"/>
-            <w:tcW w:w="1814" w:type="dxa"/>
+            <w:tcW w:type="dxa" w:w="1134"/>
+            <w:tcMar>
+              <w:top w:w="80" w:type="dxa"/>
+              <w:bottom w:w="80" w:type="dxa"/>
+              <w:left w:w="80" w:type="dxa"/>
+              <w:right w:w="80" w:type="dxa"/>
+            </w:tcMar>
+            <w:tcW w:w="1133" w:type="dxa"/>
           </w:tcPr>
           <w:p/>
         </w:tc>
@@ -1056,101 +458,310 @@
       <w:tr>
         <w:tc>
           <w:tcPr>
-            <w:tcW w:type="dxa" w:w="1587"/>
+            <w:tcW w:type="dxa" w:w="2551"/>
             <w:tcMar>
-              <w:top w:w="90" w:type="dxa"/>
-              <w:bottom w:w="90" w:type="dxa"/>
-              <w:left w:w="100" w:type="dxa"/>
-              <w:right w:w="100" w:type="dxa"/>
+              <w:top w:w="80" w:type="dxa"/>
+              <w:bottom w:w="80" w:type="dxa"/>
+              <w:left w:w="80" w:type="dxa"/>
+              <w:right w:w="80" w:type="dxa"/>
             </w:tcMar>
-            <w:tcW w:w="1587" w:type="dxa"/>
+            <w:tcW w:w="2551" w:type="dxa"/>
+          </w:tcPr>
+          <w:p>
+            <w:r>
+              <w:t>Уполномоченный орган</w:t>
+            </w:r>
+          </w:p>
+        </w:tc>
+        <w:tc>
+          <w:tcPr>
+            <w:tcW w:type="dxa" w:w="1984"/>
+            <w:tcMar>
+              <w:top w:w="80" w:type="dxa"/>
+              <w:bottom w:w="80" w:type="dxa"/>
+              <w:left w:w="80" w:type="dxa"/>
+              <w:right w:w="80" w:type="dxa"/>
+            </w:tcMar>
+            <w:tcW w:w="1984" w:type="dxa"/>
+          </w:tcPr>
+          <w:p/>
+        </w:tc>
+        <w:tc>
+          <w:tcPr>
+            <w:tcW w:type="dxa" w:w="1984"/>
+            <w:tcMar>
+              <w:top w:w="80" w:type="dxa"/>
+              <w:bottom w:w="80" w:type="dxa"/>
+              <w:left w:w="80" w:type="dxa"/>
+              <w:right w:w="80" w:type="dxa"/>
+            </w:tcMar>
+            <w:tcW w:w="1984" w:type="dxa"/>
+          </w:tcPr>
+          <w:p/>
+        </w:tc>
+        <w:tc>
+          <w:tcPr>
+            <w:tcW w:type="dxa" w:w="1417"/>
+            <w:tcMar>
+              <w:top w:w="80" w:type="dxa"/>
+              <w:bottom w:w="80" w:type="dxa"/>
+              <w:left w:w="80" w:type="dxa"/>
+              <w:right w:w="80" w:type="dxa"/>
+            </w:tcMar>
+            <w:tcW w:w="1417" w:type="dxa"/>
+          </w:tcPr>
+          <w:p/>
+        </w:tc>
+        <w:tc>
+          <w:tcPr>
+            <w:tcW w:type="dxa" w:w="1134"/>
+            <w:tcMar>
+              <w:top w:w="80" w:type="dxa"/>
+              <w:bottom w:w="80" w:type="dxa"/>
+              <w:left w:w="80" w:type="dxa"/>
+              <w:right w:w="80" w:type="dxa"/>
+            </w:tcMar>
+            <w:tcW w:w="1133" w:type="dxa"/>
+          </w:tcPr>
+          <w:p/>
+        </w:tc>
+      </w:tr>
+    </w:tbl>
+    <w:p>
+      <w:pPr>
+        <w:spacing w:before="240" w:after="40"/>
+      </w:pPr>
+      <w:r>
+        <w:rPr>
+          <w:b/>
+        </w:rPr>
+        <w:t xml:space="preserve">Составитель: </w:t>
+      </w:r>
+      <w:r>
+        <w:t>{{ fmt.compiler_name }}        Подпись: ___________   Дата: {{ fmt.passport_date }}    М.П.</w:t>
+        <w:br/>
+      </w:r>
+      <w:r>
+        <w:rPr>
+          <w:b/>
+        </w:rPr>
+        <w:t xml:space="preserve">Проверяющий: </w:t>
+      </w:r>
+      <w:r>
+        <w:t>{{ fmt.checker_name }}        Подпись: ___________   Дата: ___________</w:t>
+      </w:r>
+    </w:p>
+    <w:p>
+      <w:r>
+        <w:br w:type="page"/>
+      </w:r>
+    </w:p>
+    <w:p>
+      <w:pPr>
+        <w:pStyle w:val="Heading1"/>
+      </w:pPr>
+      <w:r>
+        <w:t>Раздел 1. Географические координаты объекта</w:t>
+      </w:r>
+    </w:p>
+    <w:p>
+      <w:r>
+        <w:t>{{ fmt.corner_points_note }}</w:t>
+      </w:r>
+    </w:p>
+    <w:tbl>
+      <w:tblPr>
+        <w:tblW w:type="auto" w:w="0"/>
+        <w:jc w:val="center"/>
+        <w:tblLook w:firstColumn="1" w:firstRow="1" w:lastColumn="0" w:lastRow="0" w:noHBand="0" w:noVBand="1" w:val="04A0"/>
+        <w:tblBorders>
+          <w:top w:val="single" w:sz="6" w:space="0" w:color="B0C4DE"/>
+          <w:bottom w:val="single" w:sz="6" w:space="0" w:color="B0C4DE"/>
+          <w:left w:val="single" w:sz="4" w:space="0" w:color="B0C4DE"/>
+          <w:right w:val="single" w:sz="4" w:space="0" w:color="B0C4DE"/>
+          <w:insideH w:val="single" w:sz="4" w:space="0" w:color="E0E6ED"/>
+          <w:insideV w:val="single" w:sz="4" w:space="0" w:color="E0E6ED"/>
+        </w:tblBorders>
+      </w:tblPr>
+      <w:tblGrid>
+        <w:gridCol w:w="1296"/>
+        <w:gridCol w:w="1296"/>
+        <w:gridCol w:w="1296"/>
+        <w:gridCol w:w="1296"/>
+        <w:gridCol w:w="1296"/>
+        <w:gridCol w:w="1296"/>
+        <w:gridCol w:w="1296"/>
+      </w:tblGrid>
+      <w:tr>
+        <w:trPr>
+          <w:tblHeader/>
+          <w:cantSplit/>
+        </w:trPr>
+        <w:tc>
+          <w:tcPr>
+            <w:tcW w:type="dxa" w:w="907"/>
+            <w:shd w:fill="F0F4F8"/>
+            <w:tcMar>
+              <w:top w:w="80" w:type="dxa"/>
+              <w:bottom w:w="80" w:type="dxa"/>
+              <w:left w:w="60" w:type="dxa"/>
+              <w:right w:w="60" w:type="dxa"/>
+            </w:tcMar>
+            <w:tcW w:w="907" w:type="dxa"/>
           </w:tcPr>
           <w:p>
             <w:pPr>
               <w:jc w:val="center"/>
             </w:pPr>
             <w:r>
-              <w:t>{{ row.borehole_id }}</w:t>
+              <w:rPr>
+                <w:b/>
+              </w:rPr>
+              <w:t>№ точки</w:t>
             </w:r>
           </w:p>
         </w:tc>
         <w:tc>
           <w:tcPr>
-            <w:tcW w:type="dxa" w:w="1928"/>
+            <w:tcW w:type="dxa" w:w="1361"/>
+            <w:shd w:fill="F0F4F8"/>
             <w:tcMar>
-              <w:top w:w="90" w:type="dxa"/>
-              <w:bottom w:w="90" w:type="dxa"/>
-              <w:left w:w="100" w:type="dxa"/>
-              <w:right w:w="100" w:type="dxa"/>
+              <w:top w:w="80" w:type="dxa"/>
+              <w:bottom w:w="80" w:type="dxa"/>
+              <w:left w:w="60" w:type="dxa"/>
+              <w:right w:w="60" w:type="dxa"/>
             </w:tcMar>
-            <w:tcW w:w="1927" w:type="dxa"/>
+            <w:tcW w:w="1360" w:type="dxa"/>
           </w:tcPr>
           <w:p>
             <w:pPr>
-              <w:jc w:val="right"/>
+              <w:jc w:val="center"/>
             </w:pPr>
             <w:r>
-              <w:t>{{ row.x }}</w:t>
+              <w:rPr>
+                <w:b/>
+              </w:rPr>
+              <w:t>С.Ш., град.</w:t>
             </w:r>
           </w:p>
         </w:tc>
         <w:tc>
           <w:tcPr>
-            <w:tcW w:type="dxa" w:w="1928"/>
+            <w:tcW w:type="dxa" w:w="1361"/>
+            <w:shd w:fill="F0F4F8"/>
             <w:tcMar>
-              <w:top w:w="90" w:type="dxa"/>
-              <w:bottom w:w="90" w:type="dxa"/>
-              <w:left w:w="100" w:type="dxa"/>
-              <w:right w:w="100" w:type="dxa"/>
+              <w:top w:w="80" w:type="dxa"/>
+              <w:bottom w:w="80" w:type="dxa"/>
+              <w:left w:w="60" w:type="dxa"/>
+              <w:right w:w="60" w:type="dxa"/>
             </w:tcMar>
-            <w:tcW w:w="1927" w:type="dxa"/>
+            <w:tcW w:w="1360" w:type="dxa"/>
           </w:tcPr>
           <w:p>
             <w:pPr>
-              <w:jc w:val="right"/>
+              <w:jc w:val="center"/>
             </w:pPr>
             <w:r>
-              <w:t>{{ row.y }}</w:t>
+              <w:rPr>
+                <w:b/>
+              </w:rPr>
+              <w:t>С.Ш., мин.</w:t>
             </w:r>
           </w:p>
         </w:tc>
         <w:tc>
           <w:tcPr>
-            <w:tcW w:type="dxa" w:w="1814"/>
+            <w:tcW w:type="dxa" w:w="1361"/>
+            <w:shd w:fill="F0F4F8"/>
             <w:tcMar>
-              <w:top w:w="90" w:type="dxa"/>
-              <w:bottom w:w="90" w:type="dxa"/>
-              <w:left w:w="100" w:type="dxa"/>
-              <w:right w:w="100" w:type="dxa"/>
+              <w:top w:w="80" w:type="dxa"/>
+              <w:bottom w:w="80" w:type="dxa"/>
+              <w:left w:w="60" w:type="dxa"/>
+              <w:right w:w="60" w:type="dxa"/>
             </w:tcMar>
-            <w:tcW w:w="1814" w:type="dxa"/>
+            <w:tcW w:w="1360" w:type="dxa"/>
           </w:tcPr>
           <w:p>
             <w:pPr>
-              <w:jc w:val="right"/>
+              <w:jc w:val="center"/>
             </w:pPr>
             <w:r>
-              <w:t>{{ row.thickness_m }}</w:t>
+              <w:rPr>
+                <w:b/>
+              </w:rPr>
+              <w:t>С.Ш., сек.</w:t>
             </w:r>
           </w:p>
         </w:tc>
         <w:tc>
           <w:tcPr>
-            <w:tcW w:type="dxa" w:w="1814"/>
+            <w:tcW w:type="dxa" w:w="1361"/>
+            <w:shd w:fill="F0F4F8"/>
             <w:tcMar>
-              <w:top w:w="90" w:type="dxa"/>
-              <w:bottom w:w="90" w:type="dxa"/>
-              <w:left w:w="100" w:type="dxa"/>
-              <w:right w:w="100" w:type="dxa"/>
+              <w:top w:w="80" w:type="dxa"/>
+              <w:bottom w:w="80" w:type="dxa"/>
+              <w:left w:w="60" w:type="dxa"/>
+              <w:right w:w="60" w:type="dxa"/>
             </w:tcMar>
-            <w:tcW w:w="1814" w:type="dxa"/>
+            <w:tcW w:w="1360" w:type="dxa"/>
           </w:tcPr>
           <w:p>
             <w:pPr>
-              <w:jc w:val="right"/>
+              <w:jc w:val="center"/>
             </w:pPr>
             <w:r>
-              <w:t>{{ row.weight }}</w:t>
+              <w:rPr>
+                <w:b/>
+              </w:rPr>
+              <w:t>В.Д., град.</w:t>
+            </w:r>
+          </w:p>
+        </w:tc>
+        <w:tc>
+          <w:tcPr>
+            <w:tcW w:type="dxa" w:w="1361"/>
+            <w:shd w:fill="F0F4F8"/>
+            <w:tcMar>
+              <w:top w:w="80" w:type="dxa"/>
+              <w:bottom w:w="80" w:type="dxa"/>
+              <w:left w:w="60" w:type="dxa"/>
+              <w:right w:w="60" w:type="dxa"/>
+            </w:tcMar>
+            <w:tcW w:w="1360" w:type="dxa"/>
+          </w:tcPr>
+          <w:p>
+            <w:pPr>
+              <w:jc w:val="center"/>
+            </w:pPr>
+            <w:r>
+              <w:rPr>
+                <w:b/>
+              </w:rPr>
+              <w:t>В.Д., мин.</w:t>
+            </w:r>
+          </w:p>
+        </w:tc>
+        <w:tc>
+          <w:tcPr>
+            <w:tcW w:type="dxa" w:w="1361"/>
+            <w:shd w:fill="F0F4F8"/>
+            <w:tcMar>
+              <w:top w:w="80" w:type="dxa"/>
+              <w:bottom w:w="80" w:type="dxa"/>
+              <w:left w:w="60" w:type="dxa"/>
+              <w:right w:w="60" w:type="dxa"/>
+            </w:tcMar>
+            <w:tcW w:w="1360" w:type="dxa"/>
+          </w:tcPr>
+          <w:p>
+            <w:pPr>
+              <w:jc w:val="center"/>
+            </w:pPr>
+            <w:r>
+              <w:rPr>
+                <w:b/>
+              </w:rPr>
+              <w:t>В.Д., сек.</w:t>
             </w:r>
           </w:p>
         </w:tc>
@@ -1158,8 +769,205 @@
       <w:tr>
         <w:tc>
           <w:tcPr>
-            <w:tcW w:type="dxa" w:w="1587"/>
-            <w:tcW w:w="1587" w:type="dxa"/>
+            <w:tcW w:type="dxa" w:w="907"/>
+            <w:tcW w:w="907" w:type="dxa"/>
+          </w:tcPr>
+          <w:p>
+            <w:r>
+              <w:t>{%tr for p in corner_points %}</w:t>
+            </w:r>
+          </w:p>
+        </w:tc>
+        <w:tc>
+          <w:tcPr>
+            <w:tcW w:type="dxa" w:w="1361"/>
+            <w:tcW w:w="1360" w:type="dxa"/>
+          </w:tcPr>
+          <w:p/>
+        </w:tc>
+        <w:tc>
+          <w:tcPr>
+            <w:tcW w:type="dxa" w:w="1361"/>
+            <w:tcW w:w="1360" w:type="dxa"/>
+          </w:tcPr>
+          <w:p/>
+        </w:tc>
+        <w:tc>
+          <w:tcPr>
+            <w:tcW w:type="dxa" w:w="1361"/>
+            <w:tcW w:w="1360" w:type="dxa"/>
+          </w:tcPr>
+          <w:p/>
+        </w:tc>
+        <w:tc>
+          <w:tcPr>
+            <w:tcW w:type="dxa" w:w="1361"/>
+            <w:tcW w:w="1360" w:type="dxa"/>
+          </w:tcPr>
+          <w:p/>
+        </w:tc>
+        <w:tc>
+          <w:tcPr>
+            <w:tcW w:type="dxa" w:w="1361"/>
+            <w:tcW w:w="1360" w:type="dxa"/>
+          </w:tcPr>
+          <w:p/>
+        </w:tc>
+        <w:tc>
+          <w:tcPr>
+            <w:tcW w:type="dxa" w:w="1361"/>
+            <w:tcW w:w="1360" w:type="dxa"/>
+          </w:tcPr>
+          <w:p/>
+        </w:tc>
+      </w:tr>
+      <w:tr>
+        <w:tc>
+          <w:tcPr>
+            <w:tcW w:type="dxa" w:w="907"/>
+            <w:tcMar>
+              <w:top w:w="70" w:type="dxa"/>
+              <w:bottom w:w="70" w:type="dxa"/>
+              <w:left w:w="60" w:type="dxa"/>
+              <w:right w:w="60" w:type="dxa"/>
+            </w:tcMar>
+            <w:tcW w:w="907" w:type="dxa"/>
+          </w:tcPr>
+          <w:p>
+            <w:pPr>
+              <w:jc w:val="center"/>
+            </w:pPr>
+            <w:r>
+              <w:t>{{ p.n }}</w:t>
+            </w:r>
+          </w:p>
+        </w:tc>
+        <w:tc>
+          <w:tcPr>
+            <w:tcW w:type="dxa" w:w="1361"/>
+            <w:tcMar>
+              <w:top w:w="70" w:type="dxa"/>
+              <w:bottom w:w="70" w:type="dxa"/>
+              <w:left w:w="60" w:type="dxa"/>
+              <w:right w:w="60" w:type="dxa"/>
+            </w:tcMar>
+            <w:tcW w:w="1360" w:type="dxa"/>
+          </w:tcPr>
+          <w:p>
+            <w:pPr>
+              <w:jc w:val="right"/>
+            </w:pPr>
+            <w:r>
+              <w:t>{{ p.lat_d }}</w:t>
+            </w:r>
+          </w:p>
+        </w:tc>
+        <w:tc>
+          <w:tcPr>
+            <w:tcW w:type="dxa" w:w="1361"/>
+            <w:tcMar>
+              <w:top w:w="70" w:type="dxa"/>
+              <w:bottom w:w="70" w:type="dxa"/>
+              <w:left w:w="60" w:type="dxa"/>
+              <w:right w:w="60" w:type="dxa"/>
+            </w:tcMar>
+            <w:tcW w:w="1360" w:type="dxa"/>
+          </w:tcPr>
+          <w:p>
+            <w:pPr>
+              <w:jc w:val="right"/>
+            </w:pPr>
+            <w:r>
+              <w:t>{{ p.lat_m }}</w:t>
+            </w:r>
+          </w:p>
+        </w:tc>
+        <w:tc>
+          <w:tcPr>
+            <w:tcW w:type="dxa" w:w="1361"/>
+            <w:tcMar>
+              <w:top w:w="70" w:type="dxa"/>
+              <w:bottom w:w="70" w:type="dxa"/>
+              <w:left w:w="60" w:type="dxa"/>
+              <w:right w:w="60" w:type="dxa"/>
+            </w:tcMar>
+            <w:tcW w:w="1360" w:type="dxa"/>
+          </w:tcPr>
+          <w:p>
+            <w:pPr>
+              <w:jc w:val="right"/>
+            </w:pPr>
+            <w:r>
+              <w:t>{{ p.lat_s }}</w:t>
+            </w:r>
+          </w:p>
+        </w:tc>
+        <w:tc>
+          <w:tcPr>
+            <w:tcW w:type="dxa" w:w="1361"/>
+            <w:tcMar>
+              <w:top w:w="70" w:type="dxa"/>
+              <w:bottom w:w="70" w:type="dxa"/>
+              <w:left w:w="60" w:type="dxa"/>
+              <w:right w:w="60" w:type="dxa"/>
+            </w:tcMar>
+            <w:tcW w:w="1360" w:type="dxa"/>
+          </w:tcPr>
+          <w:p>
+            <w:pPr>
+              <w:jc w:val="right"/>
+            </w:pPr>
+            <w:r>
+              <w:t>{{ p.lon_d }}</w:t>
+            </w:r>
+          </w:p>
+        </w:tc>
+        <w:tc>
+          <w:tcPr>
+            <w:tcW w:type="dxa" w:w="1361"/>
+            <w:tcMar>
+              <w:top w:w="70" w:type="dxa"/>
+              <w:bottom w:w="70" w:type="dxa"/>
+              <w:left w:w="60" w:type="dxa"/>
+              <w:right w:w="60" w:type="dxa"/>
+            </w:tcMar>
+            <w:tcW w:w="1360" w:type="dxa"/>
+          </w:tcPr>
+          <w:p>
+            <w:pPr>
+              <w:jc w:val="right"/>
+            </w:pPr>
+            <w:r>
+              <w:t>{{ p.lon_m }}</w:t>
+            </w:r>
+          </w:p>
+        </w:tc>
+        <w:tc>
+          <w:tcPr>
+            <w:tcW w:type="dxa" w:w="1361"/>
+            <w:tcMar>
+              <w:top w:w="70" w:type="dxa"/>
+              <w:bottom w:w="70" w:type="dxa"/>
+              <w:left w:w="60" w:type="dxa"/>
+              <w:right w:w="60" w:type="dxa"/>
+            </w:tcMar>
+            <w:tcW w:w="1360" w:type="dxa"/>
+          </w:tcPr>
+          <w:p>
+            <w:pPr>
+              <w:jc w:val="right"/>
+            </w:pPr>
+            <w:r>
+              <w:t>{{ p.lon_s }}</w:t>
+            </w:r>
+          </w:p>
+        </w:tc>
+      </w:tr>
+      <w:tr>
+        <w:tc>
+          <w:tcPr>
+            <w:tcW w:type="dxa" w:w="907"/>
+            <w:tcW w:w="907" w:type="dxa"/>
           </w:tcPr>
           <w:p>
             <w:r>
@@ -1169,29 +977,43 @@
         </w:tc>
         <w:tc>
           <w:tcPr>
-            <w:tcW w:type="dxa" w:w="1928"/>
-            <w:tcW w:w="1927" w:type="dxa"/>
+            <w:tcW w:type="dxa" w:w="1361"/>
+            <w:tcW w:w="1360" w:type="dxa"/>
           </w:tcPr>
           <w:p/>
         </w:tc>
         <w:tc>
           <w:tcPr>
-            <w:tcW w:type="dxa" w:w="1928"/>
-            <w:tcW w:w="1927" w:type="dxa"/>
+            <w:tcW w:type="dxa" w:w="1361"/>
+            <w:tcW w:w="1360" w:type="dxa"/>
           </w:tcPr>
           <w:p/>
         </w:tc>
         <w:tc>
           <w:tcPr>
-            <w:tcW w:type="dxa" w:w="1814"/>
-            <w:tcW w:w="1814" w:type="dxa"/>
+            <w:tcW w:type="dxa" w:w="1361"/>
+            <w:tcW w:w="1360" w:type="dxa"/>
           </w:tcPr>
           <w:p/>
         </w:tc>
         <w:tc>
           <w:tcPr>
-            <w:tcW w:type="dxa" w:w="1814"/>
-            <w:tcW w:w="1814" w:type="dxa"/>
+            <w:tcW w:type="dxa" w:w="1361"/>
+            <w:tcW w:w="1360" w:type="dxa"/>
+          </w:tcPr>
+          <w:p/>
+        </w:tc>
+        <w:tc>
+          <w:tcPr>
+            <w:tcW w:type="dxa" w:w="1361"/>
+            <w:tcW w:w="1360" w:type="dxa"/>
+          </w:tcPr>
+          <w:p/>
+        </w:tc>
+        <w:tc>
+          <w:tcPr>
+            <w:tcW w:type="dxa" w:w="1361"/>
+            <w:tcW w:w="1360" w:type="dxa"/>
           </w:tcPr>
           <w:p/>
         </w:tc>
@@ -1202,12 +1024,295 @@
         <w:pStyle w:val="Heading1"/>
       </w:pPr>
       <w:r>
-        <w:t>Раздел 4. Качество сырья</w:t>
+        <w:t>Раздел 2. Организация-недропользователь</w:t>
       </w:r>
     </w:p>
+    <w:tbl>
+      <w:tblPr>
+        <w:tblW w:type="auto" w:w="0"/>
+        <w:jc w:val="center"/>
+        <w:tblLook w:firstColumn="1" w:firstRow="1" w:lastColumn="0" w:lastRow="0" w:noHBand="0" w:noVBand="1" w:val="04A0"/>
+        <w:tblBorders>
+          <w:top w:val="single" w:sz="6" w:space="0" w:color="B0C4DE"/>
+          <w:bottom w:val="single" w:sz="6" w:space="0" w:color="B0C4DE"/>
+          <w:left w:val="single" w:sz="4" w:space="0" w:color="B0C4DE"/>
+          <w:right w:val="single" w:sz="4" w:space="0" w:color="B0C4DE"/>
+          <w:insideH w:val="single" w:sz="4" w:space="0" w:color="E0E6ED"/>
+          <w:insideV w:val="single" w:sz="4" w:space="0" w:color="E0E6ED"/>
+        </w:tblBorders>
+      </w:tblPr>
+      <w:tblGrid>
+        <w:gridCol w:w="4535"/>
+        <w:gridCol w:w="4535"/>
+      </w:tblGrid>
+      <w:tr>
+        <w:tc>
+          <w:tcPr>
+            <w:tcW w:type="dxa" w:w="3969"/>
+            <w:tcMar>
+              <w:top w:w="80" w:type="dxa"/>
+              <w:bottom w:w="80" w:type="dxa"/>
+              <w:left w:w="100" w:type="dxa"/>
+              <w:right w:w="100" w:type="dxa"/>
+            </w:tcMar>
+            <w:tcW w:w="3968" w:type="dxa"/>
+          </w:tcPr>
+          <w:p>
+            <w:r>
+              <w:rPr>
+                <w:b/>
+              </w:rPr>
+              <w:t>Название организации</w:t>
+            </w:r>
+          </w:p>
+        </w:tc>
+        <w:tc>
+          <w:tcPr>
+            <w:tcW w:type="dxa" w:w="5102"/>
+            <w:tcMar>
+              <w:top w:w="80" w:type="dxa"/>
+              <w:bottom w:w="80" w:type="dxa"/>
+              <w:left w:w="100" w:type="dxa"/>
+              <w:right w:w="100" w:type="dxa"/>
+            </w:tcMar>
+            <w:tcW w:w="5102" w:type="dxa"/>
+          </w:tcPr>
+          <w:p>
+            <w:r>
+              <w:t>{{ company_name }}</w:t>
+            </w:r>
+          </w:p>
+        </w:tc>
+      </w:tr>
+      <w:tr>
+        <w:tc>
+          <w:tcPr>
+            <w:tcW w:type="dxa" w:w="3969"/>
+            <w:tcMar>
+              <w:top w:w="80" w:type="dxa"/>
+              <w:bottom w:w="80" w:type="dxa"/>
+              <w:left w:w="100" w:type="dxa"/>
+              <w:right w:w="100" w:type="dxa"/>
+            </w:tcMar>
+            <w:tcW w:w="3968" w:type="dxa"/>
+          </w:tcPr>
+          <w:p>
+            <w:r>
+              <w:rPr>
+                <w:b/>
+              </w:rPr>
+              <w:t>Контракт/лицензия на недропользование материнского месторождения и (или) использование пространства недр</w:t>
+            </w:r>
+          </w:p>
+        </w:tc>
+        <w:tc>
+          <w:tcPr>
+            <w:tcW w:type="dxa" w:w="5102"/>
+            <w:tcMar>
+              <w:top w:w="80" w:type="dxa"/>
+              <w:bottom w:w="80" w:type="dxa"/>
+              <w:left w:w="100" w:type="dxa"/>
+              <w:right w:w="100" w:type="dxa"/>
+            </w:tcMar>
+            <w:tcW w:w="5102" w:type="dxa"/>
+          </w:tcPr>
+          <w:p>
+            <w:r>
+              <w:t>{{ fmt.contract_info }}</w:t>
+            </w:r>
+          </w:p>
+        </w:tc>
+      </w:tr>
+      <w:tr>
+        <w:tc>
+          <w:tcPr>
+            <w:tcW w:type="dxa" w:w="3969"/>
+            <w:tcMar>
+              <w:top w:w="80" w:type="dxa"/>
+              <w:bottom w:w="80" w:type="dxa"/>
+              <w:left w:w="100" w:type="dxa"/>
+              <w:right w:w="100" w:type="dxa"/>
+            </w:tcMar>
+            <w:tcW w:w="3968" w:type="dxa"/>
+          </w:tcPr>
+          <w:p>
+            <w:r>
+              <w:rPr>
+                <w:b/>
+              </w:rPr>
+              <w:t>Юридический адрес</w:t>
+            </w:r>
+          </w:p>
+        </w:tc>
+        <w:tc>
+          <w:tcPr>
+            <w:tcW w:type="dxa" w:w="5102"/>
+            <w:tcMar>
+              <w:top w:w="80" w:type="dxa"/>
+              <w:bottom w:w="80" w:type="dxa"/>
+              <w:left w:w="100" w:type="dxa"/>
+              <w:right w:w="100" w:type="dxa"/>
+            </w:tcMar>
+            <w:tcW w:w="5102" w:type="dxa"/>
+          </w:tcPr>
+          <w:p>
+            <w:r>
+              <w:t>{{ fmt.legal_address }}</w:t>
+            </w:r>
+          </w:p>
+        </w:tc>
+      </w:tr>
+      <w:tr>
+        <w:tc>
+          <w:tcPr>
+            <w:tcW w:type="dxa" w:w="3969"/>
+            <w:tcMar>
+              <w:top w:w="80" w:type="dxa"/>
+              <w:bottom w:w="80" w:type="dxa"/>
+              <w:left w:w="100" w:type="dxa"/>
+              <w:right w:w="100" w:type="dxa"/>
+            </w:tcMar>
+            <w:tcW w:w="3968" w:type="dxa"/>
+          </w:tcPr>
+          <w:p>
+            <w:r>
+              <w:rPr>
+                <w:b/>
+              </w:rPr>
+              <w:t>Телефон</w:t>
+            </w:r>
+          </w:p>
+        </w:tc>
+        <w:tc>
+          <w:tcPr>
+            <w:tcW w:type="dxa" w:w="5102"/>
+            <w:tcMar>
+              <w:top w:w="80" w:type="dxa"/>
+              <w:bottom w:w="80" w:type="dxa"/>
+              <w:left w:w="100" w:type="dxa"/>
+              <w:right w:w="100" w:type="dxa"/>
+            </w:tcMar>
+            <w:tcW w:w="5102" w:type="dxa"/>
+          </w:tcPr>
+          <w:p>
+            <w:r>
+              <w:t>{{ fmt.phone }}</w:t>
+            </w:r>
+          </w:p>
+        </w:tc>
+      </w:tr>
+    </w:tbl>
     <w:p>
+      <w:pPr>
+        <w:pStyle w:val="Heading1"/>
+      </w:pPr>
       <w:r>
-        <w:t>{{ narrative_quality }}</w:t>
+        <w:t>Раздел 3. Способ отработки вскрышных и вмещающих пород материнского месторождения</w:t>
+      </w:r>
+    </w:p>
+    <w:tbl>
+      <w:tblPr>
+        <w:tblW w:type="auto" w:w="0"/>
+        <w:jc w:val="center"/>
+        <w:tblLook w:firstColumn="1" w:firstRow="1" w:lastColumn="0" w:lastRow="0" w:noHBand="0" w:noVBand="1" w:val="04A0"/>
+        <w:tblBorders>
+          <w:top w:val="single" w:sz="6" w:space="0" w:color="B0C4DE"/>
+          <w:bottom w:val="single" w:sz="6" w:space="0" w:color="B0C4DE"/>
+          <w:left w:val="single" w:sz="4" w:space="0" w:color="B0C4DE"/>
+          <w:right w:val="single" w:sz="4" w:space="0" w:color="B0C4DE"/>
+          <w:insideH w:val="single" w:sz="4" w:space="0" w:color="E0E6ED"/>
+          <w:insideV w:val="single" w:sz="4" w:space="0" w:color="E0E6ED"/>
+        </w:tblBorders>
+      </w:tblPr>
+      <w:tblGrid>
+        <w:gridCol w:w="4535"/>
+        <w:gridCol w:w="4535"/>
+      </w:tblGrid>
+      <w:tr>
+        <w:tc>
+          <w:tcPr>
+            <w:tcW w:type="dxa" w:w="4535"/>
+            <w:tcMar>
+              <w:top w:w="80" w:type="dxa"/>
+              <w:bottom w:w="80" w:type="dxa"/>
+              <w:left w:w="100" w:type="dxa"/>
+              <w:right w:w="100" w:type="dxa"/>
+            </w:tcMar>
+            <w:tcW w:w="4535" w:type="dxa"/>
+          </w:tcPr>
+          <w:p>
+            <w:r>
+              <w:rPr>
+                <w:b/>
+              </w:rPr>
+              <w:t>Название материнского месторождения</w:t>
+            </w:r>
+          </w:p>
+        </w:tc>
+        <w:tc>
+          <w:tcPr>
+            <w:tcW w:type="dxa" w:w="4535"/>
+            <w:tcMar>
+              <w:top w:w="80" w:type="dxa"/>
+              <w:bottom w:w="80" w:type="dxa"/>
+              <w:left w:w="100" w:type="dxa"/>
+              <w:right w:w="100" w:type="dxa"/>
+            </w:tcMar>
+            <w:tcW w:w="4535" w:type="dxa"/>
+          </w:tcPr>
+          <w:p>
+            <w:r>
+              <w:t>{{ fmt.parent_deposit_name }}</w:t>
+            </w:r>
+          </w:p>
+        </w:tc>
+      </w:tr>
+      <w:tr>
+        <w:tc>
+          <w:tcPr>
+            <w:tcW w:type="dxa" w:w="4535"/>
+            <w:tcMar>
+              <w:top w:w="80" w:type="dxa"/>
+              <w:bottom w:w="80" w:type="dxa"/>
+              <w:left w:w="100" w:type="dxa"/>
+              <w:right w:w="100" w:type="dxa"/>
+            </w:tcMar>
+            <w:tcW w:w="4535" w:type="dxa"/>
+          </w:tcPr>
+          <w:p>
+            <w:r>
+              <w:rPr>
+                <w:b/>
+              </w:rPr>
+              <w:t>Способ отработки общераспространённых полезных ископаемых</w:t>
+            </w:r>
+          </w:p>
+        </w:tc>
+        <w:tc>
+          <w:tcPr>
+            <w:tcW w:type="dxa" w:w="4535"/>
+            <w:tcMar>
+              <w:top w:w="80" w:type="dxa"/>
+              <w:bottom w:w="80" w:type="dxa"/>
+              <w:left w:w="100" w:type="dxa"/>
+              <w:right w:w="100" w:type="dxa"/>
+            </w:tcMar>
+            <w:tcW w:w="4535" w:type="dxa"/>
+          </w:tcPr>
+          <w:p>
+            <w:r>
+              <w:t>{{ fmt.mining_method }}</w:t>
+            </w:r>
+          </w:p>
+        </w:tc>
+      </w:tr>
+    </w:tbl>
+    <w:p>
+      <w:pPr>
+        <w:pStyle w:val="Heading1"/>
+      </w:pPr>
+      <w:r>
+        <w:t>Раздел 4. Административное положение объекта</w:t>
       </w:r>
     </w:p>
     <w:tbl>
@@ -1236,63 +1341,15 @@
         </w:trPr>
         <w:tc>
           <w:tcPr>
-            <w:tcW w:type="dxa" w:w="5102"/>
+            <w:tcW w:type="dxa" w:w="3118"/>
+            <w:shd w:fill="F0F4F8"/>
             <w:tcMar>
-              <w:top w:w="100" w:type="dxa"/>
-              <w:bottom w:w="100" w:type="dxa"/>
-              <w:left w:w="120" w:type="dxa"/>
-              <w:right w:w="120" w:type="dxa"/>
+              <w:top w:w="80" w:type="dxa"/>
+              <w:bottom w:w="80" w:type="dxa"/>
+              <w:left w:w="100" w:type="dxa"/>
+              <w:right w:w="100" w:type="dxa"/>
             </w:tcMar>
-            <w:shd w:fill="F0F4F8"/>
-            <w:tcW w:w="5102" w:type="dxa"/>
-          </w:tcPr>
-          <w:p>
-            <w:pPr>
-              <w:jc w:val="left"/>
-            </w:pPr>
-            <w:r>
-              <w:rPr>
-                <w:b/>
-              </w:rPr>
-              <w:t>Показатель</w:t>
-            </w:r>
-          </w:p>
-        </w:tc>
-        <w:tc>
-          <w:tcPr>
-            <w:tcW w:type="dxa" w:w="2268"/>
-            <w:tcMar>
-              <w:top w:w="100" w:type="dxa"/>
-              <w:bottom w:w="100" w:type="dxa"/>
-              <w:left w:w="120" w:type="dxa"/>
-              <w:right w:w="120" w:type="dxa"/>
-            </w:tcMar>
-            <w:shd w:fill="F0F4F8"/>
-            <w:tcW w:w="2267" w:type="dxa"/>
-          </w:tcPr>
-          <w:p>
-            <w:pPr>
-              <w:jc w:val="right"/>
-            </w:pPr>
-            <w:r>
-              <w:rPr>
-                <w:b/>
-              </w:rPr>
-              <w:t>Значение</w:t>
-            </w:r>
-          </w:p>
-        </w:tc>
-        <w:tc>
-          <w:tcPr>
-            <w:tcW w:type="dxa" w:w="1701"/>
-            <w:tcMar>
-              <w:top w:w="100" w:type="dxa"/>
-              <w:bottom w:w="100" w:type="dxa"/>
-              <w:left w:w="120" w:type="dxa"/>
-              <w:right w:w="120" w:type="dxa"/>
-            </w:tcMar>
-            <w:shd w:fill="F0F4F8"/>
-            <w:tcW w:w="1700" w:type="dxa"/>
+            <w:tcW w:w="3118" w:type="dxa"/>
           </w:tcPr>
           <w:p>
             <w:pPr>
@@ -1302,7 +1359,55 @@
               <w:rPr>
                 <w:b/>
               </w:rPr>
-              <w:t>Единица</w:t>
+              <w:t>Область</w:t>
+            </w:r>
+          </w:p>
+        </w:tc>
+        <w:tc>
+          <w:tcPr>
+            <w:tcW w:type="dxa" w:w="3118"/>
+            <w:shd w:fill="F0F4F8"/>
+            <w:tcMar>
+              <w:top w:w="80" w:type="dxa"/>
+              <w:bottom w:w="80" w:type="dxa"/>
+              <w:left w:w="100" w:type="dxa"/>
+              <w:right w:w="100" w:type="dxa"/>
+            </w:tcMar>
+            <w:tcW w:w="3118" w:type="dxa"/>
+          </w:tcPr>
+          <w:p>
+            <w:pPr>
+              <w:jc w:val="center"/>
+            </w:pPr>
+            <w:r>
+              <w:rPr>
+                <w:b/>
+              </w:rPr>
+              <w:t>Район</w:t>
+            </w:r>
+          </w:p>
+        </w:tc>
+        <w:tc>
+          <w:tcPr>
+            <w:tcW w:type="dxa" w:w="2835"/>
+            <w:shd w:fill="F0F4F8"/>
+            <w:tcMar>
+              <w:top w:w="80" w:type="dxa"/>
+              <w:bottom w:w="80" w:type="dxa"/>
+              <w:left w:w="100" w:type="dxa"/>
+              <w:right w:w="100" w:type="dxa"/>
+            </w:tcMar>
+            <w:tcW w:w="2834" w:type="dxa"/>
+          </w:tcPr>
+          <w:p>
+            <w:pPr>
+              <w:jc w:val="center"/>
+            </w:pPr>
+            <w:r>
+              <w:rPr>
+                <w:b/>
+              </w:rPr>
+              <w:t>Город / посёлок</w:t>
             </w:r>
           </w:p>
         </w:tc>
@@ -1310,247 +1415,61 @@
       <w:tr>
         <w:tc>
           <w:tcPr>
-            <w:tcW w:type="dxa" w:w="5102"/>
+            <w:tcW w:type="dxa" w:w="3118"/>
             <w:tcMar>
-              <w:top w:w="100" w:type="dxa"/>
-              <w:bottom w:w="100" w:type="dxa"/>
-              <w:left w:w="120" w:type="dxa"/>
-              <w:right w:w="120" w:type="dxa"/>
+              <w:top w:w="80" w:type="dxa"/>
+              <w:bottom w:w="80" w:type="dxa"/>
+              <w:left w:w="100" w:type="dxa"/>
+              <w:right w:w="100" w:type="dxa"/>
             </w:tcMar>
-            <w:tcW w:w="5102" w:type="dxa"/>
-          </w:tcPr>
-          <w:p>
-            <w:pPr>
-              <w:jc w:val="left"/>
-            </w:pPr>
-            <w:r>
-              <w:t>Модуль крупности</w:t>
-            </w:r>
-          </w:p>
-        </w:tc>
-        <w:tc>
-          <w:tcPr>
-            <w:tcW w:type="dxa" w:w="2268"/>
-            <w:tcMar>
-              <w:top w:w="100" w:type="dxa"/>
-              <w:bottom w:w="100" w:type="dxa"/>
-              <w:left w:w="120" w:type="dxa"/>
-              <w:right w:w="120" w:type="dxa"/>
-            </w:tcMar>
-            <w:tcW w:w="2267" w:type="dxa"/>
-          </w:tcPr>
-          <w:p>
-            <w:pPr>
-              <w:jc w:val="right"/>
-            </w:pPr>
-            <w:r>
-              <w:t>{{ fmt.quality.modulus_fineness }}</w:t>
-            </w:r>
-          </w:p>
-        </w:tc>
-        <w:tc>
-          <w:tcPr>
-            <w:tcW w:type="dxa" w:w="1701"/>
-            <w:tcMar>
-              <w:top w:w="100" w:type="dxa"/>
-              <w:bottom w:w="100" w:type="dxa"/>
-              <w:left w:w="120" w:type="dxa"/>
-              <w:right w:w="120" w:type="dxa"/>
-            </w:tcMar>
-            <w:tcW w:w="1700" w:type="dxa"/>
+            <w:tcW w:w="3118" w:type="dxa"/>
           </w:tcPr>
           <w:p>
             <w:pPr>
               <w:jc w:val="center"/>
             </w:pPr>
             <w:r>
-              <w:t>—</w:t>
-            </w:r>
-          </w:p>
-        </w:tc>
-      </w:tr>
-      <w:tr>
-        <w:tc>
-          <w:tcPr>
-            <w:tcW w:type="dxa" w:w="5102"/>
-            <w:tcMar>
-              <w:top w:w="100" w:type="dxa"/>
-              <w:bottom w:w="100" w:type="dxa"/>
-              <w:left w:w="120" w:type="dxa"/>
-              <w:right w:w="120" w:type="dxa"/>
-            </w:tcMar>
-            <w:tcW w:w="5102" w:type="dxa"/>
-          </w:tcPr>
-          <w:p>
-            <w:pPr>
-              <w:jc w:val="left"/>
-            </w:pPr>
-            <w:r>
-              <w:t>Содержание глинистых и пылевидных частиц</w:t>
+              <w:t>{{ fmt.oblast }}</w:t>
             </w:r>
           </w:p>
         </w:tc>
         <w:tc>
           <w:tcPr>
-            <w:tcW w:type="dxa" w:w="2268"/>
+            <w:tcW w:type="dxa" w:w="3118"/>
             <w:tcMar>
-              <w:top w:w="100" w:type="dxa"/>
-              <w:bottom w:w="100" w:type="dxa"/>
-              <w:left w:w="120" w:type="dxa"/>
-              <w:right w:w="120" w:type="dxa"/>
+              <w:top w:w="80" w:type="dxa"/>
+              <w:bottom w:w="80" w:type="dxa"/>
+              <w:left w:w="100" w:type="dxa"/>
+              <w:right w:w="100" w:type="dxa"/>
             </w:tcMar>
-            <w:tcW w:w="2267" w:type="dxa"/>
-          </w:tcPr>
-          <w:p>
-            <w:pPr>
-              <w:jc w:val="right"/>
-            </w:pPr>
-            <w:r>
-              <w:t>{{ fmt.quality.clay_content_pct }}</w:t>
-            </w:r>
-          </w:p>
-        </w:tc>
-        <w:tc>
-          <w:tcPr>
-            <w:tcW w:type="dxa" w:w="1701"/>
-            <w:tcMar>
-              <w:top w:w="100" w:type="dxa"/>
-              <w:bottom w:w="100" w:type="dxa"/>
-              <w:left w:w="120" w:type="dxa"/>
-              <w:right w:w="120" w:type="dxa"/>
-            </w:tcMar>
-            <w:tcW w:w="1700" w:type="dxa"/>
+            <w:tcW w:w="3118" w:type="dxa"/>
           </w:tcPr>
           <w:p>
             <w:pPr>
               <w:jc w:val="center"/>
             </w:pPr>
             <w:r>
-              <w:t>%</w:t>
-            </w:r>
-          </w:p>
-        </w:tc>
-      </w:tr>
-      <w:tr>
-        <w:tc>
-          <w:tcPr>
-            <w:tcW w:type="dxa" w:w="5102"/>
-            <w:tcMar>
-              <w:top w:w="100" w:type="dxa"/>
-              <w:bottom w:w="100" w:type="dxa"/>
-              <w:left w:w="120" w:type="dxa"/>
-              <w:right w:w="120" w:type="dxa"/>
-            </w:tcMar>
-            <w:tcW w:w="5102" w:type="dxa"/>
-          </w:tcPr>
-          <w:p>
-            <w:pPr>
-              <w:jc w:val="left"/>
-            </w:pPr>
-            <w:r>
-              <w:t>Естественная влажность сырья</w:t>
+              <w:t>{{ fmt.district }}</w:t>
             </w:r>
           </w:p>
         </w:tc>
         <w:tc>
           <w:tcPr>
-            <w:tcW w:type="dxa" w:w="2268"/>
+            <w:tcW w:type="dxa" w:w="2835"/>
             <w:tcMar>
-              <w:top w:w="100" w:type="dxa"/>
-              <w:bottom w:w="100" w:type="dxa"/>
-              <w:left w:w="120" w:type="dxa"/>
-              <w:right w:w="120" w:type="dxa"/>
+              <w:top w:w="80" w:type="dxa"/>
+              <w:bottom w:w="80" w:type="dxa"/>
+              <w:left w:w="100" w:type="dxa"/>
+              <w:right w:w="100" w:type="dxa"/>
             </w:tcMar>
-            <w:tcW w:w="2267" w:type="dxa"/>
-          </w:tcPr>
-          <w:p>
-            <w:pPr>
-              <w:jc w:val="right"/>
-            </w:pPr>
-            <w:r>
-              <w:t>{{ fmt.quality.moisture_pct }}</w:t>
-            </w:r>
-          </w:p>
-        </w:tc>
-        <w:tc>
-          <w:tcPr>
-            <w:tcW w:type="dxa" w:w="1701"/>
-            <w:tcMar>
-              <w:top w:w="100" w:type="dxa"/>
-              <w:bottom w:w="100" w:type="dxa"/>
-              <w:left w:w="120" w:type="dxa"/>
-              <w:right w:w="120" w:type="dxa"/>
-            </w:tcMar>
-            <w:tcW w:w="1700" w:type="dxa"/>
+            <w:tcW w:w="2834" w:type="dxa"/>
           </w:tcPr>
           <w:p>
             <w:pPr>
               <w:jc w:val="center"/>
             </w:pPr>
             <w:r>
-              <w:t>%</w:t>
-            </w:r>
-          </w:p>
-        </w:tc>
-      </w:tr>
-      <w:tr>
-        <w:tc>
-          <w:tcPr>
-            <w:tcW w:type="dxa" w:w="5102"/>
-            <w:tcMar>
-              <w:top w:w="100" w:type="dxa"/>
-              <w:bottom w:w="100" w:type="dxa"/>
-              <w:left w:w="120" w:type="dxa"/>
-              <w:right w:w="120" w:type="dxa"/>
-            </w:tcMar>
-            <w:tcW w:w="5102" w:type="dxa"/>
-          </w:tcPr>
-          <w:p>
-            <w:pPr>
-              <w:jc w:val="left"/>
-            </w:pPr>
-            <w:r>
-              <w:t>Насыпная плотность сырья</w:t>
-            </w:r>
-          </w:p>
-        </w:tc>
-        <w:tc>
-          <w:tcPr>
-            <w:tcW w:type="dxa" w:w="2268"/>
-            <w:tcMar>
-              <w:top w:w="100" w:type="dxa"/>
-              <w:bottom w:w="100" w:type="dxa"/>
-              <w:left w:w="120" w:type="dxa"/>
-              <w:right w:w="120" w:type="dxa"/>
-            </w:tcMar>
-            <w:tcW w:w="2267" w:type="dxa"/>
-          </w:tcPr>
-          <w:p>
-            <w:pPr>
-              <w:jc w:val="right"/>
-            </w:pPr>
-            <w:r>
-              <w:t>{{ fmt.quality.bulk_density_t_m3 }}</w:t>
-            </w:r>
-          </w:p>
-        </w:tc>
-        <w:tc>
-          <w:tcPr>
-            <w:tcW w:type="dxa" w:w="1701"/>
-            <w:tcMar>
-              <w:top w:w="100" w:type="dxa"/>
-              <w:bottom w:w="100" w:type="dxa"/>
-              <w:left w:w="120" w:type="dxa"/>
-              <w:right w:w="120" w:type="dxa"/>
-            </w:tcMar>
-            <w:tcW w:w="1700" w:type="dxa"/>
-          </w:tcPr>
-          <w:p>
-            <w:pPr>
-              <w:jc w:val="center"/>
-            </w:pPr>
-            <w:r>
-              <w:t>т/м³</w:t>
+              <w:t>{{ fmt.locality }}</w:t>
             </w:r>
           </w:p>
         </w:tc>
@@ -1561,12 +1480,7 @@
         <w:pStyle w:val="Heading1"/>
       </w:pPr>
       <w:r>
-        <w:t>Раздел 5. Подсчёт запасов</w:t>
-      </w:r>
-    </w:p>
-    <w:p>
-      <w:r>
-        <w:t>{{ narrative_reserves }}</w:t>
+        <w:t>Раздел 5. Параметры складирования вскрышных и вмещающих пород</w:t>
       </w:r>
     </w:p>
     <w:tbl>
@@ -1595,15 +1509,15 @@
         </w:trPr>
         <w:tc>
           <w:tcPr>
-            <w:tcW w:type="dxa" w:w="5102"/>
+            <w:tcW w:type="dxa" w:w="4819"/>
+            <w:shd w:fill="F0F4F8"/>
             <w:tcMar>
-              <w:top w:w="100" w:type="dxa"/>
-              <w:bottom w:w="100" w:type="dxa"/>
-              <w:left w:w="120" w:type="dxa"/>
-              <w:right w:w="120" w:type="dxa"/>
+              <w:top w:w="80" w:type="dxa"/>
+              <w:bottom w:w="80" w:type="dxa"/>
+              <w:left w:w="100" w:type="dxa"/>
+              <w:right w:w="100" w:type="dxa"/>
             </w:tcMar>
-            <w:shd w:fill="F0F4F8"/>
-            <w:tcW w:w="5102" w:type="dxa"/>
+            <w:tcW w:w="4818" w:type="dxa"/>
           </w:tcPr>
           <w:p>
             <w:pPr>
@@ -1613,21 +1527,21 @@
               <w:rPr>
                 <w:b/>
               </w:rPr>
-              <w:t>Показатель</w:t>
+              <w:t>Параметр</w:t>
             </w:r>
           </w:p>
         </w:tc>
         <w:tc>
           <w:tcPr>
-            <w:tcW w:type="dxa" w:w="2268"/>
+            <w:tcW w:type="dxa" w:w="2551"/>
+            <w:shd w:fill="F0F4F8"/>
             <w:tcMar>
-              <w:top w:w="100" w:type="dxa"/>
-              <w:bottom w:w="100" w:type="dxa"/>
-              <w:left w:w="120" w:type="dxa"/>
-              <w:right w:w="120" w:type="dxa"/>
+              <w:top w:w="80" w:type="dxa"/>
+              <w:bottom w:w="80" w:type="dxa"/>
+              <w:left w:w="100" w:type="dxa"/>
+              <w:right w:w="100" w:type="dxa"/>
             </w:tcMar>
-            <w:shd w:fill="F0F4F8"/>
-            <w:tcW w:w="2267" w:type="dxa"/>
+            <w:tcW w:w="2551" w:type="dxa"/>
           </w:tcPr>
           <w:p>
             <w:pPr>
@@ -1644,13 +1558,13 @@
         <w:tc>
           <w:tcPr>
             <w:tcW w:type="dxa" w:w="1701"/>
+            <w:shd w:fill="F0F4F8"/>
             <w:tcMar>
-              <w:top w:w="100" w:type="dxa"/>
-              <w:bottom w:w="100" w:type="dxa"/>
-              <w:left w:w="120" w:type="dxa"/>
-              <w:right w:w="120" w:type="dxa"/>
+              <w:top w:w="80" w:type="dxa"/>
+              <w:bottom w:w="80" w:type="dxa"/>
+              <w:left w:w="100" w:type="dxa"/>
+              <w:right w:w="100" w:type="dxa"/>
             </w:tcMar>
-            <w:shd w:fill="F0F4F8"/>
             <w:tcW w:w="1700" w:type="dxa"/>
           </w:tcPr>
           <w:p>
@@ -1669,41 +1583,38 @@
       <w:tr>
         <w:tc>
           <w:tcPr>
-            <w:tcW w:type="dxa" w:w="5102"/>
+            <w:tcW w:type="dxa" w:w="4819"/>
             <w:tcMar>
-              <w:top w:w="100" w:type="dxa"/>
-              <w:bottom w:w="100" w:type="dxa"/>
-              <w:left w:w="120" w:type="dxa"/>
-              <w:right w:w="120" w:type="dxa"/>
+              <w:top w:w="80" w:type="dxa"/>
+              <w:bottom w:w="80" w:type="dxa"/>
+              <w:left w:w="100" w:type="dxa"/>
+              <w:right w:w="100" w:type="dxa"/>
             </w:tcMar>
-            <w:tcW w:w="5102" w:type="dxa"/>
+            <w:tcW w:w="4818" w:type="dxa"/>
           </w:tcPr>
           <w:p>
-            <w:pPr>
-              <w:jc w:val="left"/>
-            </w:pPr>
             <w:r>
-              <w:t>Геологический объём полезной толщи</w:t>
+              <w:t>Длина</w:t>
             </w:r>
           </w:p>
         </w:tc>
         <w:tc>
           <w:tcPr>
-            <w:tcW w:type="dxa" w:w="2268"/>
+            <w:tcW w:type="dxa" w:w="2551"/>
             <w:tcMar>
-              <w:top w:w="100" w:type="dxa"/>
-              <w:bottom w:w="100" w:type="dxa"/>
-              <w:left w:w="120" w:type="dxa"/>
-              <w:right w:w="120" w:type="dxa"/>
+              <w:top w:w="80" w:type="dxa"/>
+              <w:bottom w:w="80" w:type="dxa"/>
+              <w:left w:w="100" w:type="dxa"/>
+              <w:right w:w="100" w:type="dxa"/>
             </w:tcMar>
-            <w:tcW w:w="2267" w:type="dxa"/>
+            <w:tcW w:w="2551" w:type="dxa"/>
           </w:tcPr>
           <w:p>
             <w:pPr>
               <w:jc w:val="right"/>
             </w:pPr>
             <w:r>
-              <w:t>{{ fmt.volume_m3 }}</w:t>
+              <w:t>{{ fmt.storage_length_m }}</w:t>
             </w:r>
           </w:p>
         </w:tc>
@@ -1711,10 +1622,10 @@
           <w:tcPr>
             <w:tcW w:type="dxa" w:w="1701"/>
             <w:tcMar>
-              <w:top w:w="100" w:type="dxa"/>
-              <w:bottom w:w="100" w:type="dxa"/>
-              <w:left w:w="120" w:type="dxa"/>
-              <w:right w:w="120" w:type="dxa"/>
+              <w:top w:w="80" w:type="dxa"/>
+              <w:bottom w:w="80" w:type="dxa"/>
+              <w:left w:w="100" w:type="dxa"/>
+              <w:right w:w="100" w:type="dxa"/>
             </w:tcMar>
             <w:tcW w:w="1700" w:type="dxa"/>
           </w:tcPr>
@@ -1723,7 +1634,7 @@
               <w:jc w:val="center"/>
             </w:pPr>
             <w:r>
-              <w:t>м³</w:t>
+              <w:t>м</w:t>
             </w:r>
           </w:p>
         </w:tc>
@@ -1731,41 +1642,38 @@
       <w:tr>
         <w:tc>
           <w:tcPr>
-            <w:tcW w:type="dxa" w:w="5102"/>
+            <w:tcW w:type="dxa" w:w="4819"/>
             <w:tcMar>
-              <w:top w:w="100" w:type="dxa"/>
-              <w:bottom w:w="100" w:type="dxa"/>
-              <w:left w:w="120" w:type="dxa"/>
-              <w:right w:w="120" w:type="dxa"/>
+              <w:top w:w="80" w:type="dxa"/>
+              <w:bottom w:w="80" w:type="dxa"/>
+              <w:left w:w="100" w:type="dxa"/>
+              <w:right w:w="100" w:type="dxa"/>
             </w:tcMar>
-            <w:tcW w:w="5102" w:type="dxa"/>
+            <w:tcW w:w="4818" w:type="dxa"/>
           </w:tcPr>
           <w:p>
-            <w:pPr>
-              <w:jc w:val="left"/>
-            </w:pPr>
             <w:r>
-              <w:t>Средняя плотность минерального сырья</w:t>
+              <w:t>Ширина</w:t>
             </w:r>
           </w:p>
         </w:tc>
         <w:tc>
           <w:tcPr>
-            <w:tcW w:type="dxa" w:w="2268"/>
+            <w:tcW w:type="dxa" w:w="2551"/>
             <w:tcMar>
-              <w:top w:w="100" w:type="dxa"/>
-              <w:bottom w:w="100" w:type="dxa"/>
-              <w:left w:w="120" w:type="dxa"/>
-              <w:right w:w="120" w:type="dxa"/>
+              <w:top w:w="80" w:type="dxa"/>
+              <w:bottom w:w="80" w:type="dxa"/>
+              <w:left w:w="100" w:type="dxa"/>
+              <w:right w:w="100" w:type="dxa"/>
             </w:tcMar>
-            <w:tcW w:w="2267" w:type="dxa"/>
+            <w:tcW w:w="2551" w:type="dxa"/>
           </w:tcPr>
           <w:p>
             <w:pPr>
               <w:jc w:val="right"/>
             </w:pPr>
             <w:r>
-              <w:t>{{ fmt.density_t_m3 }}</w:t>
+              <w:t>{{ fmt.storage_width_m }}</w:t>
             </w:r>
           </w:p>
         </w:tc>
@@ -1773,10 +1681,10 @@
           <w:tcPr>
             <w:tcW w:type="dxa" w:w="1701"/>
             <w:tcMar>
-              <w:top w:w="100" w:type="dxa"/>
-              <w:bottom w:w="100" w:type="dxa"/>
-              <w:left w:w="120" w:type="dxa"/>
-              <w:right w:w="120" w:type="dxa"/>
+              <w:top w:w="80" w:type="dxa"/>
+              <w:bottom w:w="80" w:type="dxa"/>
+              <w:left w:w="100" w:type="dxa"/>
+              <w:right w:w="100" w:type="dxa"/>
             </w:tcMar>
             <w:tcW w:w="1700" w:type="dxa"/>
           </w:tcPr>
@@ -1785,7 +1693,7 @@
               <w:jc w:val="center"/>
             </w:pPr>
             <w:r>
-              <w:t>т/м³</w:t>
+              <w:t>м</w:t>
             </w:r>
           </w:p>
         </w:tc>
@@ -1793,41 +1701,38 @@
       <w:tr>
         <w:tc>
           <w:tcPr>
-            <w:tcW w:type="dxa" w:w="5102"/>
+            <w:tcW w:type="dxa" w:w="4819"/>
             <w:tcMar>
-              <w:top w:w="100" w:type="dxa"/>
-              <w:bottom w:w="100" w:type="dxa"/>
-              <w:left w:w="120" w:type="dxa"/>
-              <w:right w:w="120" w:type="dxa"/>
+              <w:top w:w="80" w:type="dxa"/>
+              <w:bottom w:w="80" w:type="dxa"/>
+              <w:left w:w="100" w:type="dxa"/>
+              <w:right w:w="100" w:type="dxa"/>
             </w:tcMar>
-            <w:tcW w:w="5102" w:type="dxa"/>
+            <w:tcW w:w="4818" w:type="dxa"/>
           </w:tcPr>
           <w:p>
-            <w:pPr>
-              <w:jc w:val="left"/>
-            </w:pPr>
             <w:r>
-              <w:t>Балансовые запасы полезного ископаемого</w:t>
+              <w:t>Высота</w:t>
             </w:r>
           </w:p>
         </w:tc>
         <w:tc>
           <w:tcPr>
-            <w:tcW w:type="dxa" w:w="2268"/>
+            <w:tcW w:type="dxa" w:w="2551"/>
             <w:tcMar>
-              <w:top w:w="100" w:type="dxa"/>
-              <w:bottom w:w="100" w:type="dxa"/>
-              <w:left w:w="120" w:type="dxa"/>
-              <w:right w:w="120" w:type="dxa"/>
+              <w:top w:w="80" w:type="dxa"/>
+              <w:bottom w:w="80" w:type="dxa"/>
+              <w:left w:w="100" w:type="dxa"/>
+              <w:right w:w="100" w:type="dxa"/>
             </w:tcMar>
-            <w:tcW w:w="2267" w:type="dxa"/>
+            <w:tcW w:w="2551" w:type="dxa"/>
           </w:tcPr>
           <w:p>
             <w:pPr>
               <w:jc w:val="right"/>
             </w:pPr>
             <w:r>
-              <w:t>{{ fmt.reserves_t }}</w:t>
+              <w:t>{{ fmt.storage_height_m }}</w:t>
             </w:r>
           </w:p>
         </w:tc>
@@ -1835,10 +1740,10 @@
           <w:tcPr>
             <w:tcW w:type="dxa" w:w="1701"/>
             <w:tcMar>
-              <w:top w:w="100" w:type="dxa"/>
-              <w:bottom w:w="100" w:type="dxa"/>
-              <w:left w:w="120" w:type="dxa"/>
-              <w:right w:w="120" w:type="dxa"/>
+              <w:top w:w="80" w:type="dxa"/>
+              <w:bottom w:w="80" w:type="dxa"/>
+              <w:left w:w="100" w:type="dxa"/>
+              <w:right w:w="100" w:type="dxa"/>
             </w:tcMar>
             <w:tcW w:w="1700" w:type="dxa"/>
           </w:tcPr>
@@ -1847,7 +1752,7 @@
               <w:jc w:val="center"/>
             </w:pPr>
             <w:r>
-              <w:t>т</w:t>
+              <w:t>м</w:t>
             </w:r>
           </w:p>
         </w:tc>
@@ -1855,41 +1760,38 @@
       <w:tr>
         <w:tc>
           <w:tcPr>
-            <w:tcW w:type="dxa" w:w="5102"/>
+            <w:tcW w:type="dxa" w:w="4819"/>
             <w:tcMar>
-              <w:top w:w="100" w:type="dxa"/>
-              <w:bottom w:w="100" w:type="dxa"/>
-              <w:left w:w="120" w:type="dxa"/>
-              <w:right w:w="120" w:type="dxa"/>
+              <w:top w:w="80" w:type="dxa"/>
+              <w:bottom w:w="80" w:type="dxa"/>
+              <w:left w:w="100" w:type="dxa"/>
+              <w:right w:w="100" w:type="dxa"/>
             </w:tcMar>
-            <w:tcW w:w="5102" w:type="dxa"/>
+            <w:tcW w:w="4818" w:type="dxa"/>
           </w:tcPr>
           <w:p>
-            <w:pPr>
-              <w:jc w:val="left"/>
-            </w:pPr>
             <w:r>
-              <w:t>Балансовые запасы в тыс. тонн</w:t>
+              <w:t>Площадь</w:t>
             </w:r>
           </w:p>
         </w:tc>
         <w:tc>
           <w:tcPr>
-            <w:tcW w:type="dxa" w:w="2268"/>
+            <w:tcW w:type="dxa" w:w="2551"/>
             <w:tcMar>
-              <w:top w:w="100" w:type="dxa"/>
-              <w:bottom w:w="100" w:type="dxa"/>
-              <w:left w:w="120" w:type="dxa"/>
-              <w:right w:w="120" w:type="dxa"/>
+              <w:top w:w="80" w:type="dxa"/>
+              <w:bottom w:w="80" w:type="dxa"/>
+              <w:left w:w="100" w:type="dxa"/>
+              <w:right w:w="100" w:type="dxa"/>
             </w:tcMar>
-            <w:tcW w:w="2267" w:type="dxa"/>
+            <w:tcW w:w="2551" w:type="dxa"/>
           </w:tcPr>
           <w:p>
             <w:pPr>
               <w:jc w:val="right"/>
             </w:pPr>
             <w:r>
-              <w:t>{{ fmt.reserves_kt }}</w:t>
+              <w:t>{{ fmt.storage_area_km2 }}</w:t>
             </w:r>
           </w:p>
         </w:tc>
@@ -1897,10 +1799,10 @@
           <w:tcPr>
             <w:tcW w:type="dxa" w:w="1701"/>
             <w:tcMar>
-              <w:top w:w="100" w:type="dxa"/>
-              <w:bottom w:w="100" w:type="dxa"/>
-              <w:left w:w="120" w:type="dxa"/>
-              <w:right w:w="120" w:type="dxa"/>
+              <w:top w:w="80" w:type="dxa"/>
+              <w:bottom w:w="80" w:type="dxa"/>
+              <w:left w:w="100" w:type="dxa"/>
+              <w:right w:w="100" w:type="dxa"/>
             </w:tcMar>
             <w:tcW w:w="1700" w:type="dxa"/>
           </w:tcPr>
@@ -1909,7 +1811,7 @@
               <w:jc w:val="center"/>
             </w:pPr>
             <w:r>
-              <w:t>тыс. т</w:t>
+              <w:t>км²</w:t>
             </w:r>
           </w:p>
         </w:tc>
@@ -1917,41 +1819,38 @@
       <w:tr>
         <w:tc>
           <w:tcPr>
-            <w:tcW w:type="dxa" w:w="5102"/>
+            <w:tcW w:type="dxa" w:w="4819"/>
             <w:tcMar>
-              <w:top w:w="100" w:type="dxa"/>
-              <w:bottom w:w="100" w:type="dxa"/>
-              <w:left w:w="120" w:type="dxa"/>
-              <w:right w:w="120" w:type="dxa"/>
+              <w:top w:w="80" w:type="dxa"/>
+              <w:bottom w:w="80" w:type="dxa"/>
+              <w:left w:w="100" w:type="dxa"/>
+              <w:right w:w="100" w:type="dxa"/>
             </w:tcMar>
-            <w:tcW w:w="5102" w:type="dxa"/>
+            <w:tcW w:w="4818" w:type="dxa"/>
           </w:tcPr>
           <w:p>
-            <w:pPr>
-              <w:jc w:val="left"/>
-            </w:pPr>
             <w:r>
-              <w:t>Условная категория разведанности запасов</w:t>
+              <w:t>Объёмы</w:t>
             </w:r>
           </w:p>
         </w:tc>
         <w:tc>
           <w:tcPr>
-            <w:tcW w:type="dxa" w:w="2268"/>
+            <w:tcW w:type="dxa" w:w="2551"/>
             <w:tcMar>
-              <w:top w:w="100" w:type="dxa"/>
-              <w:bottom w:w="100" w:type="dxa"/>
-              <w:left w:w="120" w:type="dxa"/>
-              <w:right w:w="120" w:type="dxa"/>
+              <w:top w:w="80" w:type="dxa"/>
+              <w:bottom w:w="80" w:type="dxa"/>
+              <w:left w:w="100" w:type="dxa"/>
+              <w:right w:w="100" w:type="dxa"/>
             </w:tcMar>
-            <w:tcW w:w="2267" w:type="dxa"/>
+            <w:tcW w:w="2551" w:type="dxa"/>
           </w:tcPr>
           <w:p>
             <w:pPr>
               <w:jc w:val="right"/>
             </w:pPr>
             <w:r>
-              <w:t>{{ fmt.reserves_category }}</w:t>
+              <w:t>{{ fmt.storage_volume_thousand_m3 }}</w:t>
             </w:r>
           </w:p>
         </w:tc>
@@ -1959,10 +1858,10 @@
           <w:tcPr>
             <w:tcW w:type="dxa" w:w="1701"/>
             <w:tcMar>
-              <w:top w:w="100" w:type="dxa"/>
-              <w:bottom w:w="100" w:type="dxa"/>
-              <w:left w:w="120" w:type="dxa"/>
-              <w:right w:w="120" w:type="dxa"/>
+              <w:top w:w="80" w:type="dxa"/>
+              <w:bottom w:w="80" w:type="dxa"/>
+              <w:left w:w="100" w:type="dxa"/>
+              <w:right w:w="100" w:type="dxa"/>
             </w:tcMar>
             <w:tcW w:w="1700" w:type="dxa"/>
           </w:tcPr>
@@ -1971,7 +1870,7 @@
               <w:jc w:val="center"/>
             </w:pPr>
             <w:r>
-              <w:t>—</w:t>
+              <w:t>тыс. м³</w:t>
             </w:r>
           </w:p>
         </w:tc>
@@ -1979,25 +1878,1314 @@
     </w:tbl>
     <w:p>
       <w:pPr>
-        <w:spacing w:before="480" w:after="40"/>
+        <w:pStyle w:val="Heading1"/>
+      </w:pPr>
+      <w:r>
+        <w:t>Раздел 6. Методика подсчёта запасов</w:t>
+      </w:r>
+    </w:p>
+    <w:tbl>
+      <w:tblPr>
+        <w:tblW w:type="auto" w:w="0"/>
+        <w:jc w:val="center"/>
+        <w:tblLook w:firstColumn="1" w:firstRow="1" w:lastColumn="0" w:lastRow="0" w:noHBand="0" w:noVBand="1" w:val="04A0"/>
+        <w:tblBorders>
+          <w:top w:val="single" w:sz="6" w:space="0" w:color="B0C4DE"/>
+          <w:bottom w:val="single" w:sz="6" w:space="0" w:color="B0C4DE"/>
+          <w:left w:val="single" w:sz="6" w:space="0" w:color="B0C4DE"/>
+          <w:right w:val="single" w:sz="6" w:space="0" w:color="B0C4DE"/>
+          <w:insideH w:val="none"/>
+          <w:insideV w:val="none"/>
+        </w:tblBorders>
+      </w:tblPr>
+      <w:tblGrid>
+        <w:gridCol w:w="9071"/>
+      </w:tblGrid>
+      <w:tr>
+        <w:tc>
+          <w:tcPr>
+            <w:tcW w:type="dxa" w:w="9071"/>
+            <w:tcMar>
+              <w:top w:w="120" w:type="dxa"/>
+              <w:bottom w:w="120" w:type="dxa"/>
+              <w:left w:w="140" w:type="dxa"/>
+              <w:right w:w="140" w:type="dxa"/>
+            </w:tcMar>
+            <w:tcW w:w="9070" w:type="dxa"/>
+          </w:tcPr>
+          <w:p>
+            <w:r>
+              <w:t>{{ fmt.reserves_methodology }}</w:t>
+            </w:r>
+          </w:p>
+        </w:tc>
+      </w:tr>
+    </w:tbl>
+    <w:p>
+      <w:pPr>
+        <w:pStyle w:val="Heading1"/>
+      </w:pPr>
+      <w:r>
+        <w:t>Раздел 7. Характеристика общераспространённых полезных ископаемых</w:t>
+      </w:r>
+    </w:p>
+    <w:p>
+      <w:r>
+        <w:rPr>
+          <w:b/>
+        </w:rPr>
+        <w:t>7.1. Основные характеристики:</w:t>
+      </w:r>
+    </w:p>
+    <w:p>
+      <w:r>
+        <w:rPr>
+          <w:b/>
+        </w:rPr>
+        <w:t xml:space="preserve">Минеральный состав: </w:t>
+      </w:r>
+      <w:r>
+        <w:t>{{ fmt.composition_mineral }}</w:t>
+        <w:br/>
+      </w:r>
+      <w:r>
+        <w:rPr>
+          <w:b/>
+        </w:rPr>
+        <w:t xml:space="preserve">Петрографический и литологический состав: </w:t>
+      </w:r>
+      <w:r>
+        <w:t>{{ fmt.composition_petrographic }}</w:t>
+        <w:br/>
+      </w:r>
+      <w:r>
+        <w:rPr>
+          <w:b/>
+        </w:rPr>
+        <w:t xml:space="preserve">Гранулометрический состав: </w:t>
+      </w:r>
+      <w:r>
+        <w:t>{{ fmt.composition_granulometric }}</w:t>
+        <w:br/>
+      </w:r>
+      <w:r>
+        <w:rPr>
+          <w:b/>
+        </w:rPr>
+        <w:t xml:space="preserve">Физико-механические свойства: </w:t>
+      </w:r>
+      <w:r>
+        <w:t>{{ fmt.composition_physico_mechanical }}</w:t>
+      </w:r>
+    </w:p>
+    <w:p>
+      <w:pPr>
+        <w:spacing w:before="80" w:after="40"/>
+      </w:pPr>
+      <w:r>
+        <w:rPr>
+          <w:i/>
+        </w:rPr>
+        <w:t>Химический состав основных окислов:</w:t>
+      </w:r>
+    </w:p>
+    <w:tbl>
+      <w:tblPr>
+        <w:tblW w:type="auto" w:w="0"/>
+        <w:jc w:val="center"/>
+        <w:tblLook w:firstColumn="1" w:firstRow="1" w:lastColumn="0" w:lastRow="0" w:noHBand="0" w:noVBand="1" w:val="04A0"/>
+        <w:tblBorders>
+          <w:top w:val="single" w:sz="6" w:space="0" w:color="B0C4DE"/>
+          <w:bottom w:val="single" w:sz="6" w:space="0" w:color="B0C4DE"/>
+          <w:left w:val="single" w:sz="4" w:space="0" w:color="B0C4DE"/>
+          <w:right w:val="single" w:sz="4" w:space="0" w:color="B0C4DE"/>
+          <w:insideH w:val="single" w:sz="4" w:space="0" w:color="E0E6ED"/>
+          <w:insideV w:val="single" w:sz="4" w:space="0" w:color="E0E6ED"/>
+        </w:tblBorders>
+      </w:tblPr>
+      <w:tblGrid>
+        <w:gridCol w:w="4535"/>
+        <w:gridCol w:w="4535"/>
+      </w:tblGrid>
+      <w:tr>
+        <w:trPr>
+          <w:tblHeader/>
+          <w:cantSplit/>
+        </w:trPr>
+        <w:tc>
+          <w:tcPr>
+            <w:tcW w:type="dxa" w:w="5669"/>
+            <w:shd w:fill="F0F4F8"/>
+            <w:tcMar>
+              <w:top w:w="80" w:type="dxa"/>
+              <w:bottom w:w="80" w:type="dxa"/>
+              <w:left w:w="100" w:type="dxa"/>
+              <w:right w:w="100" w:type="dxa"/>
+            </w:tcMar>
+            <w:tcW w:w="5669" w:type="dxa"/>
+          </w:tcPr>
+          <w:p>
+            <w:r>
+              <w:rPr>
+                <w:b/>
+              </w:rPr>
+              <w:t>Окисел</w:t>
+            </w:r>
+          </w:p>
+        </w:tc>
+        <w:tc>
+          <w:tcPr>
+            <w:tcW w:type="dxa" w:w="3402"/>
+            <w:shd w:fill="F0F4F8"/>
+            <w:tcMar>
+              <w:top w:w="80" w:type="dxa"/>
+              <w:bottom w:w="80" w:type="dxa"/>
+              <w:left w:w="100" w:type="dxa"/>
+              <w:right w:w="100" w:type="dxa"/>
+            </w:tcMar>
+            <w:tcW w:w="3401" w:type="dxa"/>
+          </w:tcPr>
+          <w:p>
+            <w:pPr>
+              <w:jc w:val="right"/>
+            </w:pPr>
+            <w:r>
+              <w:rPr>
+                <w:b/>
+              </w:rPr>
+              <w:t>Содержание, %</w:t>
+            </w:r>
+          </w:p>
+        </w:tc>
+      </w:tr>
+      <w:tr>
+        <w:tc>
+          <w:tcPr>
+            <w:tcW w:type="dxa" w:w="5669"/>
+            <w:tcW w:w="5669" w:type="dxa"/>
+          </w:tcPr>
+          <w:p>
+            <w:r>
+              <w:t>{%tr for ox in chemical_oxides %}</w:t>
+            </w:r>
+          </w:p>
+        </w:tc>
+        <w:tc>
+          <w:tcPr>
+            <w:tcW w:type="dxa" w:w="3402"/>
+            <w:tcW w:w="3401" w:type="dxa"/>
+          </w:tcPr>
+          <w:p/>
+        </w:tc>
+      </w:tr>
+      <w:tr>
+        <w:tc>
+          <w:tcPr>
+            <w:tcW w:type="dxa" w:w="5669"/>
+            <w:tcMar>
+              <w:top w:w="70" w:type="dxa"/>
+              <w:bottom w:w="70" w:type="dxa"/>
+              <w:left w:w="100" w:type="dxa"/>
+              <w:right w:w="100" w:type="dxa"/>
+            </w:tcMar>
+            <w:tcW w:w="5669" w:type="dxa"/>
+          </w:tcPr>
+          <w:p>
+            <w:r>
+              <w:t>{{ ox.name }}</w:t>
+            </w:r>
+          </w:p>
+        </w:tc>
+        <w:tc>
+          <w:tcPr>
+            <w:tcW w:type="dxa" w:w="3402"/>
+            <w:tcMar>
+              <w:top w:w="70" w:type="dxa"/>
+              <w:bottom w:w="70" w:type="dxa"/>
+              <w:left w:w="100" w:type="dxa"/>
+              <w:right w:w="100" w:type="dxa"/>
+            </w:tcMar>
+            <w:tcW w:w="3401" w:type="dxa"/>
+          </w:tcPr>
+          <w:p>
+            <w:pPr>
+              <w:jc w:val="right"/>
+            </w:pPr>
+            <w:r>
+              <w:t>{{ ox.value_pct }}</w:t>
+            </w:r>
+          </w:p>
+        </w:tc>
+      </w:tr>
+      <w:tr>
+        <w:tc>
+          <w:tcPr>
+            <w:tcW w:type="dxa" w:w="5669"/>
+            <w:tcW w:w="5669" w:type="dxa"/>
+          </w:tcPr>
+          <w:p>
+            <w:r>
+              <w:t>{%tr endfor %}</w:t>
+            </w:r>
+          </w:p>
+        </w:tc>
+        <w:tc>
+          <w:tcPr>
+            <w:tcW w:type="dxa" w:w="3402"/>
+            <w:tcW w:w="3401" w:type="dxa"/>
+          </w:tcPr>
+          <w:p/>
+        </w:tc>
+      </w:tr>
+    </w:tbl>
+    <w:p>
+      <w:pPr>
+        <w:spacing w:before="160" w:after="40"/>
+      </w:pPr>
+      <w:r>
+        <w:rPr>
+          <w:b/>
+        </w:rPr>
+        <w:t>7.2. Дополнительные характеристики:</w:t>
+      </w:r>
+    </w:p>
+    <w:tbl>
+      <w:tblPr>
+        <w:tblW w:type="auto" w:w="0"/>
+        <w:jc w:val="center"/>
+        <w:tblLook w:firstColumn="1" w:firstRow="1" w:lastColumn="0" w:lastRow="0" w:noHBand="0" w:noVBand="1" w:val="04A0"/>
+        <w:tblBorders>
+          <w:top w:val="single" w:sz="6" w:space="0" w:color="B0C4DE"/>
+          <w:bottom w:val="single" w:sz="6" w:space="0" w:color="B0C4DE"/>
+          <w:left w:val="single" w:sz="4" w:space="0" w:color="B0C4DE"/>
+          <w:right w:val="single" w:sz="4" w:space="0" w:color="B0C4DE"/>
+          <w:insideH w:val="single" w:sz="4" w:space="0" w:color="E0E6ED"/>
+          <w:insideV w:val="single" w:sz="4" w:space="0" w:color="E0E6ED"/>
+        </w:tblBorders>
+      </w:tblPr>
+      <w:tblGrid>
+        <w:gridCol w:w="4535"/>
+        <w:gridCol w:w="4535"/>
+      </w:tblGrid>
+      <w:tr>
+        <w:trPr>
+          <w:tblHeader/>
+          <w:cantSplit/>
+        </w:trPr>
+        <w:tc>
+          <w:tcPr>
+            <w:tcW w:type="dxa" w:w="3969"/>
+            <w:shd w:fill="F0F4F8"/>
+            <w:tcMar>
+              <w:top w:w="80" w:type="dxa"/>
+              <w:bottom w:w="80" w:type="dxa"/>
+              <w:left w:w="100" w:type="dxa"/>
+              <w:right w:w="100" w:type="dxa"/>
+            </w:tcMar>
+            <w:tcW w:w="3968" w:type="dxa"/>
+          </w:tcPr>
+          <w:p>
+            <w:r>
+              <w:rPr>
+                <w:b/>
+              </w:rPr>
+              <w:t>Характеристика</w:t>
+            </w:r>
+          </w:p>
+        </w:tc>
+        <w:tc>
+          <w:tcPr>
+            <w:tcW w:type="dxa" w:w="5102"/>
+            <w:shd w:fill="F0F4F8"/>
+            <w:tcMar>
+              <w:top w:w="80" w:type="dxa"/>
+              <w:bottom w:w="80" w:type="dxa"/>
+              <w:left w:w="100" w:type="dxa"/>
+              <w:right w:w="100" w:type="dxa"/>
+            </w:tcMar>
+            <w:tcW w:w="5102" w:type="dxa"/>
+          </w:tcPr>
+          <w:p>
+            <w:r>
+              <w:rPr>
+                <w:b/>
+              </w:rPr>
+              <w:t>Описание</w:t>
+            </w:r>
+          </w:p>
+        </w:tc>
+      </w:tr>
+      <w:tr>
+        <w:tc>
+          <w:tcPr>
+            <w:tcW w:type="dxa" w:w="3969"/>
+            <w:tcW w:w="3968" w:type="dxa"/>
+          </w:tcPr>
+          <w:p>
+            <w:r>
+              <w:t>{%tr for ch in extra_characteristics %}</w:t>
+            </w:r>
+          </w:p>
+        </w:tc>
+        <w:tc>
+          <w:tcPr>
+            <w:tcW w:type="dxa" w:w="5102"/>
+            <w:tcW w:w="5102" w:type="dxa"/>
+          </w:tcPr>
+          <w:p/>
+        </w:tc>
+      </w:tr>
+      <w:tr>
+        <w:tc>
+          <w:tcPr>
+            <w:tcW w:type="dxa" w:w="3969"/>
+            <w:tcMar>
+              <w:top w:w="70" w:type="dxa"/>
+              <w:bottom w:w="70" w:type="dxa"/>
+              <w:left w:w="100" w:type="dxa"/>
+              <w:right w:w="100" w:type="dxa"/>
+            </w:tcMar>
+            <w:tcW w:w="3968" w:type="dxa"/>
+          </w:tcPr>
+          <w:p>
+            <w:r>
+              <w:t>{{ ch.name }}</w:t>
+            </w:r>
+          </w:p>
+        </w:tc>
+        <w:tc>
+          <w:tcPr>
+            <w:tcW w:type="dxa" w:w="5102"/>
+            <w:tcMar>
+              <w:top w:w="70" w:type="dxa"/>
+              <w:bottom w:w="70" w:type="dxa"/>
+              <w:left w:w="100" w:type="dxa"/>
+              <w:right w:w="100" w:type="dxa"/>
+            </w:tcMar>
+            <w:tcW w:w="5102" w:type="dxa"/>
+          </w:tcPr>
+          <w:p>
+            <w:r>
+              <w:t>{{ ch.description }}</w:t>
+            </w:r>
+          </w:p>
+        </w:tc>
+      </w:tr>
+      <w:tr>
+        <w:tc>
+          <w:tcPr>
+            <w:tcW w:type="dxa" w:w="3969"/>
+            <w:tcW w:w="3968" w:type="dxa"/>
+          </w:tcPr>
+          <w:p>
+            <w:r>
+              <w:t>{%tr endfor %}</w:t>
+            </w:r>
+          </w:p>
+        </w:tc>
+        <w:tc>
+          <w:tcPr>
+            <w:tcW w:type="dxa" w:w="5102"/>
+            <w:tcW w:w="5102" w:type="dxa"/>
+          </w:tcPr>
+          <w:p/>
+        </w:tc>
+      </w:tr>
+    </w:tbl>
+    <w:p>
+      <w:pPr>
+        <w:pStyle w:val="Heading1"/>
+      </w:pPr>
+      <w:r>
+        <w:t>Раздел 8. Область применения</w:t>
+      </w:r>
+    </w:p>
+    <w:tbl>
+      <w:tblPr>
+        <w:tblW w:type="auto" w:w="0"/>
+        <w:jc w:val="center"/>
+        <w:tblLook w:firstColumn="1" w:firstRow="1" w:lastColumn="0" w:lastRow="0" w:noHBand="0" w:noVBand="1" w:val="04A0"/>
+        <w:tblBorders>
+          <w:top w:val="single" w:sz="6" w:space="0" w:color="B0C4DE"/>
+          <w:bottom w:val="single" w:sz="6" w:space="0" w:color="B0C4DE"/>
+          <w:left w:val="single" w:sz="4" w:space="0" w:color="B0C4DE"/>
+          <w:right w:val="single" w:sz="4" w:space="0" w:color="B0C4DE"/>
+          <w:insideH w:val="single" w:sz="4" w:space="0" w:color="E0E6ED"/>
+          <w:insideV w:val="single" w:sz="4" w:space="0" w:color="E0E6ED"/>
+        </w:tblBorders>
+      </w:tblPr>
+      <w:tblGrid>
+        <w:gridCol w:w="3024"/>
+        <w:gridCol w:w="3024"/>
+        <w:gridCol w:w="3024"/>
+      </w:tblGrid>
+      <w:tr>
+        <w:trPr>
+          <w:tblHeader/>
+          <w:cantSplit/>
+        </w:trPr>
+        <w:tc>
+          <w:tcPr>
+            <w:tcW w:type="dxa" w:w="2835"/>
+            <w:shd w:fill="F0F4F8"/>
+            <w:tcMar>
+              <w:top w:w="80" w:type="dxa"/>
+              <w:bottom w:w="80" w:type="dxa"/>
+              <w:left w:w="100" w:type="dxa"/>
+              <w:right w:w="100" w:type="dxa"/>
+            </w:tcMar>
+            <w:tcW w:w="2834" w:type="dxa"/>
+          </w:tcPr>
+          <w:p>
+            <w:r>
+              <w:rPr>
+                <w:b/>
+              </w:rPr>
+              <w:t>Полезное ископаемое</w:t>
+            </w:r>
+          </w:p>
+        </w:tc>
+        <w:tc>
+          <w:tcPr>
+            <w:tcW w:type="dxa" w:w="3402"/>
+            <w:shd w:fill="F0F4F8"/>
+            <w:tcMar>
+              <w:top w:w="80" w:type="dxa"/>
+              <w:bottom w:w="80" w:type="dxa"/>
+              <w:left w:w="100" w:type="dxa"/>
+              <w:right w:w="100" w:type="dxa"/>
+            </w:tcMar>
+            <w:tcW w:w="3401" w:type="dxa"/>
+          </w:tcPr>
+          <w:p>
+            <w:r>
+              <w:rPr>
+                <w:b/>
+              </w:rPr>
+              <w:t>Область применения</w:t>
+            </w:r>
+          </w:p>
+        </w:tc>
+        <w:tc>
+          <w:tcPr>
+            <w:tcW w:type="dxa" w:w="2835"/>
+            <w:shd w:fill="F0F4F8"/>
+            <w:tcMar>
+              <w:top w:w="80" w:type="dxa"/>
+              <w:bottom w:w="80" w:type="dxa"/>
+              <w:left w:w="100" w:type="dxa"/>
+              <w:right w:w="100" w:type="dxa"/>
+            </w:tcMar>
+            <w:tcW w:w="2834" w:type="dxa"/>
+          </w:tcPr>
+          <w:p>
+            <w:r>
+              <w:rPr>
+                <w:b/>
+              </w:rPr>
+              <w:t>Соответствие ГОСТу или СТ РК</w:t>
+            </w:r>
+          </w:p>
+        </w:tc>
+      </w:tr>
+      <w:tr>
+        <w:tc>
+          <w:tcPr>
+            <w:tcW w:type="dxa" w:w="2835"/>
+            <w:tcW w:w="2834" w:type="dxa"/>
+          </w:tcPr>
+          <w:p>
+            <w:r>
+              <w:t>{%tr for app in applications %}</w:t>
+            </w:r>
+          </w:p>
+        </w:tc>
+        <w:tc>
+          <w:tcPr>
+            <w:tcW w:type="dxa" w:w="3402"/>
+            <w:tcW w:w="3401" w:type="dxa"/>
+          </w:tcPr>
+          <w:p/>
+        </w:tc>
+        <w:tc>
+          <w:tcPr>
+            <w:tcW w:type="dxa" w:w="2835"/>
+            <w:tcW w:w="2834" w:type="dxa"/>
+          </w:tcPr>
+          <w:p/>
+        </w:tc>
+      </w:tr>
+      <w:tr>
+        <w:tc>
+          <w:tcPr>
+            <w:tcW w:type="dxa" w:w="2835"/>
+            <w:tcMar>
+              <w:top w:w="70" w:type="dxa"/>
+              <w:bottom w:w="70" w:type="dxa"/>
+              <w:left w:w="100" w:type="dxa"/>
+              <w:right w:w="100" w:type="dxa"/>
+            </w:tcMar>
+            <w:tcW w:w="2834" w:type="dxa"/>
+          </w:tcPr>
+          <w:p>
+            <w:r>
+              <w:t>{{ app.mineral }}</w:t>
+            </w:r>
+          </w:p>
+        </w:tc>
+        <w:tc>
+          <w:tcPr>
+            <w:tcW w:type="dxa" w:w="3402"/>
+            <w:tcMar>
+              <w:top w:w="70" w:type="dxa"/>
+              <w:bottom w:w="70" w:type="dxa"/>
+              <w:left w:w="100" w:type="dxa"/>
+              <w:right w:w="100" w:type="dxa"/>
+            </w:tcMar>
+            <w:tcW w:w="3401" w:type="dxa"/>
+          </w:tcPr>
+          <w:p>
+            <w:r>
+              <w:t>{{ app.usage }}</w:t>
+            </w:r>
+          </w:p>
+        </w:tc>
+        <w:tc>
+          <w:tcPr>
+            <w:tcW w:type="dxa" w:w="2835"/>
+            <w:tcMar>
+              <w:top w:w="70" w:type="dxa"/>
+              <w:bottom w:w="70" w:type="dxa"/>
+              <w:left w:w="100" w:type="dxa"/>
+              <w:right w:w="100" w:type="dxa"/>
+            </w:tcMar>
+            <w:tcW w:w="2834" w:type="dxa"/>
+          </w:tcPr>
+          <w:p>
+            <w:r>
+              <w:t>{{ app.standard }}</w:t>
+            </w:r>
+          </w:p>
+        </w:tc>
+      </w:tr>
+      <w:tr>
+        <w:tc>
+          <w:tcPr>
+            <w:tcW w:type="dxa" w:w="2835"/>
+            <w:tcW w:w="2834" w:type="dxa"/>
+          </w:tcPr>
+          <w:p>
+            <w:r>
+              <w:t>{%tr endfor %}</w:t>
+            </w:r>
+          </w:p>
+        </w:tc>
+        <w:tc>
+          <w:tcPr>
+            <w:tcW w:type="dxa" w:w="3402"/>
+            <w:tcW w:w="3401" w:type="dxa"/>
+          </w:tcPr>
+          <w:p/>
+        </w:tc>
+        <w:tc>
+          <w:tcPr>
+            <w:tcW w:type="dxa" w:w="2835"/>
+            <w:tcW w:w="2834" w:type="dxa"/>
+          </w:tcPr>
+          <w:p/>
+        </w:tc>
+      </w:tr>
+    </w:tbl>
+    <w:p>
+      <w:pPr>
+        <w:pStyle w:val="Heading1"/>
+      </w:pPr>
+      <w:r>
+        <w:t>Раздел 9. Запасы</w:t>
+      </w:r>
+    </w:p>
+    <w:tbl>
+      <w:tblPr>
+        <w:tblW w:type="auto" w:w="0"/>
+        <w:jc w:val="center"/>
+        <w:tblLook w:firstColumn="1" w:firstRow="1" w:lastColumn="0" w:lastRow="0" w:noHBand="0" w:noVBand="1" w:val="04A0"/>
+        <w:tblBorders>
+          <w:top w:val="single" w:sz="6" w:space="0" w:color="B0C4DE"/>
+          <w:bottom w:val="single" w:sz="6" w:space="0" w:color="B0C4DE"/>
+          <w:left w:val="single" w:sz="4" w:space="0" w:color="B0C4DE"/>
+          <w:right w:val="single" w:sz="4" w:space="0" w:color="B0C4DE"/>
+          <w:insideH w:val="single" w:sz="4" w:space="0" w:color="E0E6ED"/>
+          <w:insideV w:val="single" w:sz="4" w:space="0" w:color="E0E6ED"/>
+        </w:tblBorders>
+      </w:tblPr>
+      <w:tblGrid>
+        <w:gridCol w:w="4535"/>
+        <w:gridCol w:w="4535"/>
+      </w:tblGrid>
+      <w:tr>
+        <w:tc>
+          <w:tcPr>
+            <w:tcW w:type="dxa" w:w="5669"/>
+            <w:tcMar>
+              <w:top w:w="80" w:type="dxa"/>
+              <w:bottom w:w="80" w:type="dxa"/>
+              <w:left w:w="100" w:type="dxa"/>
+              <w:right w:w="100" w:type="dxa"/>
+            </w:tcMar>
+            <w:tcW w:w="5669" w:type="dxa"/>
+          </w:tcPr>
+          <w:p>
+            <w:r>
+              <w:rPr>
+                <w:b/>
+              </w:rPr>
+              <w:t>Тип полезного ископаемого</w:t>
+            </w:r>
+          </w:p>
+        </w:tc>
+        <w:tc>
+          <w:tcPr>
+            <w:tcW w:type="dxa" w:w="3402"/>
+            <w:tcMar>
+              <w:top w:w="80" w:type="dxa"/>
+              <w:bottom w:w="80" w:type="dxa"/>
+              <w:left w:w="100" w:type="dxa"/>
+              <w:right w:w="100" w:type="dxa"/>
+            </w:tcMar>
+            <w:tcW w:w="3401" w:type="dxa"/>
+          </w:tcPr>
+          <w:p>
+            <w:pPr>
+              <w:jc w:val="right"/>
+            </w:pPr>
+            <w:r>
+              <w:t>{{ fmt.rock_origin_text }}</w:t>
+            </w:r>
+          </w:p>
+        </w:tc>
+      </w:tr>
+      <w:tr>
+        <w:tc>
+          <w:tcPr>
+            <w:tcW w:type="dxa" w:w="5669"/>
+            <w:tcMar>
+              <w:top w:w="80" w:type="dxa"/>
+              <w:bottom w:w="80" w:type="dxa"/>
+              <w:left w:w="100" w:type="dxa"/>
+              <w:right w:w="100" w:type="dxa"/>
+            </w:tcMar>
+            <w:tcW w:w="5669" w:type="dxa"/>
+          </w:tcPr>
+          <w:p>
+            <w:r>
+              <w:rPr>
+                <w:b/>
+              </w:rPr>
+              <w:t>Полезное ископаемое и единица измерения</w:t>
+            </w:r>
+          </w:p>
+        </w:tc>
+        <w:tc>
+          <w:tcPr>
+            <w:tcW w:type="dxa" w:w="3402"/>
+            <w:tcMar>
+              <w:top w:w="80" w:type="dxa"/>
+              <w:bottom w:w="80" w:type="dxa"/>
+              <w:left w:w="100" w:type="dxa"/>
+              <w:right w:w="100" w:type="dxa"/>
+            </w:tcMar>
+            <w:tcW w:w="3401" w:type="dxa"/>
+          </w:tcPr>
+          <w:p>
+            <w:pPr>
+              <w:jc w:val="right"/>
+            </w:pPr>
+            <w:r>
+              <w:t>{{ mineral_type }}, {{ fmt.unit }}</w:t>
+            </w:r>
+          </w:p>
+        </w:tc>
+      </w:tr>
+      <w:tr>
+        <w:tc>
+          <w:tcPr>
+            <w:tcW w:type="dxa" w:w="5669"/>
+            <w:tcMar>
+              <w:top w:w="80" w:type="dxa"/>
+              <w:bottom w:w="80" w:type="dxa"/>
+              <w:left w:w="100" w:type="dxa"/>
+              <w:right w:w="100" w:type="dxa"/>
+            </w:tcMar>
+            <w:tcW w:w="5669" w:type="dxa"/>
+          </w:tcPr>
+          <w:p>
+            <w:r>
+              <w:rPr>
+                <w:b/>
+              </w:rPr>
+              <w:t>Запасы по предыдущему паспорту</w:t>
+            </w:r>
+          </w:p>
+        </w:tc>
+        <w:tc>
+          <w:tcPr>
+            <w:tcW w:type="dxa" w:w="3402"/>
+            <w:tcMar>
+              <w:top w:w="80" w:type="dxa"/>
+              <w:bottom w:w="80" w:type="dxa"/>
+              <w:left w:w="100" w:type="dxa"/>
+              <w:right w:w="100" w:type="dxa"/>
+            </w:tcMar>
+            <w:tcW w:w="3401" w:type="dxa"/>
+          </w:tcPr>
+          <w:p>
+            <w:pPr>
+              <w:jc w:val="right"/>
+            </w:pPr>
+            <w:r>
+              <w:t>№ {{ fmt.previous_passport_number }}: {{ fmt.previous_reserves }} {{ fmt.unit }}</w:t>
+            </w:r>
+          </w:p>
+        </w:tc>
+      </w:tr>
+      <w:tr>
+        <w:tc>
+          <w:tcPr>
+            <w:tcW w:type="dxa" w:w="5669"/>
+            <w:tcMar>
+              <w:top w:w="80" w:type="dxa"/>
+              <w:bottom w:w="80" w:type="dxa"/>
+              <w:left w:w="100" w:type="dxa"/>
+              <w:right w:w="100" w:type="dxa"/>
+            </w:tcMar>
+            <w:tcW w:w="5669" w:type="dxa"/>
+          </w:tcPr>
+          <w:p>
+            <w:r>
+              <w:rPr>
+                <w:b/>
+              </w:rPr>
+              <w:t>Прирост запасов в связи со складированием</w:t>
+            </w:r>
+          </w:p>
+        </w:tc>
+        <w:tc>
+          <w:tcPr>
+            <w:tcW w:type="dxa" w:w="3402"/>
+            <w:tcMar>
+              <w:top w:w="80" w:type="dxa"/>
+              <w:bottom w:w="80" w:type="dxa"/>
+              <w:left w:w="100" w:type="dxa"/>
+              <w:right w:w="100" w:type="dxa"/>
+            </w:tcMar>
+            <w:tcW w:w="3401" w:type="dxa"/>
+          </w:tcPr>
+          <w:p>
+            <w:pPr>
+              <w:jc w:val="right"/>
+            </w:pPr>
+            <w:r>
+              <w:t>{{ fmt.reserves_increment }} {{ fmt.unit }}</w:t>
+            </w:r>
+          </w:p>
+        </w:tc>
+      </w:tr>
+      <w:tr>
+        <w:tc>
+          <w:tcPr>
+            <w:tcW w:type="dxa" w:w="5669"/>
+            <w:tcMar>
+              <w:top w:w="80" w:type="dxa"/>
+              <w:bottom w:w="80" w:type="dxa"/>
+              <w:left w:w="100" w:type="dxa"/>
+              <w:right w:w="100" w:type="dxa"/>
+            </w:tcMar>
+            <w:tcW w:w="5669" w:type="dxa"/>
+          </w:tcPr>
+          <w:p>
+            <w:r>
+              <w:rPr>
+                <w:b/>
+              </w:rPr>
+              <w:t>Реализованные запасы</w:t>
+            </w:r>
+          </w:p>
+        </w:tc>
+        <w:tc>
+          <w:tcPr>
+            <w:tcW w:type="dxa" w:w="3402"/>
+            <w:tcMar>
+              <w:top w:w="80" w:type="dxa"/>
+              <w:bottom w:w="80" w:type="dxa"/>
+              <w:left w:w="100" w:type="dxa"/>
+              <w:right w:w="100" w:type="dxa"/>
+            </w:tcMar>
+            <w:tcW w:w="3401" w:type="dxa"/>
+          </w:tcPr>
+          <w:p>
+            <w:pPr>
+              <w:jc w:val="right"/>
+            </w:pPr>
+            <w:r>
+              <w:t>{{ fmt.reserves_realized }} {{ fmt.unit }}</w:t>
+            </w:r>
+          </w:p>
+        </w:tc>
+      </w:tr>
+      <w:tr>
+        <w:tc>
+          <w:tcPr>
+            <w:tcW w:type="dxa" w:w="5669"/>
+            <w:tcMar>
+              <w:top w:w="80" w:type="dxa"/>
+              <w:bottom w:w="80" w:type="dxa"/>
+              <w:left w:w="100" w:type="dxa"/>
+              <w:right w:w="100" w:type="dxa"/>
+            </w:tcMar>
+            <w:tcW w:w="5669" w:type="dxa"/>
+          </w:tcPr>
+          <w:p>
+            <w:r>
+              <w:rPr>
+                <w:b/>
+              </w:rPr>
+              <w:t>Запасы на дату заполнения паспорта</w:t>
+            </w:r>
+          </w:p>
+        </w:tc>
+        <w:tc>
+          <w:tcPr>
+            <w:tcW w:type="dxa" w:w="3402"/>
+            <w:tcMar>
+              <w:top w:w="80" w:type="dxa"/>
+              <w:bottom w:w="80" w:type="dxa"/>
+              <w:left w:w="100" w:type="dxa"/>
+              <w:right w:w="100" w:type="dxa"/>
+            </w:tcMar>
+            <w:tcW w:w="3401" w:type="dxa"/>
+          </w:tcPr>
+          <w:p>
+            <w:pPr>
+              <w:jc w:val="right"/>
+            </w:pPr>
+            <w:r>
+              <w:t>{{ fmt.current_reserves }} {{ fmt.unit }} (на дату {{ fmt.passport_date }})</w:t>
+            </w:r>
+          </w:p>
+        </w:tc>
+      </w:tr>
+    </w:tbl>
+    <w:p>
+      <w:pPr>
+        <w:pStyle w:val="Heading1"/>
+      </w:pPr>
+      <w:r>
+        <w:t>Приложения</w:t>
+      </w:r>
+    </w:p>
+    <w:p>
+      <w:pPr>
+        <w:spacing w:before="160" w:after="80"/>
+      </w:pPr>
+      <w:r>
+        <w:rPr>
+          <w:b/>
+          <w:sz w:val="24"/>
+        </w:rPr>
+        <w:t>Приложение 1. Пояснительная записка</w:t>
+      </w:r>
+    </w:p>
+    <w:p>
+      <w:r>
+        <w:t>{%p for p in explanatory_note %}</w:t>
+      </w:r>
+    </w:p>
+    <w:p>
+      <w:pPr>
+        <w:spacing w:line="276" w:lineRule="auto" w:after="80"/>
+        <w:jc w:val="both"/>
+      </w:pPr>
+      <w:r>
+        <w:t>{{ p }}</w:t>
+      </w:r>
+    </w:p>
+    <w:p>
+      <w:r>
+        <w:t>{%p endfor %}</w:t>
+      </w:r>
+    </w:p>
+    <w:p>
+      <w:pPr>
+        <w:spacing w:before="280" w:after="80"/>
+      </w:pPr>
+      <w:r>
+        <w:rPr>
+          <w:b/>
+          <w:sz w:val="24"/>
+        </w:rPr>
+        <w:t>Приложение 2. Графические материалы</w:t>
+      </w:r>
+    </w:p>
+    <w:tbl>
+      <w:tblPr>
+        <w:tblW w:type="auto" w:w="0"/>
+        <w:jc w:val="center"/>
+        <w:tblLook w:firstColumn="1" w:firstRow="1" w:lastColumn="0" w:lastRow="0" w:noHBand="0" w:noVBand="1" w:val="04A0"/>
+        <w:tblBorders>
+          <w:top w:val="single" w:sz="6" w:space="0" w:color="B0C4DE"/>
+          <w:bottom w:val="single" w:sz="6" w:space="0" w:color="B0C4DE"/>
+          <w:left w:val="single" w:sz="4" w:space="0" w:color="B0C4DE"/>
+          <w:right w:val="single" w:sz="4" w:space="0" w:color="B0C4DE"/>
+          <w:insideH w:val="single" w:sz="4" w:space="0" w:color="E0E6ED"/>
+          <w:insideV w:val="single" w:sz="4" w:space="0" w:color="E0E6ED"/>
+        </w:tblBorders>
+      </w:tblPr>
+      <w:tblGrid>
+        <w:gridCol w:w="3024"/>
+        <w:gridCol w:w="3024"/>
+        <w:gridCol w:w="3024"/>
+      </w:tblGrid>
+      <w:tr>
+        <w:trPr>
+          <w:tblHeader/>
+          <w:cantSplit/>
+        </w:trPr>
+        <w:tc>
+          <w:tcPr>
+            <w:tcW w:type="dxa" w:w="850"/>
+            <w:shd w:fill="F0F4F8"/>
+            <w:tcMar>
+              <w:top w:w="80" w:type="dxa"/>
+              <w:bottom w:w="80" w:type="dxa"/>
+              <w:left w:w="100" w:type="dxa"/>
+              <w:right w:w="100" w:type="dxa"/>
+            </w:tcMar>
+            <w:tcW w:w="850" w:type="dxa"/>
+          </w:tcPr>
+          <w:p>
+            <w:r>
+              <w:rPr>
+                <w:b/>
+              </w:rPr>
+              <w:t>№</w:t>
+            </w:r>
+          </w:p>
+        </w:tc>
+        <w:tc>
+          <w:tcPr>
+            <w:tcW w:type="dxa" w:w="5386"/>
+            <w:shd w:fill="F0F4F8"/>
+            <w:tcMar>
+              <w:top w:w="80" w:type="dxa"/>
+              <w:bottom w:w="80" w:type="dxa"/>
+              <w:left w:w="100" w:type="dxa"/>
+              <w:right w:w="100" w:type="dxa"/>
+            </w:tcMar>
+            <w:tcW w:w="5385" w:type="dxa"/>
+          </w:tcPr>
+          <w:p>
+            <w:r>
+              <w:rPr>
+                <w:b/>
+              </w:rPr>
+              <w:t>Наименование графического приложения</w:t>
+            </w:r>
+          </w:p>
+        </w:tc>
+        <w:tc>
+          <w:tcPr>
+            <w:tcW w:type="dxa" w:w="2835"/>
+            <w:shd w:fill="F0F4F8"/>
+            <w:tcMar>
+              <w:top w:w="80" w:type="dxa"/>
+              <w:bottom w:w="80" w:type="dxa"/>
+              <w:left w:w="100" w:type="dxa"/>
+              <w:right w:w="100" w:type="dxa"/>
+            </w:tcMar>
+            <w:tcW w:w="2834" w:type="dxa"/>
+          </w:tcPr>
+          <w:p>
+            <w:r>
+              <w:rPr>
+                <w:b/>
+              </w:rPr>
+              <w:t>Статус</w:t>
+            </w:r>
+          </w:p>
+        </w:tc>
+      </w:tr>
+      <w:tr>
+        <w:tc>
+          <w:tcPr>
+            <w:tcW w:type="dxa" w:w="850"/>
+            <w:tcMar>
+              <w:top w:w="80" w:type="dxa"/>
+              <w:bottom w:w="80" w:type="dxa"/>
+              <w:left w:w="80" w:type="dxa"/>
+              <w:right w:w="80" w:type="dxa"/>
+            </w:tcMar>
+            <w:tcW w:w="850" w:type="dxa"/>
+          </w:tcPr>
+          <w:p>
+            <w:pPr>
+              <w:jc w:val="center"/>
+            </w:pPr>
+            <w:r>
+              <w:t>1</w:t>
+            </w:r>
+          </w:p>
+        </w:tc>
+        <w:tc>
+          <w:tcPr>
+            <w:tcW w:type="dxa" w:w="5386"/>
+            <w:tcMar>
+              <w:top w:w="80" w:type="dxa"/>
+              <w:bottom w:w="80" w:type="dxa"/>
+              <w:left w:w="100" w:type="dxa"/>
+              <w:right w:w="100" w:type="dxa"/>
+            </w:tcMar>
+            <w:tcW w:w="5385" w:type="dxa"/>
+          </w:tcPr>
+          <w:p>
+            <w:r>
+              <w:t>Ситуационный план объекта</w:t>
+            </w:r>
+          </w:p>
+        </w:tc>
+        <w:tc>
+          <w:tcPr>
+            <w:tcW w:type="dxa" w:w="2835"/>
+            <w:tcMar>
+              <w:top w:w="80" w:type="dxa"/>
+              <w:bottom w:w="80" w:type="dxa"/>
+              <w:left w:w="100" w:type="dxa"/>
+              <w:right w:w="100" w:type="dxa"/>
+            </w:tcMar>
+            <w:tcW w:w="2834" w:type="dxa"/>
+          </w:tcPr>
+          <w:p>
+            <w:pPr>
+              <w:jc w:val="center"/>
+            </w:pPr>
+            <w:r>
+              <w:rPr>
+                <w:i/>
+                <w:color w:val="666666"/>
+              </w:rPr>
+              <w:t>прилагается отдельно</w:t>
+            </w:r>
+          </w:p>
+        </w:tc>
+      </w:tr>
+      <w:tr>
+        <w:tc>
+          <w:tcPr>
+            <w:tcW w:type="dxa" w:w="850"/>
+            <w:tcMar>
+              <w:top w:w="80" w:type="dxa"/>
+              <w:bottom w:w="80" w:type="dxa"/>
+              <w:left w:w="80" w:type="dxa"/>
+              <w:right w:w="80" w:type="dxa"/>
+            </w:tcMar>
+            <w:tcW w:w="850" w:type="dxa"/>
+          </w:tcPr>
+          <w:p>
+            <w:pPr>
+              <w:jc w:val="center"/>
+            </w:pPr>
+            <w:r>
+              <w:t>2</w:t>
+            </w:r>
+          </w:p>
+        </w:tc>
+        <w:tc>
+          <w:tcPr>
+            <w:tcW w:type="dxa" w:w="5386"/>
+            <w:tcMar>
+              <w:top w:w="80" w:type="dxa"/>
+              <w:bottom w:w="80" w:type="dxa"/>
+              <w:left w:w="100" w:type="dxa"/>
+              <w:right w:w="100" w:type="dxa"/>
+            </w:tcMar>
+            <w:tcW w:w="5385" w:type="dxa"/>
+          </w:tcPr>
+          <w:p>
+            <w:r>
+              <w:t>Геологическая карта объекта</w:t>
+            </w:r>
+          </w:p>
+        </w:tc>
+        <w:tc>
+          <w:tcPr>
+            <w:tcW w:type="dxa" w:w="2835"/>
+            <w:tcMar>
+              <w:top w:w="80" w:type="dxa"/>
+              <w:bottom w:w="80" w:type="dxa"/>
+              <w:left w:w="100" w:type="dxa"/>
+              <w:right w:w="100" w:type="dxa"/>
+            </w:tcMar>
+            <w:tcW w:w="2834" w:type="dxa"/>
+          </w:tcPr>
+          <w:p>
+            <w:pPr>
+              <w:jc w:val="center"/>
+            </w:pPr>
+            <w:r>
+              <w:rPr>
+                <w:i/>
+                <w:color w:val="666666"/>
+              </w:rPr>
+              <w:t>прилагается отдельно</w:t>
+            </w:r>
+          </w:p>
+        </w:tc>
+      </w:tr>
+      <w:tr>
+        <w:tc>
+          <w:tcPr>
+            <w:tcW w:type="dxa" w:w="850"/>
+            <w:tcMar>
+              <w:top w:w="80" w:type="dxa"/>
+              <w:bottom w:w="80" w:type="dxa"/>
+              <w:left w:w="80" w:type="dxa"/>
+              <w:right w:w="80" w:type="dxa"/>
+            </w:tcMar>
+            <w:tcW w:w="850" w:type="dxa"/>
+          </w:tcPr>
+          <w:p>
+            <w:pPr>
+              <w:jc w:val="center"/>
+            </w:pPr>
+            <w:r>
+              <w:t>3</w:t>
+            </w:r>
+          </w:p>
+        </w:tc>
+        <w:tc>
+          <w:tcPr>
+            <w:tcW w:type="dxa" w:w="5386"/>
+            <w:tcMar>
+              <w:top w:w="80" w:type="dxa"/>
+              <w:bottom w:w="80" w:type="dxa"/>
+              <w:left w:w="100" w:type="dxa"/>
+              <w:right w:w="100" w:type="dxa"/>
+            </w:tcMar>
+            <w:tcW w:w="5385" w:type="dxa"/>
+          </w:tcPr>
+          <w:p>
+            <w:r>
+              <w:t>План подсчёта запасов полезного ископаемого</w:t>
+            </w:r>
+          </w:p>
+        </w:tc>
+        <w:tc>
+          <w:tcPr>
+            <w:tcW w:type="dxa" w:w="2835"/>
+            <w:tcMar>
+              <w:top w:w="80" w:type="dxa"/>
+              <w:bottom w:w="80" w:type="dxa"/>
+              <w:left w:w="100" w:type="dxa"/>
+              <w:right w:w="100" w:type="dxa"/>
+            </w:tcMar>
+            <w:tcW w:w="2834" w:type="dxa"/>
+          </w:tcPr>
+          <w:p>
+            <w:pPr>
+              <w:jc w:val="center"/>
+            </w:pPr>
+            <w:r>
+              <w:rPr>
+                <w:i/>
+                <w:color w:val="666666"/>
+              </w:rPr>
+              <w:t>прилагается отдельно</w:t>
+            </w:r>
+          </w:p>
+        </w:tc>
+      </w:tr>
+      <w:tr>
+        <w:tc>
+          <w:tcPr>
+            <w:tcW w:type="dxa" w:w="850"/>
+            <w:tcMar>
+              <w:top w:w="80" w:type="dxa"/>
+              <w:bottom w:w="80" w:type="dxa"/>
+              <w:left w:w="80" w:type="dxa"/>
+              <w:right w:w="80" w:type="dxa"/>
+            </w:tcMar>
+            <w:tcW w:w="850" w:type="dxa"/>
+          </w:tcPr>
+          <w:p>
+            <w:pPr>
+              <w:jc w:val="center"/>
+            </w:pPr>
+            <w:r>
+              <w:t>4</w:t>
+            </w:r>
+          </w:p>
+        </w:tc>
+        <w:tc>
+          <w:tcPr>
+            <w:tcW w:type="dxa" w:w="5386"/>
+            <w:tcMar>
+              <w:top w:w="80" w:type="dxa"/>
+              <w:bottom w:w="80" w:type="dxa"/>
+              <w:left w:w="100" w:type="dxa"/>
+              <w:right w:w="100" w:type="dxa"/>
+            </w:tcMar>
+            <w:tcW w:w="5385" w:type="dxa"/>
+          </w:tcPr>
+          <w:p>
+            <w:r>
+              <w:t>Геологические разрезы объекта</w:t>
+            </w:r>
+          </w:p>
+        </w:tc>
+        <w:tc>
+          <w:tcPr>
+            <w:tcW w:type="dxa" w:w="2835"/>
+            <w:tcMar>
+              <w:top w:w="80" w:type="dxa"/>
+              <w:bottom w:w="80" w:type="dxa"/>
+              <w:left w:w="100" w:type="dxa"/>
+              <w:right w:w="100" w:type="dxa"/>
+            </w:tcMar>
+            <w:tcW w:w="2834" w:type="dxa"/>
+          </w:tcPr>
+          <w:p>
+            <w:pPr>
+              <w:jc w:val="center"/>
+            </w:pPr>
+            <w:r>
+              <w:rPr>
+                <w:i/>
+                <w:color w:val="666666"/>
+              </w:rPr>
+              <w:t>прилагается отдельно</w:t>
+            </w:r>
+          </w:p>
+        </w:tc>
+      </w:tr>
+    </w:tbl>
+    <w:p>
+      <w:pPr>
+        <w:spacing w:before="400"/>
         <w:jc w:val="right"/>
       </w:pPr>
       <w:r>
         <w:rPr>
-          <w:rFonts w:ascii="Times New Roman" w:hAnsi="Times New Roman"/>
           <w:i/>
-          <w:color w:val="666666"/>
-          <w:sz w:val="20"/>
+          <w:color w:val="777777"/>
+          <w:sz w:val="18"/>
         </w:rPr>
         <w:t>Документ сформирован автоматически сервисом GeoSaaS API</w:t>
         <w:br/>
       </w:r>
       <w:r>
         <w:rPr>
-          <w:rFonts w:ascii="Times New Roman" w:hAnsi="Times New Roman"/>
           <w:i/>
-          <w:color w:val="666666"/>
-          <w:sz w:val="20"/>
+          <w:color w:val="777777"/>
+          <w:sz w:val="18"/>
         </w:rPr>
         <w:t>Дата формирования: {{ generated_date }}</w:t>
       </w:r>
@@ -2058,7 +3246,7 @@
         <w:color w:val="777777"/>
         <w:sz w:val="18"/>
       </w:rPr>
-      <w:t>GeoSaaS API • Паспорт месторождения: {{ deposit_name }}</w:t>
+      <w:t>Паспорт «Н» • Объект: {{ deposit_name }}</w:t>
     </w:r>
   </w:p>
 </w:hdr>
@@ -2501,7 +3689,7 @@
       <w:b/>
       <w:bCs/>
       <w:color w:val="1B365D"/>
-      <w:sz w:val="28"/>
+      <w:sz w:val="26"/>
       <w:szCs w:val="28"/>
     </w:rPr>
   </w:style>
@@ -2782,7 +3970,7 @@
       <w:pBdr>
         <w:bottom w:val="single" w:sz="8" w:space="4" w:color="4F81BD" w:themeColor="accent1"/>
       </w:pBdr>
-      <w:spacing w:after="160" w:line="240" w:lineRule="auto" w:before="560"/>
+      <w:spacing w:after="80" w:line="240" w:lineRule="auto" w:before="200"/>
       <w:contextualSpacing/>
       <w:jc w:val="center"/>
     </w:pPr>

</xml_diff>